<commit_message>
updates to color coding full pattern, turning off decrement
</commit_message>
<xml_diff>
--- a/TFM Writing/RICSE_Thesis_cover_page.docx
+++ b/TFM Writing/RICSE_Thesis_cover_page.docx
@@ -15,6 +15,7 @@
       <w:r>
         <w:rPr>
           <w:noProof/>
+          <w:lang w:val="en-US"/>
         </w:rPr>
         <w:drawing>
           <wp:inline distT="0" distB="0" distL="0" distR="0" wp14:anchorId="2174E064" wp14:editId="586561D7">
@@ -98,7 +99,7 @@
           <w:lang w:val="en-US"/>
         </w:rPr>
         <w:drawing>
-          <wp:inline distT="0" distB="0" distL="0" distR="0" wp14:anchorId="34FDF969" wp14:editId="6B474930">
+          <wp:inline distT="0" distB="0" distL="0" distR="0" wp14:anchorId="34FDF969" wp14:editId="09EA4667">
             <wp:extent cx="1784350" cy="431588"/>
             <wp:effectExtent l="0" t="0" r="6350" b="6985"/>
             <wp:docPr id="737212044" name="Imatge 4"/>
@@ -350,13 +351,10 @@
           <w:szCs w:val="32"/>
           <w:lang w:val="en-US"/>
         </w:rPr>
-        <w:t>Dr. Ivan Erill Sagales</w:t>
-      </w:r>
-    </w:p>
-    <w:p>
-      <w:pPr>
-        <w:spacing w:after="0" w:line="240" w:lineRule="auto"/>
-        <w:jc w:val="center"/>
+        <w:t xml:space="preserve">Dr. Ivan </w:t>
+      </w:r>
+      <w:proofErr w:type="spellStart"/>
+      <w:r>
         <w:rPr>
           <w:rFonts w:cstheme="minorHAnsi"/>
           <w:b/>
@@ -365,7 +363,9 @@
           <w:szCs w:val="32"/>
           <w:lang w:val="en-US"/>
         </w:rPr>
-      </w:pPr>
+        <w:t>Erill</w:t>
+      </w:r>
+      <w:proofErr w:type="spellEnd"/>
       <w:r>
         <w:rPr>
           <w:rFonts w:cstheme="minorHAnsi"/>
@@ -375,12 +375,10 @@
           <w:szCs w:val="32"/>
           <w:lang w:val="en-US"/>
         </w:rPr>
-        <w:t>Department of Information and Communications Engineering</w:t>
-      </w:r>
-    </w:p>
-    <w:p>
-      <w:pPr>
-        <w:jc w:val="center"/>
+        <w:t xml:space="preserve"> </w:t>
+      </w:r>
+      <w:proofErr w:type="spellStart"/>
+      <w:r>
         <w:rPr>
           <w:rFonts w:cstheme="minorHAnsi"/>
           <w:b/>
@@ -389,10 +387,13 @@
           <w:szCs w:val="32"/>
           <w:lang w:val="en-US"/>
         </w:rPr>
-      </w:pPr>
-    </w:p>
-    <w:p>
-      <w:pPr>
+        <w:t>Sagales</w:t>
+      </w:r>
+      <w:proofErr w:type="spellEnd"/>
+    </w:p>
+    <w:p>
+      <w:pPr>
+        <w:spacing w:after="0" w:line="240" w:lineRule="auto"/>
         <w:jc w:val="center"/>
         <w:rPr>
           <w:rFonts w:cstheme="minorHAnsi"/>
@@ -403,6 +404,43 @@
           <w:lang w:val="en-US"/>
         </w:rPr>
       </w:pPr>
+      <w:r>
+        <w:rPr>
+          <w:rFonts w:cstheme="minorHAnsi"/>
+          <w:b/>
+          <w:bCs/>
+          <w:sz w:val="32"/>
+          <w:szCs w:val="32"/>
+          <w:lang w:val="en-US"/>
+        </w:rPr>
+        <w:t>Department of Information and Communications Engineering</w:t>
+      </w:r>
+    </w:p>
+    <w:p>
+      <w:pPr>
+        <w:jc w:val="center"/>
+        <w:rPr>
+          <w:rFonts w:cstheme="minorHAnsi"/>
+          <w:b/>
+          <w:bCs/>
+          <w:sz w:val="32"/>
+          <w:szCs w:val="32"/>
+          <w:lang w:val="en-US"/>
+        </w:rPr>
+      </w:pPr>
+    </w:p>
+    <w:p>
+      <w:pPr>
+        <w:jc w:val="center"/>
+        <w:rPr>
+          <w:rFonts w:cstheme="minorHAnsi"/>
+          <w:b/>
+          <w:bCs/>
+          <w:sz w:val="32"/>
+          <w:szCs w:val="32"/>
+          <w:lang w:val="en-US"/>
+        </w:rPr>
+      </w:pPr>
     </w:p>
     <w:p>
       <w:pPr>
@@ -424,193 +462,3395 @@
           <w:rFonts w:cstheme="minorHAnsi"/>
           <w:sz w:val="28"/>
           <w:szCs w:val="28"/>
-        </w:rPr>
-      </w:pPr>
+          <w:lang w:val="en-US"/>
+        </w:rPr>
+      </w:pPr>
+      <w:proofErr w:type="spellStart"/>
       <w:r>
         <w:rPr>
           <w:rFonts w:cstheme="minorHAnsi"/>
           <w:sz w:val="28"/>
           <w:szCs w:val="28"/>
-        </w:rPr>
-        <w:t>Cerdanyola del Vall</w:t>
-      </w:r>
+          <w:lang w:val="en-US"/>
+        </w:rPr>
+        <w:t>Cerdanyola</w:t>
+      </w:r>
+      <w:proofErr w:type="spellEnd"/>
       <w:r>
         <w:rPr>
           <w:rFonts w:cstheme="minorHAnsi"/>
           <w:sz w:val="28"/>
           <w:szCs w:val="28"/>
-        </w:rPr>
-        <w:t>è</w:t>
-      </w:r>
+          <w:lang w:val="en-US"/>
+        </w:rPr>
+        <w:t xml:space="preserve"> del </w:t>
+      </w:r>
+      <w:proofErr w:type="spellStart"/>
       <w:r>
         <w:rPr>
           <w:rFonts w:cstheme="minorHAnsi"/>
           <w:sz w:val="28"/>
           <w:szCs w:val="28"/>
-        </w:rPr>
-        <w:t xml:space="preserve">s, </w:t>
+          <w:lang w:val="en-US"/>
+        </w:rPr>
+        <w:t>Vall</w:t>
       </w:r>
       <w:r>
         <w:rPr>
           <w:rFonts w:cstheme="minorHAnsi"/>
           <w:sz w:val="28"/>
           <w:szCs w:val="28"/>
-        </w:rPr>
-        <w:t>03 July 2026</w:t>
-      </w:r>
-    </w:p>
-    <w:p>
-      <w:pPr>
+          <w:lang w:val="en-US"/>
+        </w:rPr>
+        <w:t>è</w:t>
+      </w:r>
+      <w:r>
         <w:rPr>
           <w:rFonts w:cstheme="minorHAnsi"/>
           <w:sz w:val="28"/>
           <w:szCs w:val="28"/>
-        </w:rPr>
-      </w:pPr>
+          <w:lang w:val="en-US"/>
+        </w:rPr>
+        <w:t>s</w:t>
+      </w:r>
+      <w:proofErr w:type="spellEnd"/>
       <w:r>
         <w:rPr>
           <w:rFonts w:cstheme="minorHAnsi"/>
           <w:sz w:val="28"/>
           <w:szCs w:val="28"/>
-        </w:rPr>
-        <w:br w:type="page"/>
-      </w:r>
-      <w:r>
-        <w:rPr>
-          <w:i/>
-          <w:iCs/>
-        </w:rPr>
-        <w:lastRenderedPageBreak/>
-        <w:t>Supervisor (and Tutor) signatures</w:t>
-      </w:r>
-    </w:p>
-    <w:p>
-      <w:pPr>
-        <w:pStyle w:val="p1"/>
-      </w:pPr>
-      <w:r>
-        <w:rPr>
-          <w:i/>
-          <w:iCs/>
-        </w:rPr>
-        <w:t>Acknowledgements</w:t>
-      </w:r>
-    </w:p>
-    <w:p>
-      <w:pPr>
-        <w:pStyle w:val="p1"/>
-      </w:pPr>
-      <w:r>
-        <w:rPr>
-          <w:i/>
-          <w:iCs/>
-        </w:rPr>
-        <w:t>Table of contents</w:t>
-      </w:r>
-    </w:p>
-    <w:p>
-      <w:pPr>
-        <w:pStyle w:val="p1"/>
-      </w:pPr>
-      <w:r>
-        <w:rPr>
-          <w:i/>
-          <w:iCs/>
-        </w:rPr>
-        <w:t>List of figures / List of tables</w:t>
-      </w:r>
-    </w:p>
-    <w:p>
-      <w:pPr>
-        <w:pStyle w:val="p1"/>
-      </w:pPr>
-      <w:r>
-        <w:rPr>
-          <w:i/>
-          <w:iCs/>
-        </w:rPr>
-        <w:t>Abstract</w:t>
-      </w:r>
-    </w:p>
-    <w:p>
-      <w:pPr>
-        <w:pStyle w:val="p1"/>
-      </w:pPr>
-      <w:r>
-        <w:rPr>
-          <w:i/>
-          <w:iCs/>
-        </w:rPr>
-        <w:t>Introduction and State of the Art</w:t>
-      </w:r>
-    </w:p>
-    <w:p>
-      <w:pPr>
-        <w:pStyle w:val="p1"/>
-      </w:pPr>
-      <w:r>
-        <w:rPr>
-          <w:i/>
-          <w:iCs/>
-        </w:rPr>
-        <w:t>Objectives</w:t>
-      </w:r>
-    </w:p>
-    <w:p>
-      <w:pPr>
-        <w:pStyle w:val="p1"/>
-      </w:pPr>
-      <w:r>
-        <w:rPr>
-          <w:i/>
-          <w:iCs/>
-        </w:rPr>
-        <w:t>Methodology and Development</w:t>
-      </w:r>
-    </w:p>
-    <w:p>
-      <w:pPr>
-        <w:pStyle w:val="p1"/>
-      </w:pPr>
-      <w:r>
-        <w:rPr>
-          <w:i/>
-          <w:iCs/>
-        </w:rPr>
-        <w:t>Results and Discussion</w:t>
-      </w:r>
-    </w:p>
-    <w:p>
-      <w:pPr>
-        <w:pStyle w:val="p1"/>
-      </w:pPr>
-      <w:r>
-        <w:rPr>
-          <w:i/>
-          <w:iCs/>
-        </w:rPr>
-        <w:t>Conclusions</w:t>
-      </w:r>
-    </w:p>
-    <w:p>
-      <w:pPr>
-        <w:pStyle w:val="p1"/>
-      </w:pPr>
-      <w:r>
-        <w:rPr>
-          <w:i/>
-          <w:iCs/>
-        </w:rPr>
-        <w:t>Bibliography</w:t>
-      </w:r>
-    </w:p>
-    <w:p>
-      <w:pPr>
-        <w:jc w:val="center"/>
+          <w:lang w:val="en-US"/>
+        </w:rPr>
+        <w:t xml:space="preserve">, </w:t>
+      </w:r>
+      <w:r>
         <w:rPr>
           <w:rFonts w:cstheme="minorHAnsi"/>
           <w:sz w:val="28"/>
           <w:szCs w:val="28"/>
+          <w:lang w:val="en-US"/>
+        </w:rPr>
+        <w:t>03 July 2026</w:t>
+      </w:r>
+    </w:p>
+    <w:p>
+      <w:pPr>
+        <w:rPr>
+          <w:rFonts w:cstheme="minorHAnsi"/>
+          <w:sz w:val="28"/>
+          <w:szCs w:val="28"/>
+          <w:lang w:val="en-US"/>
+        </w:rPr>
+      </w:pPr>
+      <w:r>
+        <w:rPr>
+          <w:rFonts w:cstheme="minorHAnsi"/>
+          <w:sz w:val="28"/>
+          <w:szCs w:val="28"/>
+          <w:lang w:val="en-US"/>
+        </w:rPr>
+        <w:br w:type="page"/>
+      </w:r>
+      <w:r>
+        <w:rPr>
+          <w:i/>
+          <w:iCs/>
+          <w:lang w:val="en-US"/>
+        </w:rPr>
+        <w:lastRenderedPageBreak/>
+        <w:t>Supervisor (and Tutor) signatures</w:t>
+      </w:r>
+    </w:p>
+    <w:p>
+      <w:pPr>
+        <w:rPr>
+          <w:rFonts w:ascii="Times New Roman" w:eastAsia="Times New Roman" w:hAnsi="Times New Roman" w:cs="Times New Roman"/>
+          <w:i/>
+          <w:iCs/>
+          <w:color w:val="2A2C2E"/>
+          <w:sz w:val="18"/>
+          <w:szCs w:val="18"/>
+          <w:lang w:val="en-US" w:eastAsia="ko-KR"/>
+        </w:rPr>
+      </w:pPr>
+      <w:r>
+        <w:rPr>
+          <w:i/>
+          <w:iCs/>
+        </w:rPr>
+        <w:br w:type="page"/>
+      </w:r>
+    </w:p>
+    <w:p>
+      <w:pPr>
+        <w:pStyle w:val="p1"/>
+        <w:rPr>
+          <w:i/>
+          <w:iCs/>
+          <w:sz w:val="24"/>
+          <w:szCs w:val="24"/>
+        </w:rPr>
+      </w:pPr>
+      <w:r>
+        <w:rPr>
+          <w:i/>
+          <w:iCs/>
+          <w:sz w:val="24"/>
+          <w:szCs w:val="24"/>
+        </w:rPr>
+        <w:lastRenderedPageBreak/>
+        <w:t>Acknowledgements</w:t>
+      </w:r>
+    </w:p>
+    <w:p>
+      <w:pPr>
+        <w:pStyle w:val="p1"/>
+        <w:rPr>
+          <w:i/>
+          <w:iCs/>
+          <w:sz w:val="24"/>
+          <w:szCs w:val="24"/>
+        </w:rPr>
+      </w:pPr>
+    </w:p>
+    <w:p>
+      <w:pPr>
+        <w:pStyle w:val="p1"/>
+        <w:rPr>
+          <w:i/>
+          <w:iCs/>
+          <w:sz w:val="24"/>
+          <w:szCs w:val="24"/>
+        </w:rPr>
+      </w:pPr>
+    </w:p>
+    <w:p>
+      <w:pPr>
+        <w:pStyle w:val="p1"/>
+        <w:ind w:firstLine="708"/>
+        <w:rPr>
+          <w:sz w:val="24"/>
+          <w:szCs w:val="24"/>
+        </w:rPr>
+      </w:pPr>
+      <w:r>
+        <w:rPr>
+          <w:sz w:val="24"/>
+          <w:szCs w:val="24"/>
+        </w:rPr>
+        <w:t xml:space="preserve">I would </w:t>
+      </w:r>
+      <w:r>
+        <w:rPr>
+          <w:sz w:val="24"/>
+          <w:szCs w:val="24"/>
+        </w:rPr>
+        <w:t xml:space="preserve">first </w:t>
+      </w:r>
+      <w:r>
+        <w:rPr>
+          <w:sz w:val="24"/>
+          <w:szCs w:val="24"/>
+        </w:rPr>
+        <w:t xml:space="preserve">like to </w:t>
+      </w:r>
+      <w:r>
+        <w:rPr>
+          <w:sz w:val="24"/>
+          <w:szCs w:val="24"/>
+        </w:rPr>
+        <w:t>thank</w:t>
+      </w:r>
+      <w:r>
+        <w:rPr>
+          <w:sz w:val="24"/>
+          <w:szCs w:val="24"/>
+        </w:rPr>
+        <w:t xml:space="preserve"> my advisor </w:t>
+      </w:r>
+      <w:r>
+        <w:rPr>
+          <w:sz w:val="24"/>
+          <w:szCs w:val="24"/>
+        </w:rPr>
+        <w:t xml:space="preserve">Dr. </w:t>
+      </w:r>
+      <w:r>
+        <w:rPr>
+          <w:sz w:val="24"/>
+          <w:szCs w:val="24"/>
+        </w:rPr>
+        <w:t xml:space="preserve">Ivan </w:t>
+      </w:r>
+      <w:proofErr w:type="spellStart"/>
+      <w:r>
+        <w:rPr>
+          <w:sz w:val="24"/>
+          <w:szCs w:val="24"/>
+        </w:rPr>
+        <w:t>Erill</w:t>
+      </w:r>
+      <w:proofErr w:type="spellEnd"/>
+      <w:r>
+        <w:rPr>
+          <w:sz w:val="24"/>
+          <w:szCs w:val="24"/>
+        </w:rPr>
+        <w:t xml:space="preserve"> Sagales</w:t>
+      </w:r>
+      <w:r>
+        <w:rPr>
+          <w:sz w:val="24"/>
+          <w:szCs w:val="24"/>
+        </w:rPr>
+        <w:t xml:space="preserve">, who provided me with the mentorship and stewardship over the past several months to get up to speed in the biology and computing </w:t>
+      </w:r>
+      <w:r>
+        <w:rPr>
+          <w:sz w:val="24"/>
+          <w:szCs w:val="24"/>
+        </w:rPr>
+        <w:t xml:space="preserve">domain </w:t>
+      </w:r>
+      <w:r>
+        <w:rPr>
+          <w:sz w:val="24"/>
+          <w:szCs w:val="24"/>
+        </w:rPr>
+        <w:t xml:space="preserve">knowledge to execute this thesis. </w:t>
+      </w:r>
+      <w:r>
+        <w:rPr>
+          <w:sz w:val="24"/>
+          <w:szCs w:val="24"/>
+        </w:rPr>
+        <w:t xml:space="preserve">As I have </w:t>
+      </w:r>
+      <w:r>
+        <w:rPr>
+          <w:sz w:val="24"/>
+          <w:szCs w:val="24"/>
+        </w:rPr>
+        <w:t xml:space="preserve">a history and statistics background, Dr. </w:t>
+      </w:r>
+      <w:proofErr w:type="spellStart"/>
+      <w:r>
+        <w:rPr>
+          <w:sz w:val="24"/>
+          <w:szCs w:val="24"/>
+        </w:rPr>
+        <w:t>Erill</w:t>
+      </w:r>
+      <w:proofErr w:type="spellEnd"/>
+      <w:r>
+        <w:rPr>
+          <w:sz w:val="24"/>
+          <w:szCs w:val="24"/>
+        </w:rPr>
+        <w:t xml:space="preserve"> tailored the project to </w:t>
+      </w:r>
+      <w:r>
+        <w:rPr>
+          <w:sz w:val="24"/>
+          <w:szCs w:val="24"/>
+        </w:rPr>
+        <w:t xml:space="preserve">my skill set and to </w:t>
+      </w:r>
+      <w:r>
+        <w:rPr>
+          <w:sz w:val="24"/>
+          <w:szCs w:val="24"/>
+        </w:rPr>
+        <w:t xml:space="preserve">align with my overarching intention </w:t>
+      </w:r>
+      <w:r>
+        <w:rPr>
+          <w:sz w:val="24"/>
+          <w:szCs w:val="24"/>
+        </w:rPr>
+        <w:t xml:space="preserve">behind </w:t>
+      </w:r>
+      <w:r>
+        <w:rPr>
+          <w:sz w:val="24"/>
+          <w:szCs w:val="24"/>
+        </w:rPr>
+        <w:t>participating in this master’s degree, which was to</w:t>
+      </w:r>
+      <w:r>
+        <w:rPr>
+          <w:sz w:val="24"/>
+          <w:szCs w:val="24"/>
+        </w:rPr>
+        <w:t xml:space="preserve"> increase my practical skills and capabilities</w:t>
+      </w:r>
+      <w:r>
+        <w:rPr>
+          <w:sz w:val="24"/>
+          <w:szCs w:val="24"/>
+        </w:rPr>
+        <w:t xml:space="preserve">. Moreover, Dr. </w:t>
+      </w:r>
+      <w:proofErr w:type="spellStart"/>
+      <w:r>
+        <w:rPr>
+          <w:sz w:val="24"/>
+          <w:szCs w:val="24"/>
+        </w:rPr>
+        <w:t>Erill</w:t>
+      </w:r>
+      <w:proofErr w:type="spellEnd"/>
+      <w:r>
+        <w:rPr>
+          <w:sz w:val="24"/>
+          <w:szCs w:val="24"/>
+        </w:rPr>
+        <w:t xml:space="preserve"> worked tirelessly to support me in </w:t>
+      </w:r>
+      <w:r>
+        <w:rPr>
+          <w:sz w:val="24"/>
+          <w:szCs w:val="24"/>
+        </w:rPr>
+        <w:t>my</w:t>
+      </w:r>
+      <w:r>
+        <w:rPr>
+          <w:sz w:val="24"/>
+          <w:szCs w:val="24"/>
+        </w:rPr>
+        <w:t xml:space="preserve"> bureaucratic </w:t>
+      </w:r>
+      <w:r>
+        <w:rPr>
+          <w:sz w:val="24"/>
+          <w:szCs w:val="24"/>
+        </w:rPr>
+        <w:t xml:space="preserve">battle to secure </w:t>
+      </w:r>
+      <w:r>
+        <w:rPr>
+          <w:sz w:val="24"/>
+          <w:szCs w:val="24"/>
+        </w:rPr>
+        <w:t xml:space="preserve">scholarship funding for my studies here at the </w:t>
+      </w:r>
+      <w:proofErr w:type="spellStart"/>
+      <w:r>
+        <w:rPr>
+          <w:sz w:val="24"/>
+          <w:szCs w:val="24"/>
+        </w:rPr>
+        <w:t>Universitat</w:t>
+      </w:r>
+      <w:proofErr w:type="spellEnd"/>
+      <w:r>
+        <w:rPr>
+          <w:sz w:val="24"/>
+          <w:szCs w:val="24"/>
+        </w:rPr>
+        <w:t xml:space="preserve"> </w:t>
+      </w:r>
+      <w:proofErr w:type="spellStart"/>
+      <w:r>
+        <w:rPr>
+          <w:sz w:val="24"/>
+          <w:szCs w:val="24"/>
+        </w:rPr>
+        <w:t>Autònoma</w:t>
+      </w:r>
+      <w:proofErr w:type="spellEnd"/>
+      <w:r>
+        <w:rPr>
+          <w:sz w:val="24"/>
+          <w:szCs w:val="24"/>
+        </w:rPr>
+        <w:t xml:space="preserve"> de Barcelona, without which my time here would have been substantially more stressful and challenging. I am grateful to have had the opportunity to work with him</w:t>
+      </w:r>
+      <w:r>
+        <w:rPr>
+          <w:sz w:val="24"/>
+          <w:szCs w:val="24"/>
+        </w:rPr>
+        <w:t>.</w:t>
+      </w:r>
+    </w:p>
+    <w:p>
+      <w:pPr>
+        <w:pStyle w:val="p1"/>
+        <w:tabs>
+          <w:tab w:val="left" w:pos="4779"/>
+        </w:tabs>
+        <w:ind w:firstLine="708"/>
+        <w:rPr>
+          <w:sz w:val="24"/>
+          <w:szCs w:val="24"/>
+        </w:rPr>
+      </w:pPr>
+      <w:r>
+        <w:rPr>
+          <w:sz w:val="24"/>
+          <w:szCs w:val="24"/>
+        </w:rPr>
+        <w:t xml:space="preserve">Moreover, I want to thank all the professors and academic administrators of the </w:t>
+      </w:r>
+      <w:r>
+        <w:rPr>
+          <w:sz w:val="24"/>
+          <w:szCs w:val="24"/>
+        </w:rPr>
+        <w:t xml:space="preserve">UAB’s </w:t>
+      </w:r>
+      <w:r>
+        <w:rPr>
+          <w:sz w:val="24"/>
+          <w:szCs w:val="24"/>
+        </w:rPr>
+        <w:t xml:space="preserve">Research and Innovation in Computer based Science and Engineering degree for their pedagogy and support in ensuring that I could successfully complete this </w:t>
+      </w:r>
+      <w:r>
+        <w:rPr>
+          <w:sz w:val="24"/>
+          <w:szCs w:val="24"/>
+        </w:rPr>
+        <w:t>course</w:t>
+      </w:r>
+      <w:r>
+        <w:rPr>
+          <w:sz w:val="24"/>
+          <w:szCs w:val="24"/>
+        </w:rPr>
+        <w:t xml:space="preserve">. </w:t>
+      </w:r>
+      <w:r>
+        <w:rPr>
+          <w:sz w:val="24"/>
+          <w:szCs w:val="24"/>
+        </w:rPr>
+        <w:t xml:space="preserve">I made the decision to </w:t>
+      </w:r>
+      <w:r>
+        <w:rPr>
+          <w:sz w:val="24"/>
+          <w:szCs w:val="24"/>
+        </w:rPr>
+        <w:t xml:space="preserve">come </w:t>
+      </w:r>
+      <w:r>
+        <w:rPr>
+          <w:sz w:val="24"/>
+          <w:szCs w:val="24"/>
+        </w:rPr>
+        <w:t xml:space="preserve">to Barcelona for my studies </w:t>
+      </w:r>
+      <w:r>
+        <w:rPr>
+          <w:sz w:val="24"/>
+          <w:szCs w:val="24"/>
+        </w:rPr>
+        <w:t xml:space="preserve">in </w:t>
+      </w:r>
+      <w:r>
+        <w:rPr>
+          <w:sz w:val="24"/>
+          <w:szCs w:val="24"/>
+        </w:rPr>
+        <w:t xml:space="preserve">a place and time (Los Angeles, 2025) where </w:t>
+      </w:r>
+      <w:r>
+        <w:rPr>
+          <w:sz w:val="24"/>
+          <w:szCs w:val="24"/>
+        </w:rPr>
+        <w:t xml:space="preserve">the future was looking increasingly dim: </w:t>
+      </w:r>
+      <w:r>
+        <w:rPr>
+          <w:sz w:val="24"/>
+          <w:szCs w:val="24"/>
+        </w:rPr>
+        <w:t xml:space="preserve">unprecedented </w:t>
+      </w:r>
+      <w:r>
+        <w:rPr>
+          <w:sz w:val="24"/>
+          <w:szCs w:val="24"/>
+        </w:rPr>
+        <w:t xml:space="preserve">wildfires destroyed </w:t>
+      </w:r>
+      <w:r>
+        <w:rPr>
+          <w:sz w:val="24"/>
+          <w:szCs w:val="24"/>
+        </w:rPr>
+        <w:t xml:space="preserve">entire swathes of </w:t>
+      </w:r>
+      <w:r>
+        <w:rPr>
+          <w:sz w:val="24"/>
+          <w:szCs w:val="24"/>
+        </w:rPr>
+        <w:t>communities</w:t>
+      </w:r>
+      <w:r>
+        <w:rPr>
+          <w:sz w:val="24"/>
+          <w:szCs w:val="24"/>
+        </w:rPr>
+        <w:t>, and I lived right in the middle of it</w:t>
+      </w:r>
+      <w:r>
+        <w:rPr>
+          <w:sz w:val="24"/>
+          <w:szCs w:val="24"/>
+        </w:rPr>
+        <w:t xml:space="preserve">, anxiously </w:t>
+      </w:r>
+      <w:r>
+        <w:rPr>
+          <w:sz w:val="24"/>
+          <w:szCs w:val="24"/>
+        </w:rPr>
+        <w:t xml:space="preserve">checking </w:t>
+      </w:r>
+      <w:r>
+        <w:rPr>
+          <w:sz w:val="24"/>
+          <w:szCs w:val="24"/>
+        </w:rPr>
+        <w:t xml:space="preserve">the fire boundary </w:t>
+      </w:r>
+      <w:r>
+        <w:rPr>
+          <w:sz w:val="24"/>
+          <w:szCs w:val="24"/>
+        </w:rPr>
+        <w:t xml:space="preserve">every night as it </w:t>
+      </w:r>
+      <w:r>
+        <w:rPr>
+          <w:sz w:val="24"/>
+          <w:szCs w:val="24"/>
+        </w:rPr>
+        <w:t>spread</w:t>
+      </w:r>
+      <w:r>
+        <w:rPr>
+          <w:sz w:val="24"/>
+          <w:szCs w:val="24"/>
+        </w:rPr>
+        <w:t xml:space="preserve"> closer</w:t>
+      </w:r>
+      <w:r>
+        <w:rPr>
+          <w:sz w:val="24"/>
+          <w:szCs w:val="24"/>
+        </w:rPr>
+        <w:t xml:space="preserve">; immigration police were </w:t>
+      </w:r>
+      <w:r>
+        <w:rPr>
+          <w:sz w:val="24"/>
+          <w:szCs w:val="24"/>
+        </w:rPr>
+        <w:t xml:space="preserve">arresting </w:t>
+      </w:r>
+      <w:r>
+        <w:rPr>
+          <w:sz w:val="24"/>
+          <w:szCs w:val="24"/>
+        </w:rPr>
+        <w:t>neighbor</w:t>
+      </w:r>
+      <w:r>
+        <w:rPr>
+          <w:sz w:val="24"/>
+          <w:szCs w:val="24"/>
+        </w:rPr>
+        <w:t xml:space="preserve">s and </w:t>
+      </w:r>
+      <w:r>
+        <w:rPr>
+          <w:sz w:val="24"/>
+          <w:szCs w:val="24"/>
+        </w:rPr>
+        <w:t xml:space="preserve">causing distress </w:t>
+      </w:r>
+      <w:r>
+        <w:rPr>
+          <w:sz w:val="24"/>
+          <w:szCs w:val="24"/>
+        </w:rPr>
+        <w:t>among friends and family</w:t>
+      </w:r>
+      <w:r>
+        <w:rPr>
+          <w:sz w:val="24"/>
+          <w:szCs w:val="24"/>
+        </w:rPr>
+        <w:t xml:space="preserve"> – something that “couldn’t happen here” was in fact happening daily and on my </w:t>
+      </w:r>
+      <w:r>
+        <w:rPr>
+          <w:sz w:val="24"/>
+          <w:szCs w:val="24"/>
+        </w:rPr>
+        <w:t>block</w:t>
+      </w:r>
+      <w:r>
+        <w:rPr>
+          <w:sz w:val="24"/>
+          <w:szCs w:val="24"/>
+        </w:rPr>
+        <w:t xml:space="preserve">; </w:t>
+      </w:r>
+      <w:r>
+        <w:rPr>
+          <w:sz w:val="24"/>
+          <w:szCs w:val="24"/>
+        </w:rPr>
+        <w:t xml:space="preserve">and </w:t>
+      </w:r>
+      <w:r>
+        <w:rPr>
+          <w:sz w:val="24"/>
+          <w:szCs w:val="24"/>
+        </w:rPr>
+        <w:t>massive protests spilled onto the highways and freeways.</w:t>
+      </w:r>
+      <w:r>
+        <w:rPr>
+          <w:sz w:val="24"/>
+          <w:szCs w:val="24"/>
+        </w:rPr>
+        <w:t xml:space="preserve"> </w:t>
+      </w:r>
+      <w:proofErr w:type="gramStart"/>
+      <w:r>
+        <w:rPr>
+          <w:sz w:val="24"/>
+          <w:szCs w:val="24"/>
+        </w:rPr>
+        <w:t>In the midst of</w:t>
+      </w:r>
+      <w:proofErr w:type="gramEnd"/>
+      <w:r>
+        <w:rPr>
+          <w:sz w:val="24"/>
+          <w:szCs w:val="24"/>
+        </w:rPr>
+        <w:t xml:space="preserve"> it all, I still had to go to work every day</w:t>
+      </w:r>
+      <w:r>
+        <w:rPr>
+          <w:sz w:val="24"/>
+          <w:szCs w:val="24"/>
+        </w:rPr>
+        <w:t xml:space="preserve"> </w:t>
+      </w:r>
+      <w:r>
+        <w:rPr>
+          <w:sz w:val="24"/>
+          <w:szCs w:val="24"/>
+        </w:rPr>
+        <w:t xml:space="preserve">at </w:t>
+      </w:r>
+      <w:r>
+        <w:rPr>
+          <w:sz w:val="24"/>
+          <w:szCs w:val="24"/>
+        </w:rPr>
+        <w:t xml:space="preserve">the most prolific </w:t>
+      </w:r>
+      <w:r>
+        <w:rPr>
+          <w:sz w:val="24"/>
+          <w:szCs w:val="24"/>
+        </w:rPr>
+        <w:t xml:space="preserve">and demanding </w:t>
+      </w:r>
+      <w:r>
+        <w:rPr>
+          <w:sz w:val="24"/>
+          <w:szCs w:val="24"/>
+        </w:rPr>
+        <w:t>aerospace operation</w:t>
+      </w:r>
+      <w:r>
+        <w:rPr>
+          <w:sz w:val="24"/>
+          <w:szCs w:val="24"/>
+        </w:rPr>
+        <w:t xml:space="preserve"> </w:t>
+      </w:r>
+      <w:r>
+        <w:rPr>
+          <w:sz w:val="24"/>
+          <w:szCs w:val="24"/>
+        </w:rPr>
+        <w:t>in the world</w:t>
+      </w:r>
+      <w:r>
+        <w:rPr>
+          <w:sz w:val="24"/>
+          <w:szCs w:val="24"/>
+        </w:rPr>
+        <w:t xml:space="preserve">, </w:t>
+      </w:r>
+      <w:r>
+        <w:rPr>
+          <w:sz w:val="24"/>
+          <w:szCs w:val="24"/>
+        </w:rPr>
+        <w:t xml:space="preserve">managing special private and government payload programs in an environment that </w:t>
+      </w:r>
+      <w:r>
+        <w:rPr>
+          <w:sz w:val="24"/>
+          <w:szCs w:val="24"/>
+        </w:rPr>
+        <w:t xml:space="preserve">required </w:t>
+      </w:r>
+      <w:r>
+        <w:rPr>
+          <w:sz w:val="24"/>
+          <w:szCs w:val="24"/>
+        </w:rPr>
+        <w:t xml:space="preserve">cutthroat </w:t>
+      </w:r>
+      <w:r>
+        <w:rPr>
+          <w:sz w:val="24"/>
+          <w:szCs w:val="24"/>
+        </w:rPr>
+        <w:t>dedication and precision</w:t>
+      </w:r>
+      <w:r>
+        <w:rPr>
+          <w:sz w:val="24"/>
+          <w:szCs w:val="24"/>
+        </w:rPr>
+        <w:t xml:space="preserve"> </w:t>
+      </w:r>
+      <w:r>
+        <w:rPr>
+          <w:sz w:val="24"/>
+          <w:szCs w:val="24"/>
+        </w:rPr>
+        <w:t xml:space="preserve">in a political climate </w:t>
+      </w:r>
+      <w:r>
+        <w:rPr>
+          <w:sz w:val="24"/>
+          <w:szCs w:val="24"/>
+        </w:rPr>
+        <w:t xml:space="preserve">where I </w:t>
+      </w:r>
+      <w:r>
+        <w:rPr>
+          <w:sz w:val="24"/>
+          <w:szCs w:val="24"/>
+        </w:rPr>
+        <w:t xml:space="preserve">felt like none of it </w:t>
+      </w:r>
+      <w:r>
+        <w:rPr>
+          <w:sz w:val="24"/>
+          <w:szCs w:val="24"/>
+        </w:rPr>
+        <w:t>really mattered</w:t>
+      </w:r>
+      <w:r>
+        <w:rPr>
+          <w:sz w:val="24"/>
+          <w:szCs w:val="24"/>
+        </w:rPr>
+        <w:t xml:space="preserve">. </w:t>
+      </w:r>
+      <w:r>
+        <w:rPr>
+          <w:sz w:val="24"/>
+          <w:szCs w:val="24"/>
+        </w:rPr>
+        <w:t xml:space="preserve">Put simply, </w:t>
+      </w:r>
+      <w:r>
+        <w:rPr>
+          <w:sz w:val="24"/>
+          <w:szCs w:val="24"/>
+        </w:rPr>
+        <w:t>I was burning out</w:t>
+      </w:r>
+      <w:r>
+        <w:rPr>
+          <w:sz w:val="24"/>
+          <w:szCs w:val="24"/>
+        </w:rPr>
+        <w:t>, and c</w:t>
+      </w:r>
+      <w:r>
+        <w:rPr>
+          <w:sz w:val="24"/>
+          <w:szCs w:val="24"/>
+        </w:rPr>
+        <w:t xml:space="preserve">oming to Barcelona was a “hail Mary” to </w:t>
+      </w:r>
+      <w:r>
+        <w:rPr>
+          <w:sz w:val="24"/>
+          <w:szCs w:val="24"/>
+        </w:rPr>
+        <w:t>find a way out</w:t>
+      </w:r>
+      <w:r>
+        <w:rPr>
+          <w:sz w:val="24"/>
+          <w:szCs w:val="24"/>
+        </w:rPr>
+        <w:t>:</w:t>
+      </w:r>
+      <w:r>
+        <w:rPr>
+          <w:sz w:val="24"/>
+          <w:szCs w:val="24"/>
+        </w:rPr>
+        <w:t xml:space="preserve"> to hit pause on where I was going</w:t>
+      </w:r>
+      <w:r>
+        <w:rPr>
+          <w:sz w:val="24"/>
+          <w:szCs w:val="24"/>
+        </w:rPr>
+        <w:t xml:space="preserve">, </w:t>
+      </w:r>
+      <w:r>
+        <w:rPr>
+          <w:sz w:val="24"/>
+          <w:szCs w:val="24"/>
+        </w:rPr>
+        <w:t>try to recover</w:t>
+      </w:r>
+      <w:r>
+        <w:rPr>
+          <w:sz w:val="24"/>
+          <w:szCs w:val="24"/>
+        </w:rPr>
+        <w:t xml:space="preserve"> my health and purpose</w:t>
+      </w:r>
+      <w:r>
+        <w:rPr>
+          <w:sz w:val="24"/>
+          <w:szCs w:val="24"/>
+        </w:rPr>
+        <w:t xml:space="preserve">, and </w:t>
+      </w:r>
+      <w:r>
+        <w:rPr>
+          <w:sz w:val="24"/>
+          <w:szCs w:val="24"/>
+        </w:rPr>
+        <w:t xml:space="preserve">to </w:t>
+      </w:r>
+      <w:r>
+        <w:rPr>
+          <w:sz w:val="24"/>
+          <w:szCs w:val="24"/>
+        </w:rPr>
+        <w:t xml:space="preserve">become </w:t>
+      </w:r>
+      <w:r>
+        <w:rPr>
+          <w:sz w:val="24"/>
+          <w:szCs w:val="24"/>
+        </w:rPr>
+        <w:t xml:space="preserve">a more capable, better person. </w:t>
+      </w:r>
+    </w:p>
+    <w:p>
+      <w:pPr>
+        <w:pStyle w:val="p1"/>
+        <w:tabs>
+          <w:tab w:val="left" w:pos="4779"/>
+        </w:tabs>
+        <w:ind w:firstLine="708"/>
+        <w:rPr>
+          <w:sz w:val="24"/>
+          <w:szCs w:val="24"/>
+        </w:rPr>
+      </w:pPr>
+      <w:r>
+        <w:rPr>
+          <w:sz w:val="24"/>
+          <w:szCs w:val="24"/>
+        </w:rPr>
+        <w:t xml:space="preserve">Almost a year on, I am not sure how much closer I’ve come to that </w:t>
+      </w:r>
+      <w:r>
+        <w:rPr>
+          <w:sz w:val="24"/>
+          <w:szCs w:val="24"/>
+        </w:rPr>
+        <w:t>goal</w:t>
+      </w:r>
+      <w:r>
+        <w:rPr>
+          <w:sz w:val="24"/>
+          <w:szCs w:val="24"/>
+        </w:rPr>
+        <w:t xml:space="preserve">, but I </w:t>
+      </w:r>
+      <w:r>
+        <w:rPr>
+          <w:sz w:val="24"/>
+          <w:szCs w:val="24"/>
+        </w:rPr>
+        <w:t xml:space="preserve">think I have achieved it in some capacity. Spending these past nine months in Barcelona, meeting people from all over the world, and getting more immersed in </w:t>
+      </w:r>
+      <w:r>
+        <w:rPr>
+          <w:sz w:val="24"/>
+          <w:szCs w:val="24"/>
+        </w:rPr>
+        <w:t xml:space="preserve">Spanish and </w:t>
+      </w:r>
+      <w:r>
+        <w:rPr>
+          <w:sz w:val="24"/>
+          <w:szCs w:val="24"/>
+        </w:rPr>
+        <w:t>Catalonian culture has shown me that other ways of life are possible</w:t>
+      </w:r>
+      <w:r>
+        <w:rPr>
+          <w:sz w:val="24"/>
+          <w:szCs w:val="24"/>
+        </w:rPr>
+        <w:t xml:space="preserve">, though some problems are </w:t>
+      </w:r>
+      <w:r>
+        <w:rPr>
+          <w:sz w:val="24"/>
+          <w:szCs w:val="24"/>
+        </w:rPr>
+        <w:t xml:space="preserve">simply inherent </w:t>
+      </w:r>
+      <w:r>
+        <w:rPr>
+          <w:sz w:val="24"/>
+          <w:szCs w:val="24"/>
+        </w:rPr>
+        <w:t>to the 21</w:t>
+      </w:r>
+      <w:r>
+        <w:rPr>
+          <w:sz w:val="24"/>
+          <w:szCs w:val="24"/>
+          <w:vertAlign w:val="superscript"/>
+        </w:rPr>
+        <w:t>st</w:t>
+      </w:r>
+      <w:r>
+        <w:rPr>
+          <w:sz w:val="24"/>
+          <w:szCs w:val="24"/>
+        </w:rPr>
+        <w:t xml:space="preserve"> century human experience.</w:t>
+      </w:r>
+      <w:r>
+        <w:rPr>
+          <w:sz w:val="24"/>
+          <w:szCs w:val="24"/>
+        </w:rPr>
+        <w:t xml:space="preserve"> I want to acknowledge my newfound Catalan friend David Gómez for providing me a rich local experience</w:t>
+      </w:r>
+      <w:r>
+        <w:rPr>
+          <w:sz w:val="24"/>
+          <w:szCs w:val="24"/>
+        </w:rPr>
+        <w:t xml:space="preserve"> as well as my </w:t>
+      </w:r>
+      <w:r>
+        <w:rPr>
+          <w:sz w:val="24"/>
+          <w:szCs w:val="24"/>
+        </w:rPr>
+        <w:t xml:space="preserve">classmates </w:t>
+      </w:r>
+      <w:r>
+        <w:rPr>
+          <w:sz w:val="24"/>
+          <w:szCs w:val="24"/>
+        </w:rPr>
+        <w:t>for their friendship and support</w:t>
+      </w:r>
+      <w:r>
+        <w:rPr>
+          <w:sz w:val="24"/>
+          <w:szCs w:val="24"/>
+        </w:rPr>
+        <w:t>.</w:t>
+      </w:r>
+    </w:p>
+    <w:p>
+      <w:pPr>
+        <w:pStyle w:val="p1"/>
+        <w:rPr>
+          <w:sz w:val="24"/>
+          <w:szCs w:val="24"/>
+        </w:rPr>
+      </w:pPr>
+    </w:p>
+    <w:p>
+      <w:pPr>
+        <w:pStyle w:val="p1"/>
+        <w:rPr>
+          <w:sz w:val="24"/>
+          <w:szCs w:val="24"/>
+        </w:rPr>
+      </w:pPr>
+    </w:p>
+    <w:p>
+      <w:pPr>
+        <w:pStyle w:val="p1"/>
+        <w:rPr>
+          <w:i/>
+          <w:iCs/>
+          <w:sz w:val="24"/>
+          <w:szCs w:val="24"/>
+        </w:rPr>
+      </w:pPr>
+    </w:p>
+    <w:p>
+      <w:pPr>
+        <w:pStyle w:val="p1"/>
+        <w:rPr>
+          <w:sz w:val="24"/>
+          <w:szCs w:val="24"/>
+        </w:rPr>
+      </w:pPr>
+      <w:r>
+        <w:rPr>
+          <w:i/>
+          <w:iCs/>
+          <w:sz w:val="24"/>
+          <w:szCs w:val="24"/>
+        </w:rPr>
+        <w:t>Table of contents</w:t>
+      </w:r>
+    </w:p>
+    <w:p>
+      <w:pPr>
+        <w:pStyle w:val="p1"/>
+        <w:rPr>
+          <w:sz w:val="24"/>
+          <w:szCs w:val="24"/>
+        </w:rPr>
+      </w:pPr>
+      <w:r>
+        <w:rPr>
+          <w:i/>
+          <w:iCs/>
+          <w:sz w:val="24"/>
+          <w:szCs w:val="24"/>
+        </w:rPr>
+        <w:t>List of figures / List of tables</w:t>
+      </w:r>
+    </w:p>
+    <w:p>
+      <w:pPr>
+        <w:rPr>
+          <w:rFonts w:ascii="Times New Roman" w:eastAsia="Times New Roman" w:hAnsi="Times New Roman" w:cs="Times New Roman"/>
+          <w:i/>
+          <w:iCs/>
+          <w:color w:val="2A2C2E"/>
+          <w:sz w:val="24"/>
+          <w:szCs w:val="24"/>
+          <w:lang w:val="en-US" w:eastAsia="ko-KR"/>
+        </w:rPr>
+      </w:pPr>
+      <w:r>
+        <w:rPr>
+          <w:i/>
+          <w:iCs/>
+          <w:sz w:val="24"/>
+          <w:szCs w:val="24"/>
+        </w:rPr>
+        <w:br w:type="page"/>
+      </w:r>
+    </w:p>
+    <w:p>
+      <w:pPr>
+        <w:pStyle w:val="p1"/>
+        <w:rPr>
+          <w:sz w:val="24"/>
+          <w:szCs w:val="24"/>
+        </w:rPr>
+      </w:pPr>
+      <w:r>
+        <w:rPr>
+          <w:i/>
+          <w:iCs/>
+          <w:sz w:val="24"/>
+          <w:szCs w:val="24"/>
+        </w:rPr>
+        <w:lastRenderedPageBreak/>
+        <w:t>Abstract</w:t>
+      </w:r>
+    </w:p>
+    <w:p>
+      <w:pPr>
+        <w:pStyle w:val="p1"/>
+        <w:rPr>
+          <w:i/>
+          <w:iCs/>
+          <w:sz w:val="24"/>
+          <w:szCs w:val="24"/>
+        </w:rPr>
+      </w:pPr>
+    </w:p>
+    <w:p>
+      <w:pPr>
+        <w:pStyle w:val="p1"/>
+        <w:rPr>
+          <w:i/>
+          <w:iCs/>
+          <w:sz w:val="24"/>
+          <w:szCs w:val="24"/>
+        </w:rPr>
+      </w:pPr>
+    </w:p>
+    <w:p>
+      <w:pPr>
+        <w:pStyle w:val="p1"/>
+        <w:rPr>
+          <w:i/>
+          <w:iCs/>
+          <w:sz w:val="24"/>
+          <w:szCs w:val="24"/>
+        </w:rPr>
+      </w:pPr>
+      <w:r>
+        <w:rPr>
+          <w:i/>
+          <w:iCs/>
+          <w:sz w:val="24"/>
+          <w:szCs w:val="24"/>
+        </w:rPr>
+        <w:t>Introduction and State of the Art</w:t>
+      </w:r>
+    </w:p>
+    <w:p>
+      <w:pPr>
+        <w:pStyle w:val="p1"/>
+        <w:rPr>
+          <w:i/>
+          <w:iCs/>
+          <w:sz w:val="24"/>
+          <w:szCs w:val="24"/>
+        </w:rPr>
+      </w:pPr>
+    </w:p>
+    <w:p>
+      <w:pPr>
+        <w:pStyle w:val="p1"/>
+        <w:rPr>
+          <w:sz w:val="24"/>
+          <w:szCs w:val="24"/>
+        </w:rPr>
+      </w:pPr>
+      <w:r>
+        <w:rPr>
+          <w:sz w:val="24"/>
+          <w:szCs w:val="24"/>
+        </w:rPr>
+        <w:t>Gene transcription</w:t>
+      </w:r>
+      <w:r>
+        <w:rPr>
+          <w:sz w:val="24"/>
+          <w:szCs w:val="24"/>
+        </w:rPr>
+        <w:t xml:space="preserve"> </w:t>
+      </w:r>
+      <w:r>
+        <w:rPr>
+          <w:sz w:val="24"/>
+          <w:szCs w:val="24"/>
+        </w:rPr>
+        <w:t>determine</w:t>
+      </w:r>
+      <w:r>
+        <w:rPr>
+          <w:sz w:val="24"/>
+          <w:szCs w:val="24"/>
+        </w:rPr>
+        <w:t xml:space="preserve">s </w:t>
+      </w:r>
+      <w:r>
+        <w:rPr>
+          <w:sz w:val="24"/>
+          <w:szCs w:val="24"/>
+        </w:rPr>
+        <w:t>a significant portion of an organism’s attributes</w:t>
+      </w:r>
+      <w:r>
+        <w:rPr>
+          <w:sz w:val="24"/>
+          <w:szCs w:val="24"/>
+        </w:rPr>
+        <w:t xml:space="preserve"> and functions</w:t>
+      </w:r>
+      <w:r>
+        <w:rPr>
+          <w:sz w:val="24"/>
+          <w:szCs w:val="24"/>
+        </w:rPr>
+        <w:t xml:space="preserve"> by controlling </w:t>
+      </w:r>
+      <w:r>
+        <w:rPr>
+          <w:sz w:val="24"/>
+          <w:szCs w:val="24"/>
+        </w:rPr>
+        <w:t>gene expression</w:t>
+      </w:r>
+      <w:r>
+        <w:rPr>
+          <w:sz w:val="24"/>
+          <w:szCs w:val="24"/>
+        </w:rPr>
+        <w:t xml:space="preserve">. </w:t>
+      </w:r>
+      <w:r>
+        <w:rPr>
+          <w:sz w:val="24"/>
+          <w:szCs w:val="24"/>
+        </w:rPr>
+        <w:t>Specialized p</w:t>
+      </w:r>
+      <w:r>
+        <w:rPr>
+          <w:sz w:val="24"/>
+          <w:szCs w:val="24"/>
+        </w:rPr>
+        <w:t xml:space="preserve">roteins called transcription factors </w:t>
+      </w:r>
+      <w:r>
+        <w:rPr>
+          <w:sz w:val="24"/>
+          <w:szCs w:val="24"/>
+        </w:rPr>
+        <w:t xml:space="preserve">(TFs) </w:t>
+      </w:r>
+      <w:r>
+        <w:rPr>
+          <w:sz w:val="24"/>
+          <w:szCs w:val="24"/>
+        </w:rPr>
+        <w:t>modulate the gene expression process by acting as regulators that activate or repress transcription initiation, thereby modulating the expression of the gene</w:t>
+      </w:r>
+      <w:r>
+        <w:rPr>
+          <w:sz w:val="24"/>
+          <w:szCs w:val="24"/>
+        </w:rPr>
+        <w:t xml:space="preserve"> in the organism</w:t>
+      </w:r>
+      <w:r>
+        <w:rPr>
+          <w:sz w:val="24"/>
+          <w:szCs w:val="24"/>
+        </w:rPr>
+        <w:t>.</w:t>
+      </w:r>
+      <w:r>
+        <w:rPr>
+          <w:rStyle w:val="FootnoteReference"/>
+          <w:sz w:val="24"/>
+          <w:szCs w:val="24"/>
+        </w:rPr>
+        <w:footnoteReference w:id="1"/>
+      </w:r>
+      <w:r>
+        <w:rPr>
+          <w:sz w:val="24"/>
+          <w:szCs w:val="24"/>
+        </w:rPr>
+        <w:t xml:space="preserve">  </w:t>
+      </w:r>
+    </w:p>
+    <w:p>
+      <w:pPr>
+        <w:pStyle w:val="p1"/>
+        <w:rPr>
+          <w:sz w:val="24"/>
+          <w:szCs w:val="24"/>
+        </w:rPr>
+      </w:pPr>
+    </w:p>
+    <w:p>
+      <w:pPr>
+        <w:pStyle w:val="p1"/>
+        <w:rPr>
+          <w:sz w:val="24"/>
+          <w:szCs w:val="24"/>
+        </w:rPr>
+      </w:pPr>
+      <w:r>
+        <w:rPr>
+          <w:sz w:val="24"/>
+          <w:szCs w:val="24"/>
+        </w:rPr>
+        <w:t>T</w:t>
+      </w:r>
+      <w:r>
+        <w:rPr>
+          <w:sz w:val="24"/>
+          <w:szCs w:val="24"/>
+        </w:rPr>
+        <w:t xml:space="preserve">ranscription factor activity </w:t>
+      </w:r>
+      <w:r>
+        <w:rPr>
+          <w:sz w:val="24"/>
+          <w:szCs w:val="24"/>
+        </w:rPr>
+        <w:t xml:space="preserve">is triggered by </w:t>
+      </w:r>
+      <w:r>
+        <w:rPr>
+          <w:sz w:val="24"/>
+          <w:szCs w:val="24"/>
+        </w:rPr>
+        <w:t xml:space="preserve">a region of DNA </w:t>
+      </w:r>
+      <w:r>
+        <w:rPr>
+          <w:sz w:val="24"/>
+          <w:szCs w:val="24"/>
+        </w:rPr>
+        <w:t xml:space="preserve">physically </w:t>
+      </w:r>
+      <w:r>
+        <w:rPr>
+          <w:sz w:val="24"/>
+          <w:szCs w:val="24"/>
+        </w:rPr>
+        <w:t xml:space="preserve">adjacent </w:t>
+      </w:r>
+      <w:r>
+        <w:rPr>
+          <w:sz w:val="24"/>
+          <w:szCs w:val="24"/>
+        </w:rPr>
+        <w:t xml:space="preserve">to the </w:t>
+      </w:r>
+      <w:r>
+        <w:rPr>
+          <w:sz w:val="24"/>
+          <w:szCs w:val="24"/>
+        </w:rPr>
+        <w:t xml:space="preserve">encoding </w:t>
+      </w:r>
+      <w:r>
+        <w:rPr>
+          <w:sz w:val="24"/>
+          <w:szCs w:val="24"/>
+        </w:rPr>
+        <w:t>gene</w:t>
+      </w:r>
+      <w:r>
+        <w:rPr>
+          <w:sz w:val="24"/>
+          <w:szCs w:val="24"/>
+        </w:rPr>
+        <w:t>;</w:t>
+      </w:r>
+      <w:r>
+        <w:rPr>
+          <w:sz w:val="24"/>
+          <w:szCs w:val="24"/>
+        </w:rPr>
+        <w:t xml:space="preserve"> these regions of </w:t>
+      </w:r>
+      <w:r>
+        <w:rPr>
+          <w:sz w:val="24"/>
+          <w:szCs w:val="24"/>
+        </w:rPr>
+        <w:t>conserved DNA patterns</w:t>
+      </w:r>
+      <w:r>
+        <w:rPr>
+          <w:sz w:val="24"/>
+          <w:szCs w:val="24"/>
+        </w:rPr>
+        <w:t xml:space="preserve"> </w:t>
+      </w:r>
+      <w:r>
+        <w:rPr>
+          <w:sz w:val="24"/>
+          <w:szCs w:val="24"/>
+        </w:rPr>
+        <w:t xml:space="preserve">are </w:t>
+      </w:r>
+      <w:r>
+        <w:rPr>
+          <w:sz w:val="24"/>
+          <w:szCs w:val="24"/>
+        </w:rPr>
+        <w:t xml:space="preserve">known as </w:t>
+      </w:r>
+      <w:r>
+        <w:rPr>
+          <w:i/>
+          <w:iCs/>
+          <w:sz w:val="24"/>
+          <w:szCs w:val="24"/>
+        </w:rPr>
+        <w:t>motifs</w:t>
+      </w:r>
+      <w:r>
+        <w:rPr>
+          <w:sz w:val="24"/>
+          <w:szCs w:val="24"/>
+        </w:rPr>
+        <w:t xml:space="preserve">. </w:t>
+      </w:r>
+      <w:r>
+        <w:rPr>
+          <w:sz w:val="24"/>
+          <w:szCs w:val="24"/>
+        </w:rPr>
+        <w:t xml:space="preserve">Discovering </w:t>
+      </w:r>
+      <w:r>
+        <w:rPr>
+          <w:sz w:val="24"/>
+          <w:szCs w:val="24"/>
+        </w:rPr>
+        <w:t xml:space="preserve">such </w:t>
+      </w:r>
+      <w:r>
+        <w:rPr>
+          <w:sz w:val="24"/>
+          <w:szCs w:val="24"/>
+        </w:rPr>
+        <w:t xml:space="preserve">motifs </w:t>
+      </w:r>
+      <w:r>
+        <w:rPr>
+          <w:sz w:val="24"/>
+          <w:szCs w:val="24"/>
+        </w:rPr>
+        <w:t xml:space="preserve">is a </w:t>
+      </w:r>
+      <w:r>
+        <w:rPr>
+          <w:sz w:val="24"/>
+          <w:szCs w:val="24"/>
+        </w:rPr>
+        <w:t xml:space="preserve">common </w:t>
+      </w:r>
+      <w:r>
+        <w:rPr>
+          <w:sz w:val="24"/>
+          <w:szCs w:val="24"/>
+        </w:rPr>
+        <w:t xml:space="preserve">investigation in </w:t>
+      </w:r>
+      <w:r>
+        <w:rPr>
+          <w:sz w:val="24"/>
+          <w:szCs w:val="24"/>
+        </w:rPr>
+        <w:t>bioinformatics</w:t>
+      </w:r>
+      <w:r>
+        <w:rPr>
+          <w:sz w:val="24"/>
+          <w:szCs w:val="24"/>
+        </w:rPr>
+        <w:t xml:space="preserve">, and several probabilistic algorithms </w:t>
+      </w:r>
+      <w:r>
+        <w:rPr>
+          <w:sz w:val="24"/>
+          <w:szCs w:val="24"/>
+        </w:rPr>
+        <w:t xml:space="preserve">have been </w:t>
+      </w:r>
+      <w:r>
+        <w:rPr>
+          <w:sz w:val="24"/>
+          <w:szCs w:val="24"/>
+        </w:rPr>
+        <w:t xml:space="preserve">developed </w:t>
+      </w:r>
+      <w:r>
+        <w:rPr>
+          <w:sz w:val="24"/>
+          <w:szCs w:val="24"/>
+        </w:rPr>
+        <w:t xml:space="preserve">to perform </w:t>
+      </w:r>
+      <w:r>
+        <w:rPr>
+          <w:i/>
+          <w:iCs/>
+          <w:sz w:val="24"/>
+          <w:szCs w:val="24"/>
+        </w:rPr>
+        <w:t>ab initio</w:t>
+      </w:r>
+      <w:r>
+        <w:rPr>
+          <w:sz w:val="24"/>
+          <w:szCs w:val="24"/>
+        </w:rPr>
+        <w:t xml:space="preserve"> motif discovery</w:t>
+      </w:r>
+      <w:r>
+        <w:rPr>
+          <w:sz w:val="24"/>
+          <w:szCs w:val="24"/>
+        </w:rPr>
+        <w:t xml:space="preserve"> </w:t>
+      </w:r>
+      <w:r>
+        <w:rPr>
+          <w:sz w:val="24"/>
+          <w:szCs w:val="24"/>
+        </w:rPr>
+        <w:t xml:space="preserve">from </w:t>
+      </w:r>
+      <w:r>
+        <w:rPr>
+          <w:sz w:val="24"/>
+          <w:szCs w:val="24"/>
+        </w:rPr>
+        <w:t xml:space="preserve">sequence </w:t>
+      </w:r>
+      <w:r>
+        <w:rPr>
+          <w:sz w:val="24"/>
+          <w:szCs w:val="24"/>
+        </w:rPr>
+        <w:t>databases</w:t>
+      </w:r>
+      <w:r>
+        <w:rPr>
+          <w:sz w:val="24"/>
+          <w:szCs w:val="24"/>
+        </w:rPr>
+        <w:t>.</w:t>
+      </w:r>
+      <w:r>
+        <w:rPr>
+          <w:rStyle w:val="FootnoteReference"/>
+          <w:sz w:val="24"/>
+          <w:szCs w:val="24"/>
+        </w:rPr>
+        <w:footnoteReference w:id="2"/>
+      </w:r>
+      <w:r>
+        <w:rPr>
+          <w:sz w:val="24"/>
+          <w:szCs w:val="24"/>
+        </w:rPr>
+        <w:t xml:space="preserve"> </w:t>
+      </w:r>
+      <w:r>
+        <w:rPr>
+          <w:sz w:val="24"/>
+          <w:szCs w:val="24"/>
+        </w:rPr>
+        <w:t xml:space="preserve">Discovery is </w:t>
+      </w:r>
+      <w:r>
+        <w:rPr>
+          <w:sz w:val="24"/>
+          <w:szCs w:val="24"/>
+        </w:rPr>
+        <w:t xml:space="preserve">highly </w:t>
+      </w:r>
+      <w:r>
+        <w:rPr>
+          <w:sz w:val="24"/>
+          <w:szCs w:val="24"/>
+        </w:rPr>
+        <w:t xml:space="preserve">motivated by numerous applications such as diagnosing and treating chronic </w:t>
+      </w:r>
+      <w:r>
+        <w:rPr>
+          <w:sz w:val="24"/>
+          <w:szCs w:val="24"/>
+        </w:rPr>
+        <w:t xml:space="preserve">genetic </w:t>
+      </w:r>
+      <w:r>
+        <w:rPr>
+          <w:sz w:val="24"/>
+          <w:szCs w:val="24"/>
+        </w:rPr>
+        <w:t xml:space="preserve">disease, targeted drug design, </w:t>
+      </w:r>
+      <w:r>
+        <w:rPr>
+          <w:sz w:val="24"/>
+          <w:szCs w:val="24"/>
+        </w:rPr>
+        <w:t xml:space="preserve">and </w:t>
+      </w:r>
+      <w:r>
+        <w:rPr>
+          <w:sz w:val="24"/>
+          <w:szCs w:val="24"/>
+        </w:rPr>
+        <w:t>toxicity prediction of peptides and proteins.</w:t>
+      </w:r>
+      <w:r>
+        <w:rPr>
+          <w:rStyle w:val="FootnoteReference"/>
+          <w:sz w:val="24"/>
+          <w:szCs w:val="24"/>
+        </w:rPr>
+        <w:footnoteReference w:id="3"/>
+      </w:r>
+      <w:r>
+        <w:rPr>
+          <w:sz w:val="24"/>
+          <w:szCs w:val="24"/>
+        </w:rPr>
+        <w:t xml:space="preserve"> Motif discovery </w:t>
+      </w:r>
+      <w:r>
+        <w:rPr>
+          <w:i/>
+          <w:iCs/>
+          <w:sz w:val="24"/>
+          <w:szCs w:val="24"/>
+        </w:rPr>
+        <w:t xml:space="preserve">in silico </w:t>
+      </w:r>
+      <w:r>
+        <w:rPr>
+          <w:sz w:val="24"/>
+          <w:szCs w:val="24"/>
+        </w:rPr>
+        <w:t xml:space="preserve">allows </w:t>
+      </w:r>
+      <w:r>
+        <w:rPr>
+          <w:sz w:val="24"/>
+          <w:szCs w:val="24"/>
+        </w:rPr>
+        <w:t xml:space="preserve">for </w:t>
+      </w:r>
+      <w:r>
+        <w:rPr>
+          <w:sz w:val="24"/>
+          <w:szCs w:val="24"/>
+        </w:rPr>
+        <w:t xml:space="preserve">substantial reduction </w:t>
+      </w:r>
+      <w:r>
+        <w:rPr>
+          <w:sz w:val="24"/>
+          <w:szCs w:val="24"/>
+        </w:rPr>
+        <w:t xml:space="preserve">of </w:t>
+      </w:r>
+      <w:r>
+        <w:rPr>
+          <w:sz w:val="24"/>
+          <w:szCs w:val="24"/>
+        </w:rPr>
+        <w:t xml:space="preserve">the search space for active </w:t>
+      </w:r>
+      <w:r>
+        <w:rPr>
+          <w:sz w:val="24"/>
+          <w:szCs w:val="24"/>
+        </w:rPr>
+        <w:t>binding site</w:t>
+      </w:r>
+      <w:r>
+        <w:rPr>
+          <w:sz w:val="24"/>
+          <w:szCs w:val="24"/>
+        </w:rPr>
+        <w:t xml:space="preserve"> candidates</w:t>
+      </w:r>
+      <w:r>
+        <w:rPr>
+          <w:sz w:val="24"/>
+          <w:szCs w:val="24"/>
+        </w:rPr>
+        <w:t xml:space="preserve">, which </w:t>
+      </w:r>
+      <w:r>
+        <w:rPr>
+          <w:sz w:val="24"/>
+          <w:szCs w:val="24"/>
+        </w:rPr>
+        <w:t xml:space="preserve">in turn reduces </w:t>
+      </w:r>
+      <w:r>
+        <w:rPr>
+          <w:sz w:val="24"/>
+          <w:szCs w:val="24"/>
+        </w:rPr>
+        <w:t xml:space="preserve">the </w:t>
+      </w:r>
+      <w:r>
+        <w:rPr>
+          <w:sz w:val="24"/>
+          <w:szCs w:val="24"/>
+        </w:rPr>
+        <w:t>cost</w:t>
+      </w:r>
+      <w:r>
+        <w:rPr>
+          <w:sz w:val="24"/>
+          <w:szCs w:val="24"/>
+        </w:rPr>
+        <w:t>s and cycle times</w:t>
+      </w:r>
+      <w:r>
+        <w:rPr>
+          <w:sz w:val="24"/>
+          <w:szCs w:val="24"/>
+        </w:rPr>
+        <w:t xml:space="preserve"> of </w:t>
+      </w:r>
+      <w:r>
+        <w:rPr>
+          <w:sz w:val="24"/>
+          <w:szCs w:val="24"/>
+        </w:rPr>
+        <w:t xml:space="preserve">wet-lab </w:t>
+      </w:r>
+      <w:r>
+        <w:rPr>
+          <w:sz w:val="24"/>
+          <w:szCs w:val="24"/>
+        </w:rPr>
+        <w:t>testing</w:t>
+      </w:r>
+      <w:r>
+        <w:rPr>
+          <w:sz w:val="24"/>
+          <w:szCs w:val="24"/>
+        </w:rPr>
+        <w:t xml:space="preserve"> to confirm their function</w:t>
+      </w:r>
+      <w:r>
+        <w:rPr>
+          <w:sz w:val="24"/>
+          <w:szCs w:val="24"/>
+        </w:rPr>
+        <w:t>.</w:t>
+      </w:r>
+      <w:r>
+        <w:rPr>
+          <w:rStyle w:val="FootnoteReference"/>
+          <w:sz w:val="24"/>
+          <w:szCs w:val="24"/>
+        </w:rPr>
+        <w:footnoteReference w:id="4"/>
+      </w:r>
+    </w:p>
+    <w:p>
+      <w:pPr>
+        <w:pStyle w:val="p1"/>
+        <w:rPr>
+          <w:sz w:val="24"/>
+          <w:szCs w:val="24"/>
+        </w:rPr>
+      </w:pPr>
+    </w:p>
+    <w:p>
+      <w:pPr>
+        <w:pStyle w:val="p1"/>
+        <w:rPr>
+          <w:sz w:val="24"/>
+          <w:szCs w:val="24"/>
+        </w:rPr>
+      </w:pPr>
+      <w:r>
+        <w:rPr>
+          <w:sz w:val="24"/>
+          <w:szCs w:val="24"/>
+        </w:rPr>
+        <w:t>However, the biological context raises several challenges in the motif discovery process.</w:t>
+      </w:r>
+      <w:r>
+        <w:rPr>
+          <w:rStyle w:val="FootnoteReference"/>
+          <w:sz w:val="24"/>
+          <w:szCs w:val="24"/>
+        </w:rPr>
+        <w:footnoteReference w:id="5"/>
+      </w:r>
+      <w:r>
+        <w:rPr>
+          <w:sz w:val="24"/>
+          <w:szCs w:val="24"/>
+        </w:rPr>
+        <w:t xml:space="preserve"> </w:t>
+      </w:r>
+      <w:r>
+        <w:rPr>
+          <w:sz w:val="24"/>
+          <w:szCs w:val="24"/>
+        </w:rPr>
+        <w:t xml:space="preserve">Firstly, </w:t>
+      </w:r>
+      <w:r>
+        <w:rPr>
+          <w:sz w:val="24"/>
+          <w:szCs w:val="24"/>
+        </w:rPr>
+        <w:t xml:space="preserve">motifs can be </w:t>
+      </w:r>
+      <w:r>
+        <w:rPr>
+          <w:i/>
+          <w:iCs/>
+          <w:sz w:val="24"/>
+          <w:szCs w:val="24"/>
+        </w:rPr>
+        <w:t>degenerate</w:t>
+      </w:r>
+      <w:r>
+        <w:rPr>
+          <w:sz w:val="24"/>
+          <w:szCs w:val="24"/>
+        </w:rPr>
+        <w:t>, where only a few nucleotides within the motif are salient to its function.</w:t>
+      </w:r>
+      <w:r>
+        <w:rPr>
+          <w:rStyle w:val="FootnoteReference"/>
+          <w:sz w:val="24"/>
+          <w:szCs w:val="24"/>
+        </w:rPr>
+        <w:footnoteReference w:id="6"/>
+      </w:r>
+      <w:r>
+        <w:rPr>
+          <w:sz w:val="24"/>
+          <w:szCs w:val="24"/>
+        </w:rPr>
+        <w:t xml:space="preserve"> This means </w:t>
+      </w:r>
+      <w:r>
+        <w:rPr>
+          <w:sz w:val="24"/>
+          <w:szCs w:val="24"/>
+        </w:rPr>
+        <w:t>TFs</w:t>
+      </w:r>
+      <w:r>
+        <w:rPr>
+          <w:sz w:val="24"/>
+          <w:szCs w:val="24"/>
+        </w:rPr>
+        <w:t xml:space="preserve"> </w:t>
+      </w:r>
+      <w:r>
+        <w:rPr>
+          <w:sz w:val="24"/>
+          <w:szCs w:val="24"/>
+        </w:rPr>
+        <w:t>do not strictly</w:t>
+      </w:r>
+      <w:r>
+        <w:rPr>
+          <w:sz w:val="24"/>
+          <w:szCs w:val="24"/>
+        </w:rPr>
+        <w:t xml:space="preserve"> discriminate </w:t>
+      </w:r>
+      <w:r>
+        <w:rPr>
+          <w:sz w:val="24"/>
+          <w:szCs w:val="24"/>
+        </w:rPr>
+        <w:t>for a specific</w:t>
+      </w:r>
+      <w:r>
+        <w:rPr>
+          <w:sz w:val="24"/>
+          <w:szCs w:val="24"/>
+        </w:rPr>
+        <w:t xml:space="preserve">, universally </w:t>
+      </w:r>
+      <w:r>
+        <w:rPr>
+          <w:sz w:val="24"/>
+          <w:szCs w:val="24"/>
+        </w:rPr>
+        <w:t>consistent sequence of nucleotides</w:t>
+      </w:r>
+      <w:r>
+        <w:rPr>
+          <w:sz w:val="24"/>
+          <w:szCs w:val="24"/>
+        </w:rPr>
+        <w:t xml:space="preserve">: </w:t>
+      </w:r>
+      <w:r>
+        <w:rPr>
+          <w:sz w:val="24"/>
+          <w:szCs w:val="24"/>
+        </w:rPr>
+        <w:t>in other words, due to natural evolutionary mutation</w:t>
+      </w:r>
+      <w:r>
+        <w:rPr>
+          <w:sz w:val="24"/>
+          <w:szCs w:val="24"/>
+        </w:rPr>
+        <w:t>s</w:t>
+      </w:r>
+      <w:r>
+        <w:rPr>
+          <w:sz w:val="24"/>
+          <w:szCs w:val="24"/>
+        </w:rPr>
+        <w:t xml:space="preserve">, </w:t>
+      </w:r>
+      <w:r>
+        <w:rPr>
+          <w:sz w:val="24"/>
+          <w:szCs w:val="24"/>
+        </w:rPr>
+        <w:t xml:space="preserve">TFs </w:t>
+      </w:r>
+      <w:r>
+        <w:rPr>
+          <w:sz w:val="24"/>
+          <w:szCs w:val="24"/>
+        </w:rPr>
+        <w:t xml:space="preserve">can still </w:t>
+      </w:r>
+      <w:r>
+        <w:rPr>
+          <w:sz w:val="24"/>
+          <w:szCs w:val="24"/>
+        </w:rPr>
+        <w:t xml:space="preserve">bind to </w:t>
+      </w:r>
+      <w:r>
+        <w:rPr>
+          <w:sz w:val="24"/>
+          <w:szCs w:val="24"/>
+        </w:rPr>
+        <w:t xml:space="preserve">sequences </w:t>
+      </w:r>
+      <w:r>
+        <w:rPr>
+          <w:sz w:val="24"/>
+          <w:szCs w:val="24"/>
+        </w:rPr>
+        <w:t xml:space="preserve">that </w:t>
+      </w:r>
+      <w:r>
+        <w:rPr>
+          <w:sz w:val="24"/>
+          <w:szCs w:val="24"/>
+        </w:rPr>
+        <w:t xml:space="preserve">look </w:t>
+      </w:r>
+      <w:r>
+        <w:rPr>
+          <w:sz w:val="24"/>
+          <w:szCs w:val="24"/>
+        </w:rPr>
+        <w:t>“</w:t>
+      </w:r>
+      <w:r>
+        <w:rPr>
+          <w:sz w:val="24"/>
+          <w:szCs w:val="24"/>
+        </w:rPr>
+        <w:t xml:space="preserve">similar </w:t>
+      </w:r>
+      <w:r>
+        <w:rPr>
+          <w:sz w:val="24"/>
+          <w:szCs w:val="24"/>
+        </w:rPr>
+        <w:t xml:space="preserve">enough,” and this </w:t>
+      </w:r>
+      <w:r>
+        <w:rPr>
+          <w:sz w:val="24"/>
+          <w:szCs w:val="24"/>
+        </w:rPr>
+        <w:t>allowance for variation</w:t>
+      </w:r>
+      <w:r>
+        <w:rPr>
+          <w:sz w:val="24"/>
+          <w:szCs w:val="24"/>
+        </w:rPr>
+        <w:t xml:space="preserve"> introduces noise and uncertainty </w:t>
+      </w:r>
+      <w:r>
+        <w:rPr>
+          <w:sz w:val="24"/>
+          <w:szCs w:val="24"/>
+        </w:rPr>
+        <w:t xml:space="preserve">in </w:t>
+      </w:r>
+      <w:r>
+        <w:rPr>
+          <w:sz w:val="24"/>
+          <w:szCs w:val="24"/>
+        </w:rPr>
+        <w:t>the process of discovery</w:t>
+      </w:r>
+      <w:r>
+        <w:rPr>
+          <w:sz w:val="24"/>
+          <w:szCs w:val="24"/>
+        </w:rPr>
+        <w:t xml:space="preserve">. </w:t>
+      </w:r>
+      <w:r>
+        <w:rPr>
+          <w:sz w:val="24"/>
+          <w:szCs w:val="24"/>
+        </w:rPr>
+        <w:t xml:space="preserve">Moreover, </w:t>
+      </w:r>
+      <w:r>
+        <w:rPr>
+          <w:i/>
+          <w:iCs/>
+          <w:sz w:val="24"/>
+          <w:szCs w:val="24"/>
+        </w:rPr>
+        <w:t>de novo</w:t>
+      </w:r>
+      <w:r>
+        <w:rPr>
+          <w:sz w:val="24"/>
+          <w:szCs w:val="24"/>
+        </w:rPr>
+        <w:t xml:space="preserve"> motif discovery – the process of finding motifs without prior sequence alignment</w:t>
+      </w:r>
+      <w:r>
+        <w:rPr>
+          <w:sz w:val="24"/>
+          <w:szCs w:val="24"/>
+        </w:rPr>
+        <w:t xml:space="preserve"> – is further stymied by the fact that a motif’s location relative to its corresponding gene is unfixed. The motif can be either upstream or downstream, while the distance between the motif and the gene varies widely.</w:t>
+      </w:r>
+      <w:r>
+        <w:rPr>
+          <w:rStyle w:val="FootnoteReference"/>
+          <w:sz w:val="24"/>
+          <w:szCs w:val="24"/>
+        </w:rPr>
+        <w:footnoteReference w:id="7"/>
+      </w:r>
+      <w:r>
+        <w:rPr>
+          <w:sz w:val="24"/>
+          <w:szCs w:val="24"/>
+        </w:rPr>
+        <w:t xml:space="preserve"> Therefore, motif discovery can be considered a common approximate substring (CAS) problem, which is defined as NP-hard.</w:t>
+      </w:r>
+      <w:r>
+        <w:rPr>
+          <w:rStyle w:val="FootnoteReference"/>
+          <w:sz w:val="24"/>
+          <w:szCs w:val="24"/>
+        </w:rPr>
+        <w:footnoteReference w:id="8"/>
+      </w:r>
+      <w:r>
+        <w:rPr>
+          <w:sz w:val="24"/>
+          <w:szCs w:val="24"/>
+        </w:rPr>
+        <w:t xml:space="preserve"> </w:t>
+      </w:r>
+    </w:p>
+    <w:p>
+      <w:pPr>
+        <w:pStyle w:val="p1"/>
+        <w:rPr>
+          <w:sz w:val="24"/>
+          <w:szCs w:val="24"/>
+        </w:rPr>
+      </w:pPr>
+    </w:p>
+    <w:p>
+      <w:pPr>
+        <w:pStyle w:val="p1"/>
+        <w:rPr>
+          <w:sz w:val="24"/>
+          <w:szCs w:val="24"/>
+        </w:rPr>
+      </w:pPr>
+      <w:r>
+        <w:rPr>
+          <w:sz w:val="24"/>
+          <w:szCs w:val="24"/>
+        </w:rPr>
+        <w:t>To perform discovery, m</w:t>
+      </w:r>
+      <w:r>
+        <w:rPr>
+          <w:sz w:val="24"/>
+          <w:szCs w:val="24"/>
+        </w:rPr>
+        <w:t xml:space="preserve">otifs </w:t>
+      </w:r>
+      <w:r>
+        <w:rPr>
+          <w:sz w:val="24"/>
+          <w:szCs w:val="24"/>
+        </w:rPr>
+        <w:t xml:space="preserve">are typically modeled as </w:t>
+      </w:r>
+      <w:r>
+        <w:rPr>
+          <w:sz w:val="24"/>
+          <w:szCs w:val="24"/>
+        </w:rPr>
+        <w:t xml:space="preserve">matrix representations of sets of </w:t>
+      </w:r>
+      <w:r>
+        <w:rPr>
+          <w:sz w:val="24"/>
+          <w:szCs w:val="24"/>
+        </w:rPr>
+        <w:t xml:space="preserve">DNA sequences, which can then be analyzed through an </w:t>
+      </w:r>
+      <w:r>
+        <w:rPr>
+          <w:sz w:val="24"/>
+          <w:szCs w:val="24"/>
+        </w:rPr>
+        <w:t>information theory</w:t>
+      </w:r>
+      <w:r>
+        <w:rPr>
+          <w:sz w:val="24"/>
+          <w:szCs w:val="24"/>
+        </w:rPr>
+        <w:t xml:space="preserve"> lens</w:t>
+      </w:r>
+      <w:r>
+        <w:rPr>
+          <w:sz w:val="24"/>
+          <w:szCs w:val="24"/>
+        </w:rPr>
+        <w:t xml:space="preserve">, </w:t>
+      </w:r>
+      <w:r>
+        <w:rPr>
+          <w:sz w:val="24"/>
+          <w:szCs w:val="24"/>
+        </w:rPr>
+        <w:t xml:space="preserve">a </w:t>
+      </w:r>
+      <w:r>
+        <w:rPr>
+          <w:sz w:val="24"/>
+          <w:szCs w:val="24"/>
+        </w:rPr>
+        <w:lastRenderedPageBreak/>
+        <w:t xml:space="preserve">framework </w:t>
+      </w:r>
+      <w:r>
+        <w:rPr>
+          <w:sz w:val="24"/>
+          <w:szCs w:val="24"/>
+        </w:rPr>
+        <w:t xml:space="preserve">proposed </w:t>
+      </w:r>
+      <w:r>
+        <w:rPr>
+          <w:sz w:val="24"/>
+          <w:szCs w:val="24"/>
+        </w:rPr>
+        <w:t>as early as 1948 with Claude Shannon’s</w:t>
+      </w:r>
+      <w:r>
+        <w:rPr>
+          <w:sz w:val="24"/>
+          <w:szCs w:val="24"/>
+        </w:rPr>
+        <w:t xml:space="preserve"> watershed “A Mathematical Theory of Communication</w:t>
+      </w:r>
+      <w:r>
+        <w:rPr>
+          <w:sz w:val="24"/>
+          <w:szCs w:val="24"/>
+        </w:rPr>
+        <w:t xml:space="preserve">,” which </w:t>
+      </w:r>
+      <w:r>
+        <w:rPr>
+          <w:sz w:val="24"/>
+          <w:szCs w:val="24"/>
+        </w:rPr>
+        <w:t xml:space="preserve">was then </w:t>
+      </w:r>
+      <w:r>
+        <w:rPr>
+          <w:sz w:val="24"/>
+          <w:szCs w:val="24"/>
+        </w:rPr>
+        <w:t xml:space="preserve">applied </w:t>
+      </w:r>
+      <w:r>
+        <w:rPr>
+          <w:sz w:val="24"/>
+          <w:szCs w:val="24"/>
+        </w:rPr>
+        <w:t xml:space="preserve">in </w:t>
+      </w:r>
+      <w:r>
+        <w:rPr>
+          <w:sz w:val="24"/>
+          <w:szCs w:val="24"/>
+        </w:rPr>
+        <w:t xml:space="preserve">the </w:t>
+      </w:r>
+      <w:r>
+        <w:rPr>
+          <w:sz w:val="24"/>
+          <w:szCs w:val="24"/>
+        </w:rPr>
+        <w:t xml:space="preserve">biological </w:t>
+      </w:r>
+      <w:r>
+        <w:rPr>
+          <w:sz w:val="24"/>
+          <w:szCs w:val="24"/>
+        </w:rPr>
+        <w:t xml:space="preserve">context by </w:t>
+      </w:r>
+      <w:r>
+        <w:rPr>
+          <w:sz w:val="24"/>
+          <w:szCs w:val="24"/>
+        </w:rPr>
+        <w:t>Lila Gatlin’s “The Information Content of DNA” in 1966.</w:t>
+      </w:r>
+      <w:r>
+        <w:rPr>
+          <w:rStyle w:val="FootnoteReference"/>
+          <w:sz w:val="24"/>
+          <w:szCs w:val="24"/>
+        </w:rPr>
+        <w:footnoteReference w:id="9"/>
+      </w:r>
+      <w:r>
+        <w:rPr>
+          <w:sz w:val="24"/>
+          <w:szCs w:val="24"/>
+        </w:rPr>
+        <w:t xml:space="preserve"> </w:t>
+      </w:r>
+      <w:r>
+        <w:rPr>
+          <w:sz w:val="24"/>
+          <w:szCs w:val="24"/>
+        </w:rPr>
+        <w:t xml:space="preserve">In essence, DNA can be considered an </w:t>
+      </w:r>
+      <w:r>
+        <w:rPr>
+          <w:sz w:val="24"/>
+          <w:szCs w:val="24"/>
+        </w:rPr>
+        <w:t>information-bearing</w:t>
+      </w:r>
+      <w:r>
+        <w:rPr>
+          <w:sz w:val="24"/>
+          <w:szCs w:val="24"/>
+        </w:rPr>
+        <w:t xml:space="preserve"> message, and by comparing multiple sequences</w:t>
+      </w:r>
+      <w:r>
+        <w:rPr>
+          <w:sz w:val="24"/>
+          <w:szCs w:val="24"/>
+        </w:rPr>
+        <w:t xml:space="preserve"> </w:t>
+      </w:r>
+      <w:r>
+        <w:rPr>
+          <w:sz w:val="24"/>
+          <w:szCs w:val="24"/>
+        </w:rPr>
+        <w:t xml:space="preserve">known to be bound by a </w:t>
+      </w:r>
+      <w:r>
+        <w:rPr>
+          <w:sz w:val="24"/>
+          <w:szCs w:val="24"/>
+        </w:rPr>
+        <w:t xml:space="preserve">particular transcription factor, </w:t>
+      </w:r>
+      <w:r>
+        <w:rPr>
+          <w:sz w:val="24"/>
+          <w:szCs w:val="24"/>
+        </w:rPr>
+        <w:t xml:space="preserve">we can infer </w:t>
+      </w:r>
+      <w:r>
+        <w:rPr>
+          <w:sz w:val="24"/>
+          <w:szCs w:val="24"/>
+        </w:rPr>
+        <w:t xml:space="preserve">the likely morphology of </w:t>
+      </w:r>
+      <w:r>
+        <w:rPr>
+          <w:sz w:val="24"/>
+          <w:szCs w:val="24"/>
+        </w:rPr>
+        <w:t xml:space="preserve">its </w:t>
+      </w:r>
+      <w:r>
+        <w:rPr>
+          <w:sz w:val="24"/>
+          <w:szCs w:val="24"/>
+        </w:rPr>
+        <w:t xml:space="preserve">binding motif </w:t>
+      </w:r>
+      <w:r>
+        <w:rPr>
+          <w:sz w:val="24"/>
+          <w:szCs w:val="24"/>
+        </w:rPr>
+        <w:t xml:space="preserve">by applying </w:t>
+      </w:r>
+      <w:r>
+        <w:rPr>
+          <w:sz w:val="24"/>
+          <w:szCs w:val="24"/>
+        </w:rPr>
+        <w:t xml:space="preserve">statistical detection </w:t>
+      </w:r>
+      <w:r>
+        <w:rPr>
+          <w:sz w:val="24"/>
+          <w:szCs w:val="24"/>
+        </w:rPr>
+        <w:t xml:space="preserve">of </w:t>
+      </w:r>
+      <w:r>
+        <w:rPr>
+          <w:sz w:val="24"/>
+          <w:szCs w:val="24"/>
+        </w:rPr>
+        <w:t xml:space="preserve">overrepresented patterns </w:t>
+      </w:r>
+      <w:r>
+        <w:rPr>
+          <w:sz w:val="24"/>
+          <w:szCs w:val="24"/>
+        </w:rPr>
+        <w:t xml:space="preserve">across the </w:t>
+      </w:r>
+      <w:r>
+        <w:rPr>
+          <w:sz w:val="24"/>
+          <w:szCs w:val="24"/>
+        </w:rPr>
+        <w:t xml:space="preserve">sequences. </w:t>
+      </w:r>
+    </w:p>
+    <w:p>
+      <w:pPr>
+        <w:pStyle w:val="p1"/>
+        <w:rPr>
+          <w:sz w:val="24"/>
+          <w:szCs w:val="24"/>
+        </w:rPr>
+      </w:pPr>
+    </w:p>
+    <w:p>
+      <w:pPr>
+        <w:pStyle w:val="p1"/>
+        <w:rPr>
+          <w:sz w:val="24"/>
+          <w:szCs w:val="24"/>
+        </w:rPr>
+      </w:pPr>
+      <w:r>
+        <w:rPr>
+          <w:sz w:val="24"/>
+          <w:szCs w:val="24"/>
+        </w:rPr>
+        <w:t xml:space="preserve">Stochastic algorithms </w:t>
+      </w:r>
+      <w:r>
+        <w:rPr>
+          <w:sz w:val="24"/>
+          <w:szCs w:val="24"/>
+        </w:rPr>
+        <w:t>like MEME (</w:t>
+      </w:r>
+      <w:r>
+        <w:rPr>
+          <w:sz w:val="24"/>
+          <w:szCs w:val="24"/>
+        </w:rPr>
+        <w:t>Multiple EM for Motif Elicitation</w:t>
+      </w:r>
+      <w:r>
+        <w:rPr>
+          <w:sz w:val="24"/>
+          <w:szCs w:val="24"/>
+        </w:rPr>
+        <w:t>)</w:t>
+      </w:r>
+      <w:r>
+        <w:rPr>
+          <w:sz w:val="24"/>
+          <w:szCs w:val="24"/>
+        </w:rPr>
+        <w:t xml:space="preserve"> can locate</w:t>
+      </w:r>
+      <w:r>
+        <w:rPr>
+          <w:sz w:val="24"/>
+          <w:szCs w:val="24"/>
+        </w:rPr>
+        <w:t xml:space="preserve"> short overrepresented sequence patterns in sets of sequences targeted by a transcription factor, but they generate multiple possible candidates</w:t>
+      </w:r>
+      <w:r>
+        <w:rPr>
+          <w:sz w:val="24"/>
+          <w:szCs w:val="24"/>
+        </w:rPr>
+        <w:t xml:space="preserve"> </w:t>
+      </w:r>
+      <w:r>
+        <w:rPr>
+          <w:sz w:val="24"/>
+          <w:szCs w:val="24"/>
+        </w:rPr>
+        <w:t>with a varie</w:t>
+      </w:r>
+      <w:r>
+        <w:rPr>
+          <w:sz w:val="24"/>
+          <w:szCs w:val="24"/>
+        </w:rPr>
+        <w:t xml:space="preserve">ty of </w:t>
+      </w:r>
+      <w:r>
+        <w:rPr>
+          <w:sz w:val="24"/>
+          <w:szCs w:val="24"/>
+        </w:rPr>
+        <w:t xml:space="preserve">nucleotide sequence </w:t>
+      </w:r>
+      <w:r>
+        <w:rPr>
+          <w:sz w:val="24"/>
+          <w:szCs w:val="24"/>
+        </w:rPr>
+        <w:t>patterns</w:t>
+      </w:r>
+      <w:r>
+        <w:rPr>
+          <w:sz w:val="24"/>
+          <w:szCs w:val="24"/>
+        </w:rPr>
+        <w:t xml:space="preserve"> and morphologies</w:t>
+      </w:r>
+      <w:r>
+        <w:rPr>
+          <w:sz w:val="24"/>
+          <w:szCs w:val="24"/>
+        </w:rPr>
+        <w:t>.</w:t>
+      </w:r>
+      <w:r>
+        <w:rPr>
+          <w:rStyle w:val="FootnoteReference"/>
+          <w:sz w:val="24"/>
+          <w:szCs w:val="24"/>
+        </w:rPr>
+        <w:footnoteReference w:id="10"/>
+      </w:r>
+      <w:r>
+        <w:rPr>
+          <w:sz w:val="24"/>
+          <w:szCs w:val="24"/>
+        </w:rPr>
+        <w:t xml:space="preserve"> </w:t>
+      </w:r>
+      <w:r>
+        <w:rPr>
+          <w:sz w:val="24"/>
+          <w:szCs w:val="24"/>
+        </w:rPr>
+        <w:t>MEME</w:t>
+      </w:r>
+      <w:r>
+        <w:rPr>
+          <w:sz w:val="24"/>
+          <w:szCs w:val="24"/>
+        </w:rPr>
+        <w:t xml:space="preserve">’s core mechanism is </w:t>
+      </w:r>
+      <w:r>
+        <w:rPr>
+          <w:sz w:val="24"/>
+          <w:szCs w:val="24"/>
+        </w:rPr>
+        <w:t xml:space="preserve">Expectation Maximization, using the </w:t>
+      </w:r>
+      <w:r>
+        <w:rPr>
+          <w:sz w:val="24"/>
+          <w:szCs w:val="24"/>
+        </w:rPr>
+        <w:t xml:space="preserve">position weight </w:t>
+      </w:r>
+      <w:r>
+        <w:rPr>
+          <w:sz w:val="24"/>
+          <w:szCs w:val="24"/>
+        </w:rPr>
+        <w:t xml:space="preserve">matrix of nucleotide frequencies (Adenosine, </w:t>
+      </w:r>
+      <w:r>
+        <w:rPr>
+          <w:sz w:val="24"/>
+          <w:szCs w:val="24"/>
+        </w:rPr>
+        <w:t>Thymine</w:t>
+      </w:r>
+      <w:r>
+        <w:rPr>
+          <w:sz w:val="24"/>
+          <w:szCs w:val="24"/>
+        </w:rPr>
+        <w:t xml:space="preserve">, Cytosine, and Guanine) at each index position </w:t>
+      </w:r>
+      <w:r>
+        <w:rPr>
+          <w:sz w:val="24"/>
+          <w:szCs w:val="24"/>
+        </w:rPr>
+        <w:t>to fit a mixture model.</w:t>
+      </w:r>
+      <w:r>
+        <w:rPr>
+          <w:sz w:val="24"/>
+          <w:szCs w:val="24"/>
+        </w:rPr>
+        <w:t xml:space="preserve"> </w:t>
+      </w:r>
+      <w:r>
+        <w:rPr>
+          <w:sz w:val="24"/>
+          <w:szCs w:val="24"/>
+        </w:rPr>
+        <w:t>This iterative optimization process maximizes the model's likelihood to discover motif candidates of a specified length. Once a motif model converges, MEME evaluates its statistical significance by calculating an E-value, which represents the expected number of motifs with an equal or higher information content that one would find by pure chance in a random dataset of the same size</w:t>
+      </w:r>
+      <w:r>
+        <w:rPr>
+          <w:sz w:val="24"/>
+          <w:szCs w:val="24"/>
+        </w:rPr>
+        <w:t>.</w:t>
+      </w:r>
+      <w:r>
+        <w:rPr>
+          <w:rStyle w:val="FootnoteReference"/>
+          <w:sz w:val="24"/>
+          <w:szCs w:val="24"/>
+        </w:rPr>
+        <w:footnoteReference w:id="11"/>
+      </w:r>
+    </w:p>
+    <w:p>
+      <w:pPr>
+        <w:pStyle w:val="p1"/>
+        <w:rPr>
+          <w:sz w:val="24"/>
+          <w:szCs w:val="24"/>
+        </w:rPr>
+      </w:pPr>
+    </w:p>
+    <w:p>
+      <w:pPr>
+        <w:pStyle w:val="p1"/>
+        <w:rPr>
+          <w:sz w:val="24"/>
+          <w:szCs w:val="24"/>
+        </w:rPr>
+      </w:pPr>
+      <w:r>
+        <w:rPr>
+          <w:sz w:val="24"/>
+          <w:szCs w:val="24"/>
+        </w:rPr>
+        <w:t xml:space="preserve">Since the advent of MEME in 2006, several alternative </w:t>
+      </w:r>
+      <w:r>
+        <w:rPr>
+          <w:sz w:val="24"/>
+          <w:szCs w:val="24"/>
+        </w:rPr>
+        <w:t xml:space="preserve">toolkits such as </w:t>
+      </w:r>
+      <w:r>
+        <w:rPr>
+          <w:sz w:val="24"/>
+          <w:szCs w:val="24"/>
+        </w:rPr>
+        <w:t>HOMER</w:t>
+      </w:r>
+      <w:r>
+        <w:rPr>
+          <w:sz w:val="24"/>
+          <w:szCs w:val="24"/>
+        </w:rPr>
+        <w:t xml:space="preserve"> </w:t>
+      </w:r>
+      <w:r>
+        <w:rPr>
+          <w:sz w:val="24"/>
+          <w:szCs w:val="24"/>
+        </w:rPr>
+        <w:t xml:space="preserve">(Hypergeometric Optimization of Motif </w:t>
+      </w:r>
+      <w:proofErr w:type="spellStart"/>
+      <w:r>
+        <w:rPr>
+          <w:sz w:val="24"/>
+          <w:szCs w:val="24"/>
+        </w:rPr>
+        <w:t>EnRichment</w:t>
+      </w:r>
+      <w:proofErr w:type="spellEnd"/>
+      <w:r>
+        <w:rPr>
+          <w:sz w:val="24"/>
+          <w:szCs w:val="24"/>
+        </w:rPr>
+        <w:t xml:space="preserve">, 2010) or STREME </w:t>
+      </w:r>
+      <w:r>
+        <w:rPr>
+          <w:sz w:val="24"/>
+          <w:szCs w:val="24"/>
+        </w:rPr>
+        <w:t>(</w:t>
+      </w:r>
+      <w:r>
+        <w:rPr>
+          <w:sz w:val="24"/>
+          <w:szCs w:val="24"/>
+        </w:rPr>
+        <w:t>Simple, Thorough, Rapid, Enriched Motif Elicitation</w:t>
+      </w:r>
+      <w:r>
+        <w:rPr>
+          <w:sz w:val="24"/>
+          <w:szCs w:val="24"/>
+        </w:rPr>
+        <w:t xml:space="preserve"> , </w:t>
+      </w:r>
+      <w:r>
+        <w:rPr>
+          <w:sz w:val="24"/>
+          <w:szCs w:val="24"/>
+        </w:rPr>
+        <w:t>2021)</w:t>
+      </w:r>
+      <w:r>
+        <w:rPr>
+          <w:sz w:val="24"/>
+          <w:szCs w:val="24"/>
+        </w:rPr>
+        <w:t xml:space="preserve"> iterate the concept further, using tokenization and suffix trees to improve scaling ability, user friendliness, and</w:t>
+      </w:r>
+      <w:r>
+        <w:rPr>
+          <w:sz w:val="24"/>
+          <w:szCs w:val="24"/>
+        </w:rPr>
+        <w:t xml:space="preserve"> accuracy.</w:t>
+      </w:r>
+      <w:r>
+        <w:rPr>
+          <w:rStyle w:val="FootnoteReference"/>
+          <w:sz w:val="24"/>
+          <w:szCs w:val="24"/>
+        </w:rPr>
+        <w:footnoteReference w:id="12"/>
+      </w:r>
+      <w:r>
+        <w:rPr>
+          <w:sz w:val="24"/>
+          <w:szCs w:val="24"/>
+        </w:rPr>
+        <w:t xml:space="preserve"> </w:t>
+      </w:r>
+      <w:r>
+        <w:rPr>
+          <w:sz w:val="24"/>
+          <w:szCs w:val="24"/>
+        </w:rPr>
+        <w:t xml:space="preserve"> </w:t>
+      </w:r>
+      <w:r>
+        <w:rPr>
+          <w:sz w:val="24"/>
+          <w:szCs w:val="24"/>
+        </w:rPr>
+        <w:t xml:space="preserve">Other approaches are combinatorial or </w:t>
+      </w:r>
+      <w:r>
+        <w:rPr>
+          <w:sz w:val="24"/>
+          <w:szCs w:val="24"/>
+        </w:rPr>
+        <w:t>machine learning</w:t>
+      </w:r>
+      <w:r>
+        <w:rPr>
+          <w:sz w:val="24"/>
+          <w:szCs w:val="24"/>
+        </w:rPr>
+        <w:t>-based.</w:t>
+      </w:r>
+      <w:r>
+        <w:rPr>
+          <w:rStyle w:val="FootnoteReference"/>
+          <w:sz w:val="24"/>
+          <w:szCs w:val="24"/>
+        </w:rPr>
+        <w:footnoteReference w:id="13"/>
+      </w:r>
+    </w:p>
+    <w:p>
+      <w:pPr>
+        <w:pStyle w:val="p1"/>
+        <w:rPr>
+          <w:sz w:val="24"/>
+          <w:szCs w:val="24"/>
+        </w:rPr>
+      </w:pPr>
+    </w:p>
+    <w:p>
+      <w:pPr>
+        <w:pStyle w:val="p1"/>
+        <w:rPr>
+          <w:sz w:val="24"/>
+          <w:szCs w:val="24"/>
+        </w:rPr>
+      </w:pPr>
+    </w:p>
+    <w:p>
+      <w:pPr>
+        <w:pStyle w:val="p1"/>
+        <w:rPr>
+          <w:sz w:val="24"/>
+          <w:szCs w:val="24"/>
+        </w:rPr>
+      </w:pPr>
+    </w:p>
+    <w:p>
+      <w:pPr>
+        <w:pStyle w:val="p1"/>
+        <w:rPr>
+          <w:i/>
+          <w:iCs/>
+          <w:sz w:val="24"/>
+          <w:szCs w:val="24"/>
+        </w:rPr>
+      </w:pPr>
+      <w:r>
+        <w:rPr>
+          <w:i/>
+          <w:iCs/>
+          <w:sz w:val="24"/>
+          <w:szCs w:val="24"/>
+        </w:rPr>
+        <w:t>Objectives</w:t>
+      </w:r>
+    </w:p>
+    <w:p>
+      <w:pPr>
+        <w:pStyle w:val="p1"/>
+        <w:rPr>
+          <w:i/>
+          <w:iCs/>
+          <w:sz w:val="24"/>
+          <w:szCs w:val="24"/>
+        </w:rPr>
+      </w:pPr>
+    </w:p>
+    <w:p>
+      <w:pPr>
+        <w:pStyle w:val="p1"/>
+        <w:rPr>
+          <w:sz w:val="24"/>
+          <w:szCs w:val="24"/>
+        </w:rPr>
+      </w:pPr>
+      <w:r>
+        <w:rPr>
+          <w:sz w:val="24"/>
+          <w:szCs w:val="24"/>
+        </w:rPr>
+        <w:t xml:space="preserve">The </w:t>
+      </w:r>
+      <w:r>
+        <w:rPr>
+          <w:sz w:val="24"/>
+          <w:szCs w:val="24"/>
+        </w:rPr>
+        <w:t xml:space="preserve">objective </w:t>
+      </w:r>
+      <w:r>
+        <w:rPr>
+          <w:sz w:val="24"/>
+          <w:szCs w:val="24"/>
+        </w:rPr>
+        <w:t xml:space="preserve">of this </w:t>
+      </w:r>
+      <w:r>
+        <w:rPr>
+          <w:sz w:val="24"/>
+          <w:szCs w:val="24"/>
+        </w:rPr>
+        <w:t xml:space="preserve">thesis is to create </w:t>
+      </w:r>
+      <w:r>
+        <w:rPr>
+          <w:sz w:val="24"/>
+          <w:szCs w:val="24"/>
+        </w:rPr>
+        <w:t xml:space="preserve">additional statistical frameworks to </w:t>
+      </w:r>
+      <w:r>
+        <w:rPr>
+          <w:sz w:val="24"/>
+          <w:szCs w:val="24"/>
+        </w:rPr>
+        <w:t xml:space="preserve">assess </w:t>
+      </w:r>
+      <w:r>
+        <w:rPr>
+          <w:sz w:val="24"/>
+          <w:szCs w:val="24"/>
+        </w:rPr>
+        <w:t xml:space="preserve">which candidate motifs reported by discovery tools like MEME are more likely to be true TF-binding motifs. </w:t>
+      </w:r>
+      <w:r>
+        <w:rPr>
+          <w:sz w:val="24"/>
+          <w:szCs w:val="24"/>
+        </w:rPr>
+        <w:t xml:space="preserve">While the MEME tool suite </w:t>
+      </w:r>
+      <w:r>
+        <w:rPr>
+          <w:sz w:val="24"/>
+          <w:szCs w:val="24"/>
+        </w:rPr>
+        <w:t xml:space="preserve">enables </w:t>
+      </w:r>
+      <w:r>
+        <w:rPr>
+          <w:sz w:val="24"/>
+          <w:szCs w:val="24"/>
+        </w:rPr>
+        <w:t xml:space="preserve">candidates to be checked against databases to confirm </w:t>
+      </w:r>
+      <w:r>
+        <w:rPr>
+          <w:sz w:val="24"/>
+          <w:szCs w:val="24"/>
+        </w:rPr>
+        <w:t xml:space="preserve">whether </w:t>
+      </w:r>
+      <w:r>
+        <w:rPr>
+          <w:sz w:val="24"/>
+          <w:szCs w:val="24"/>
+        </w:rPr>
+        <w:t>the candidate</w:t>
+      </w:r>
+      <w:r>
+        <w:rPr>
+          <w:sz w:val="24"/>
+          <w:szCs w:val="24"/>
+        </w:rPr>
+        <w:t>s</w:t>
+      </w:r>
+      <w:r>
+        <w:rPr>
+          <w:sz w:val="24"/>
+          <w:szCs w:val="24"/>
+        </w:rPr>
+        <w:t xml:space="preserve"> </w:t>
+      </w:r>
+      <w:r>
+        <w:rPr>
+          <w:sz w:val="24"/>
+          <w:szCs w:val="24"/>
+        </w:rPr>
+        <w:t xml:space="preserve">are </w:t>
+      </w:r>
+      <w:r>
+        <w:rPr>
+          <w:sz w:val="24"/>
+          <w:szCs w:val="24"/>
+        </w:rPr>
+        <w:t xml:space="preserve">present in other genomes, assessing the </w:t>
+      </w:r>
+      <w:r>
+        <w:rPr>
+          <w:sz w:val="24"/>
+          <w:szCs w:val="24"/>
+        </w:rPr>
+        <w:t xml:space="preserve">comparative </w:t>
+      </w:r>
+      <w:r>
+        <w:rPr>
+          <w:sz w:val="24"/>
+          <w:szCs w:val="24"/>
+        </w:rPr>
+        <w:t xml:space="preserve">quality of MEME candidates in isolation is an iterative step </w:t>
+      </w:r>
+      <w:r>
+        <w:rPr>
+          <w:sz w:val="24"/>
+          <w:szCs w:val="24"/>
+        </w:rPr>
+        <w:t xml:space="preserve">serving </w:t>
+      </w:r>
+      <w:r>
+        <w:rPr>
+          <w:sz w:val="24"/>
+          <w:szCs w:val="24"/>
+        </w:rPr>
+        <w:t>as a noise filter</w:t>
+      </w:r>
+      <w:r>
+        <w:rPr>
+          <w:sz w:val="24"/>
+          <w:szCs w:val="24"/>
+        </w:rPr>
+        <w:t xml:space="preserve"> </w:t>
+      </w:r>
+      <w:r>
+        <w:rPr>
+          <w:sz w:val="24"/>
+          <w:szCs w:val="24"/>
+        </w:rPr>
+        <w:t>to prioritize better candidates</w:t>
+      </w:r>
+      <w:r>
+        <w:rPr>
+          <w:sz w:val="24"/>
+          <w:szCs w:val="24"/>
+        </w:rPr>
+        <w:t>.</w:t>
+      </w:r>
+      <w:r>
+        <w:rPr>
+          <w:rStyle w:val="FootnoteReference"/>
+          <w:sz w:val="24"/>
+          <w:szCs w:val="24"/>
+        </w:rPr>
+        <w:footnoteReference w:id="14"/>
+      </w:r>
+      <w:r>
+        <w:rPr>
+          <w:sz w:val="24"/>
+          <w:szCs w:val="24"/>
+        </w:rPr>
+        <w:t xml:space="preserve"> </w:t>
+      </w:r>
+      <w:r>
+        <w:rPr>
+          <w:sz w:val="24"/>
+          <w:szCs w:val="24"/>
+        </w:rPr>
+        <w:t xml:space="preserve">Rather than introducing a new methodology for </w:t>
+      </w:r>
+      <w:r>
+        <w:rPr>
+          <w:i/>
+          <w:iCs/>
+          <w:sz w:val="24"/>
+          <w:szCs w:val="24"/>
+        </w:rPr>
+        <w:t>de novo</w:t>
+      </w:r>
+      <w:r>
+        <w:rPr>
+          <w:sz w:val="24"/>
+          <w:szCs w:val="24"/>
+        </w:rPr>
+        <w:t xml:space="preserve"> discovery</w:t>
+      </w:r>
+      <w:r>
+        <w:rPr>
+          <w:sz w:val="24"/>
+          <w:szCs w:val="24"/>
+        </w:rPr>
+        <w:t xml:space="preserve">, </w:t>
+      </w:r>
+      <w:r>
+        <w:rPr>
+          <w:sz w:val="24"/>
+          <w:szCs w:val="24"/>
+        </w:rPr>
+        <w:t xml:space="preserve">of which there are many as discussed earlier, </w:t>
+      </w:r>
+      <w:r>
+        <w:rPr>
+          <w:sz w:val="24"/>
+          <w:szCs w:val="24"/>
+        </w:rPr>
+        <w:t xml:space="preserve">the </w:t>
+      </w:r>
+      <w:r>
+        <w:rPr>
+          <w:sz w:val="24"/>
+          <w:szCs w:val="24"/>
+        </w:rPr>
+        <w:t xml:space="preserve">goal is to design </w:t>
+      </w:r>
+      <w:r>
+        <w:rPr>
+          <w:sz w:val="24"/>
+          <w:szCs w:val="24"/>
+        </w:rPr>
+        <w:t xml:space="preserve">and apply </w:t>
+      </w:r>
+      <w:r>
+        <w:rPr>
+          <w:sz w:val="24"/>
+          <w:szCs w:val="24"/>
+        </w:rPr>
+        <w:t xml:space="preserve">heuristics to refine </w:t>
+      </w:r>
+      <w:r>
+        <w:rPr>
+          <w:sz w:val="24"/>
+          <w:szCs w:val="24"/>
+        </w:rPr>
+        <w:t xml:space="preserve">and evaluate </w:t>
+      </w:r>
+      <w:r>
+        <w:rPr>
+          <w:sz w:val="24"/>
+          <w:szCs w:val="24"/>
+        </w:rPr>
+        <w:t xml:space="preserve">the </w:t>
+      </w:r>
+      <w:r>
+        <w:rPr>
+          <w:sz w:val="24"/>
+          <w:szCs w:val="24"/>
+        </w:rPr>
+        <w:t xml:space="preserve">multitude of </w:t>
+      </w:r>
+      <w:r>
+        <w:rPr>
+          <w:sz w:val="24"/>
+          <w:szCs w:val="24"/>
+        </w:rPr>
+        <w:t xml:space="preserve">candidate outputs </w:t>
+      </w:r>
+      <w:r>
+        <w:rPr>
+          <w:sz w:val="24"/>
+          <w:szCs w:val="24"/>
+        </w:rPr>
+        <w:t xml:space="preserve">from these methods. </w:t>
+      </w:r>
+    </w:p>
+    <w:p>
+      <w:pPr>
+        <w:pStyle w:val="p1"/>
+        <w:rPr>
+          <w:sz w:val="24"/>
+          <w:szCs w:val="24"/>
+        </w:rPr>
+      </w:pPr>
+    </w:p>
+    <w:p>
+      <w:pPr>
+        <w:pStyle w:val="p1"/>
+        <w:rPr>
+          <w:sz w:val="24"/>
+          <w:szCs w:val="24"/>
+        </w:rPr>
+      </w:pPr>
+      <w:r>
+        <w:rPr>
+          <w:sz w:val="24"/>
+          <w:szCs w:val="24"/>
+        </w:rPr>
+        <w:lastRenderedPageBreak/>
+        <w:t>W</w:t>
+      </w:r>
+      <w:r>
+        <w:rPr>
+          <w:sz w:val="24"/>
+          <w:szCs w:val="24"/>
+        </w:rPr>
+        <w:t xml:space="preserve">e focus on microbial TFs, which are known to form dimers and tetramers, </w:t>
+      </w:r>
+      <w:r>
+        <w:rPr>
+          <w:sz w:val="24"/>
+          <w:szCs w:val="24"/>
+        </w:rPr>
+        <w:t xml:space="preserve">meaning their binding </w:t>
+      </w:r>
+      <w:r>
+        <w:rPr>
+          <w:sz w:val="24"/>
+          <w:szCs w:val="24"/>
+        </w:rPr>
+        <w:t xml:space="preserve">motifs </w:t>
+      </w:r>
+      <w:r>
+        <w:rPr>
+          <w:sz w:val="24"/>
+          <w:szCs w:val="24"/>
+        </w:rPr>
+        <w:t xml:space="preserve">often form </w:t>
+      </w:r>
+      <w:r>
+        <w:rPr>
+          <w:sz w:val="24"/>
+          <w:szCs w:val="24"/>
+        </w:rPr>
+        <w:t xml:space="preserve">a </w:t>
+      </w:r>
+      <w:r>
+        <w:rPr>
+          <w:sz w:val="24"/>
+          <w:szCs w:val="24"/>
+        </w:rPr>
+        <w:t xml:space="preserve">direct or inverted repeat </w:t>
+      </w:r>
+      <w:r>
+        <w:rPr>
+          <w:sz w:val="24"/>
+          <w:szCs w:val="24"/>
+        </w:rPr>
+        <w:t xml:space="preserve">(“palindromic”) </w:t>
+      </w:r>
+      <w:r>
+        <w:rPr>
+          <w:sz w:val="24"/>
+          <w:szCs w:val="24"/>
+        </w:rPr>
+        <w:t xml:space="preserve">nucleotide </w:t>
+      </w:r>
+      <w:r>
+        <w:rPr>
+          <w:sz w:val="24"/>
+          <w:szCs w:val="24"/>
+        </w:rPr>
+        <w:t>sequence</w:t>
+      </w:r>
+      <w:r>
+        <w:rPr>
+          <w:sz w:val="24"/>
+          <w:szCs w:val="24"/>
+        </w:rPr>
+        <w:t xml:space="preserve">. </w:t>
+      </w:r>
+      <w:r>
+        <w:rPr>
+          <w:sz w:val="24"/>
+          <w:szCs w:val="24"/>
+        </w:rPr>
+        <w:t xml:space="preserve">Given a data set of known TF-binding motifs, we will employ the </w:t>
+      </w:r>
+      <w:r>
+        <w:rPr>
+          <w:sz w:val="24"/>
+          <w:szCs w:val="24"/>
+        </w:rPr>
+        <w:t xml:space="preserve">matrix representations of their aligned sequences </w:t>
+      </w:r>
+      <w:r>
+        <w:rPr>
+          <w:sz w:val="24"/>
+          <w:szCs w:val="24"/>
+        </w:rPr>
+        <w:t xml:space="preserve">(the position weight matrix) </w:t>
+      </w:r>
+      <w:r>
+        <w:rPr>
+          <w:sz w:val="24"/>
+          <w:szCs w:val="24"/>
+        </w:rPr>
+        <w:t>to model the joint distributions of the search space.</w:t>
+      </w:r>
+    </w:p>
+    <w:p>
+      <w:pPr>
+        <w:pStyle w:val="p1"/>
+        <w:rPr>
+          <w:sz w:val="24"/>
+          <w:szCs w:val="24"/>
+        </w:rPr>
+      </w:pPr>
+    </w:p>
+    <w:p>
+      <w:pPr>
+        <w:pStyle w:val="p1"/>
+        <w:rPr>
+          <w:sz w:val="24"/>
+          <w:szCs w:val="24"/>
+        </w:rPr>
+      </w:pPr>
+    </w:p>
+    <w:p>
+      <w:pPr>
+        <w:pStyle w:val="p1"/>
+        <w:rPr>
+          <w:sz w:val="24"/>
+          <w:szCs w:val="24"/>
+        </w:rPr>
+      </w:pPr>
+    </w:p>
+    <w:p>
+      <w:pPr>
+        <w:pStyle w:val="p1"/>
+        <w:rPr>
+          <w:i/>
+          <w:iCs/>
+          <w:sz w:val="24"/>
+          <w:szCs w:val="24"/>
+        </w:rPr>
+      </w:pPr>
+      <w:r>
+        <w:rPr>
+          <w:i/>
+          <w:iCs/>
+          <w:sz w:val="24"/>
+          <w:szCs w:val="24"/>
+        </w:rPr>
+        <w:t>Methodology and Development</w:t>
+      </w:r>
+    </w:p>
+    <w:p>
+      <w:pPr>
+        <w:pStyle w:val="p1"/>
+        <w:rPr>
+          <w:i/>
+          <w:iCs/>
+          <w:sz w:val="24"/>
+          <w:szCs w:val="24"/>
+        </w:rPr>
+      </w:pPr>
+    </w:p>
+    <w:p>
+      <w:pPr>
+        <w:pStyle w:val="p1"/>
+        <w:rPr>
+          <w:sz w:val="24"/>
+          <w:szCs w:val="24"/>
+        </w:rPr>
+      </w:pPr>
+    </w:p>
+    <w:p>
+      <w:pPr>
+        <w:pStyle w:val="p1"/>
+        <w:rPr>
+          <w:sz w:val="24"/>
+          <w:szCs w:val="24"/>
+        </w:rPr>
+      </w:pPr>
+    </w:p>
+    <w:p>
+      <w:pPr>
+        <w:pStyle w:val="p1"/>
+        <w:rPr>
+          <w:sz w:val="24"/>
+          <w:szCs w:val="24"/>
+        </w:rPr>
+      </w:pPr>
+      <w:r>
+        <w:rPr>
+          <w:i/>
+          <w:iCs/>
+          <w:sz w:val="24"/>
+          <w:szCs w:val="24"/>
+        </w:rPr>
+        <w:t>Results and Discussion</w:t>
+      </w:r>
+    </w:p>
+    <w:p>
+      <w:pPr>
+        <w:pStyle w:val="p1"/>
+        <w:rPr>
+          <w:sz w:val="24"/>
+          <w:szCs w:val="24"/>
+        </w:rPr>
+      </w:pPr>
+      <w:r>
+        <w:rPr>
+          <w:i/>
+          <w:iCs/>
+          <w:sz w:val="24"/>
+          <w:szCs w:val="24"/>
+        </w:rPr>
+        <w:t>Conclusions</w:t>
+      </w:r>
+    </w:p>
+    <w:p>
+      <w:pPr>
+        <w:pStyle w:val="p1"/>
+        <w:rPr>
+          <w:sz w:val="24"/>
+          <w:szCs w:val="24"/>
+        </w:rPr>
+      </w:pPr>
+      <w:r>
+        <w:rPr>
+          <w:i/>
+          <w:iCs/>
+          <w:sz w:val="24"/>
+          <w:szCs w:val="24"/>
+        </w:rPr>
+        <w:t>Bibliography</w:t>
+      </w:r>
+    </w:p>
+    <w:p>
+      <w:pPr>
+        <w:jc w:val="center"/>
+        <w:rPr>
+          <w:rFonts w:cstheme="minorHAnsi"/>
+          <w:sz w:val="28"/>
+          <w:szCs w:val="28"/>
+          <w:lang w:val="en-US"/>
         </w:rPr>
       </w:pPr>
     </w:p>
@@ -668,6 +3908,425 @@
       </w:pPr>
       <w:r>
         <w:continuationSeparator/>
+      </w:r>
+    </w:p>
+  </w:footnote>
+  <w:footnote w:id="1">
+    <w:p>
+      <w:pPr>
+        <w:pStyle w:val="FootnoteText"/>
+      </w:pPr>
+      <w:r>
+        <w:rPr>
+          <w:rStyle w:val="FootnoteReference"/>
+        </w:rPr>
+        <w:footnoteRef/>
+      </w:r>
+      <w:r>
+        <w:t xml:space="preserve"> </w:t>
+      </w:r>
+      <w:hyperlink r:id="rId1" w:history="1">
+        <w:r>
+          <w:rPr>
+            <w:rStyle w:val="Hyperlink"/>
+          </w:rPr>
+          <w:t>https://www.sciencedirect.com/topics/veterinary-science-and-veterinary-medicine/transcription-factor</w:t>
+        </w:r>
+      </w:hyperlink>
+    </w:p>
+    <w:p>
+      <w:pPr>
+        <w:pStyle w:val="FootnoteText"/>
+        <w:rPr>
+          <w:lang w:val="es-ES_tradnl"/>
+        </w:rPr>
+      </w:pPr>
+    </w:p>
+  </w:footnote>
+  <w:footnote w:id="2">
+    <w:p>
+      <w:pPr>
+        <w:pStyle w:val="FootnoteText"/>
+      </w:pPr>
+      <w:r>
+        <w:rPr>
+          <w:rStyle w:val="FootnoteReference"/>
+        </w:rPr>
+        <w:footnoteRef/>
+      </w:r>
+      <w:r>
+        <w:t xml:space="preserve"> </w:t>
+      </w:r>
+      <w:r>
+        <w:t>https://academic.oup.com/bioinformatics/article/37/18/2834/6184861?login=false</w:t>
+      </w:r>
+    </w:p>
+  </w:footnote>
+  <w:footnote w:id="3">
+    <w:p>
+      <w:pPr>
+        <w:pStyle w:val="FootnoteText"/>
+      </w:pPr>
+      <w:r>
+        <w:rPr>
+          <w:rStyle w:val="FootnoteReference"/>
+        </w:rPr>
+        <w:footnoteRef/>
+      </w:r>
+      <w:r>
+        <w:t xml:space="preserve"> </w:t>
+      </w:r>
+      <w:hyperlink r:id="rId2" w:history="1">
+        <w:r>
+          <w:rPr>
+            <w:rStyle w:val="Hyperlink"/>
+          </w:rPr>
+          <w:t>https://www.mdpi.com/1424-8220/22/3/1204</w:t>
+        </w:r>
+      </w:hyperlink>
+    </w:p>
+    <w:p>
+      <w:pPr>
+        <w:pStyle w:val="FootnoteText"/>
+      </w:pPr>
+      <w:hyperlink r:id="rId3" w:history="1">
+        <w:r>
+          <w:rPr>
+            <w:rStyle w:val="Hyperlink"/>
+          </w:rPr>
+          <w:t>https://journals.plos.org/plosone/article?id=10.1371/journal.pone.0073957</w:t>
+        </w:r>
+      </w:hyperlink>
+    </w:p>
+  </w:footnote>
+  <w:footnote w:id="4">
+    <w:p>
+      <w:pPr>
+        <w:pStyle w:val="FootnoteText"/>
+        <w:rPr>
+          <w:lang w:val="es-ES_tradnl"/>
+        </w:rPr>
+      </w:pPr>
+      <w:r>
+        <w:rPr>
+          <w:rStyle w:val="FootnoteReference"/>
+        </w:rPr>
+        <w:footnoteRef/>
+      </w:r>
+      <w:r>
+        <w:t xml:space="preserve"> </w:t>
+      </w:r>
+      <w:r>
+        <w:t>https://journals.plos.org/plosone/article?id=10.1371/journal.pone.0073957</w:t>
+      </w:r>
+    </w:p>
+  </w:footnote>
+  <w:footnote w:id="5">
+    <w:p>
+      <w:pPr>
+        <w:pStyle w:val="FootnoteText"/>
+        <w:rPr>
+          <w:lang w:val="es-ES_tradnl"/>
+        </w:rPr>
+      </w:pPr>
+      <w:r>
+        <w:rPr>
+          <w:rStyle w:val="FootnoteReference"/>
+        </w:rPr>
+        <w:footnoteRef/>
+      </w:r>
+      <w:r>
+        <w:t xml:space="preserve"> </w:t>
+      </w:r>
+      <w:r>
+        <w:t>https://www.mdpi.com/1424-8220/22/3/1204</w:t>
+      </w:r>
+    </w:p>
+  </w:footnote>
+  <w:footnote w:id="6">
+    <w:p>
+      <w:pPr>
+        <w:pStyle w:val="FootnoteText"/>
+        <w:rPr>
+          <w:lang w:val="es-ES_tradnl"/>
+        </w:rPr>
+      </w:pPr>
+      <w:r>
+        <w:rPr>
+          <w:rStyle w:val="FootnoteReference"/>
+        </w:rPr>
+        <w:footnoteRef/>
+      </w:r>
+      <w:r>
+        <w:t xml:space="preserve"> </w:t>
+      </w:r>
+      <w:r>
+        <w:t>https://bio.libretexts.org/Bookshelves/Computational_Biology/Book%3A_Computational_Biology_-_Genomes_Networks_and_Evolution_(Kellis_et_al.)/17%3A_Regulatory_Motifs_Gibbs_Sampling_and_EM/17.02%3A_Introduction_to_regulatory_motifs_and_gene_regulation</w:t>
+      </w:r>
+    </w:p>
+  </w:footnote>
+  <w:footnote w:id="7">
+    <w:p>
+      <w:pPr>
+        <w:pStyle w:val="FootnoteText"/>
+        <w:rPr>
+          <w:lang w:val="es-ES_tradnl"/>
+        </w:rPr>
+      </w:pPr>
+      <w:r>
+        <w:rPr>
+          <w:rStyle w:val="FootnoteReference"/>
+        </w:rPr>
+        <w:footnoteRef/>
+      </w:r>
+      <w:r>
+        <w:t xml:space="preserve"> </w:t>
+      </w:r>
+      <w:r>
+        <w:t>https://bio.libretexts.org/Bookshelves/Computational_Biology/Book%3A_Computational_Biology_-_Genomes_Networks_and_Evolution_(Kellis_et_al.)/17%3A_Regulatory_Motifs_Gibbs_Sampling_and_EM/17.02%3A_Introduction_to_regulatory_motifs_and_gene_regulation</w:t>
+      </w:r>
+    </w:p>
+  </w:footnote>
+  <w:footnote w:id="8">
+    <w:p>
+      <w:pPr>
+        <w:pStyle w:val="FootnoteText"/>
+        <w:rPr>
+          <w:lang w:val="es-ES_tradnl"/>
+        </w:rPr>
+      </w:pPr>
+      <w:r>
+        <w:rPr>
+          <w:rStyle w:val="FootnoteReference"/>
+        </w:rPr>
+        <w:footnoteRef/>
+      </w:r>
+      <w:r>
+        <w:t xml:space="preserve"> </w:t>
+      </w:r>
+      <w:hyperlink r:id="rId4" w:tgtFrame="_blank" w:tooltip="Persistent link using digital object identifier" w:history="1">
+        <w:r>
+          <w:rPr>
+            <w:rStyle w:val="anchor-text"/>
+            <w:rFonts w:ascii="Arial" w:hAnsi="Arial" w:cs="Arial"/>
+            <w:color w:val="0000FF"/>
+            <w:sz w:val="21"/>
+            <w:szCs w:val="21"/>
+          </w:rPr>
+          <w:t>https://doi.org/10.1016/S0304-3975(03)00320-7</w:t>
+        </w:r>
+      </w:hyperlink>
+    </w:p>
+  </w:footnote>
+  <w:footnote w:id="9">
+    <w:p>
+      <w:pPr>
+        <w:pStyle w:val="FootnoteText"/>
+      </w:pPr>
+      <w:r>
+        <w:rPr>
+          <w:rStyle w:val="FootnoteReference"/>
+        </w:rPr>
+        <w:footnoteRef/>
+      </w:r>
+      <w:r>
+        <w:t xml:space="preserve"> </w:t>
+      </w:r>
+      <w:hyperlink r:id="rId5" w:history="1">
+        <w:r>
+          <w:rPr>
+            <w:rStyle w:val="Hyperlink"/>
+          </w:rPr>
+          <w:t>https://onlinelibrary.wiley.com/doi/10.1002/j.1538-7305.1948.tb01338.x</w:t>
+        </w:r>
+      </w:hyperlink>
+    </w:p>
+    <w:p>
+      <w:pPr>
+        <w:pStyle w:val="FootnoteText"/>
+        <w:rPr>
+          <w:lang w:val="es-ES_tradnl"/>
+        </w:rPr>
+      </w:pPr>
+      <w:r>
+        <w:rPr>
+          <w:lang w:val="es-ES_tradnl"/>
+        </w:rPr>
+        <w:t>https://pmc.ncbi.nlm.nih.gov/articles/PMC1538977/</w:t>
+      </w:r>
+    </w:p>
+  </w:footnote>
+  <w:footnote w:id="10">
+    <w:p>
+      <w:pPr>
+        <w:pStyle w:val="FootnoteText"/>
+        <w:rPr>
+          <w:lang w:val="es-ES_tradnl"/>
+        </w:rPr>
+      </w:pPr>
+      <w:r>
+        <w:rPr>
+          <w:rStyle w:val="FootnoteReference"/>
+        </w:rPr>
+        <w:footnoteRef/>
+      </w:r>
+      <w:r>
+        <w:t xml:space="preserve"> </w:t>
+      </w:r>
+      <w:r>
+        <w:t>https://academic.oup.com/nar/article/34/suppl_2/W369/2505578</w:t>
+      </w:r>
+    </w:p>
+  </w:footnote>
+  <w:footnote w:id="11">
+    <w:p>
+      <w:pPr>
+        <w:pStyle w:val="FootnoteText"/>
+        <w:rPr>
+          <w:lang w:val="es-ES_tradnl"/>
+        </w:rPr>
+      </w:pPr>
+      <w:r>
+        <w:rPr>
+          <w:rStyle w:val="FootnoteReference"/>
+        </w:rPr>
+        <w:footnoteRef/>
+      </w:r>
+      <w:r>
+        <w:t xml:space="preserve"> </w:t>
+      </w:r>
+      <w:r>
+        <w:rPr>
+          <w:lang w:val="es-ES_tradnl"/>
+        </w:rPr>
+        <w:t xml:space="preserve"> </w:t>
+      </w:r>
+      <w:hyperlink r:id="rId6" w:history="1">
+        <w:r>
+          <w:rPr>
+            <w:rStyle w:val="Hyperlink"/>
+            <w:lang w:val="es-ES_tradnl"/>
+          </w:rPr>
+          <w:t>https://pmc.ncbi.nlm.nih.gov/articles/PMC1538909/</w:t>
+        </w:r>
+      </w:hyperlink>
+    </w:p>
+    <w:p>
+      <w:pPr>
+        <w:pStyle w:val="FootnoteText"/>
+        <w:rPr>
+          <w:lang w:val="es-ES_tradnl"/>
+        </w:rPr>
+      </w:pPr>
+      <w:r>
+        <w:rPr>
+          <w:lang w:val="es-ES_tradnl"/>
+        </w:rPr>
+        <w:t>https://pubmed.ncbi.nlm.nih.gov/7584402/</w:t>
+      </w:r>
+    </w:p>
+    <w:p>
+      <w:pPr>
+        <w:pStyle w:val="FootnoteText"/>
+        <w:rPr>
+          <w:lang w:val="es-ES_tradnl"/>
+        </w:rPr>
+      </w:pPr>
+    </w:p>
+  </w:footnote>
+  <w:footnote w:id="12">
+    <w:p>
+      <w:pPr>
+        <w:pStyle w:val="FootnoteText"/>
+      </w:pPr>
+      <w:r>
+        <w:rPr>
+          <w:rStyle w:val="FootnoteReference"/>
+        </w:rPr>
+        <w:footnoteRef/>
+      </w:r>
+      <w:r>
+        <w:t xml:space="preserve"> </w:t>
+      </w:r>
+      <w:hyperlink r:id="rId7" w:history="1">
+        <w:r>
+          <w:rPr>
+            <w:rStyle w:val="Hyperlink"/>
+          </w:rPr>
+          <w:t>http://homer.ucsd.edu/homer/</w:t>
+        </w:r>
+      </w:hyperlink>
+    </w:p>
+    <w:p>
+      <w:pPr>
+        <w:pStyle w:val="FootnoteText"/>
+        <w:rPr>
+          <w:lang w:val="es-ES_tradnl"/>
+        </w:rPr>
+      </w:pPr>
+      <w:hyperlink r:id="rId8" w:history="1">
+        <w:r>
+          <w:rPr>
+            <w:rStyle w:val="Hyperlink"/>
+            <w:lang w:val="es-ES_tradnl"/>
+          </w:rPr>
+          <w:t>https://academic.oup.com/bioinformatics/article/37/18/2834/6184861</w:t>
+        </w:r>
+      </w:hyperlink>
+    </w:p>
+  </w:footnote>
+  <w:footnote w:id="13">
+    <w:p>
+      <w:pPr>
+        <w:pStyle w:val="FootnoteText"/>
+      </w:pPr>
+      <w:r>
+        <w:rPr>
+          <w:rStyle w:val="FootnoteReference"/>
+        </w:rPr>
+        <w:footnoteRef/>
+      </w:r>
+      <w:r>
+        <w:t xml:space="preserve"> </w:t>
+      </w:r>
+      <w:r>
+        <w:t>https://journals.plos.org/plosone/article?id=10.1371/journal.pone.0095148</w:t>
+      </w:r>
+      <w:r>
+        <w:t xml:space="preserve"> </w:t>
+      </w:r>
+    </w:p>
+    <w:p>
+      <w:pPr>
+        <w:pStyle w:val="FootnoteText"/>
+        <w:rPr>
+          <w:lang w:val="es-ES_tradnl"/>
+        </w:rPr>
+      </w:pPr>
+      <w:r>
+        <w:t>https://www.mdpi.com/1424-8220/22/3/1204</w:t>
+      </w:r>
+    </w:p>
+  </w:footnote>
+  <w:footnote w:id="14">
+    <w:p>
+      <w:pPr>
+        <w:pStyle w:val="FootnoteText"/>
+        <w:rPr>
+          <w:lang w:val="es-ES_tradnl"/>
+        </w:rPr>
+      </w:pPr>
+      <w:r>
+        <w:rPr>
+          <w:rStyle w:val="FootnoteReference"/>
+        </w:rPr>
+        <w:footnoteRef/>
+      </w:r>
+      <w:r>
+        <w:t xml:space="preserve"> </w:t>
+      </w:r>
+      <w:r>
+        <w:t>https://pmc.ncbi.nlm.nih.gov/articles/PMC1538909/</w:t>
       </w:r>
     </w:p>
   </w:footnote>
@@ -2067,7 +5726,6 @@
   <w:style w:type="character" w:default="1" w:styleId="DefaultParagraphFont">
     <w:name w:val="Default Paragraph Font"/>
     <w:uiPriority w:val="1"/>
-    <w:semiHidden/>
     <w:unhideWhenUsed/>
   </w:style>
   <w:style w:type="table" w:default="1" w:styleId="TableNormal">
@@ -2477,6 +6135,67 @@
       <w:lang w:val="en-US" w:eastAsia="ko-KR"/>
     </w:rPr>
   </w:style>
+  <w:style w:type="paragraph" w:styleId="Header">
+    <w:name w:val="header"/>
+    <w:basedOn w:val="Normal"/>
+    <w:link w:val="HeaderChar"/>
+    <w:uiPriority w:val="99"/>
+    <w:unhideWhenUsed/>
+    <w:rsid w:val="00FD3458"/>
+    <w:pPr>
+      <w:tabs>
+        <w:tab w:val="center" w:pos="4680"/>
+        <w:tab w:val="right" w:pos="9360"/>
+      </w:tabs>
+      <w:spacing w:after="0" w:line="240" w:lineRule="auto"/>
+    </w:pPr>
+  </w:style>
+  <w:style w:type="character" w:customStyle="1" w:styleId="HeaderChar">
+    <w:name w:val="Header Char"/>
+    <w:basedOn w:val="DefaultParagraphFont"/>
+    <w:link w:val="Header"/>
+    <w:uiPriority w:val="99"/>
+    <w:rsid w:val="00FD3458"/>
+  </w:style>
+  <w:style w:type="paragraph" w:styleId="Footer">
+    <w:name w:val="footer"/>
+    <w:basedOn w:val="Normal"/>
+    <w:link w:val="FooterChar"/>
+    <w:uiPriority w:val="99"/>
+    <w:unhideWhenUsed/>
+    <w:rsid w:val="00FD3458"/>
+    <w:pPr>
+      <w:tabs>
+        <w:tab w:val="center" w:pos="4680"/>
+        <w:tab w:val="right" w:pos="9360"/>
+      </w:tabs>
+      <w:spacing w:after="0" w:line="240" w:lineRule="auto"/>
+    </w:pPr>
+  </w:style>
+  <w:style w:type="character" w:customStyle="1" w:styleId="FooterChar">
+    <w:name w:val="Footer Char"/>
+    <w:basedOn w:val="DefaultParagraphFont"/>
+    <w:link w:val="Footer"/>
+    <w:uiPriority w:val="99"/>
+    <w:rsid w:val="00FD3458"/>
+  </w:style>
+  <w:style w:type="character" w:styleId="FollowedHyperlink">
+    <w:name w:val="FollowedHyperlink"/>
+    <w:basedOn w:val="DefaultParagraphFont"/>
+    <w:uiPriority w:val="99"/>
+    <w:semiHidden/>
+    <w:unhideWhenUsed/>
+    <w:rsid w:val="003209C4"/>
+    <w:rPr>
+      <w:color w:val="954F72" w:themeColor="followedHyperlink"/>
+      <w:u w:val="single"/>
+    </w:rPr>
+  </w:style>
+  <w:style w:type="character" w:customStyle="1" w:styleId="anchor-text">
+    <w:name w:val="anchor-text"/>
+    <w:basedOn w:val="DefaultParagraphFont"/>
+    <w:rsid w:val="00726B23"/>
+  </w:style>
 </w:styles>
 </file>
 

</xml_diff>

<commit_message>
writing updates, other may motif updates
</commit_message>
<xml_diff>
--- a/TFM Writing/RICSE_Thesis_cover_page.docx
+++ b/TFM Writing/RICSE_Thesis_cover_page.docx
@@ -99,7 +99,7 @@
           <w:lang w:val="en-US"/>
         </w:rPr>
         <w:drawing>
-          <wp:inline distT="0" distB="0" distL="0" distR="0" wp14:anchorId="34FDF969" wp14:editId="09EA4667">
+          <wp:inline distT="0" distB="0" distL="0" distR="0" wp14:anchorId="34FDF969" wp14:editId="5356CF92">
             <wp:extent cx="1784350" cy="431588"/>
             <wp:effectExtent l="0" t="0" r="6350" b="6985"/>
             <wp:docPr id="737212044" name="Imatge 4"/>
@@ -707,8 +707,17 @@
           <w:sz w:val="24"/>
           <w:szCs w:val="24"/>
         </w:rPr>
-        <w:t xml:space="preserve"> Sagales</w:t>
-      </w:r>
+        <w:t xml:space="preserve"> </w:t>
+      </w:r>
+      <w:proofErr w:type="spellStart"/>
+      <w:r>
+        <w:rPr>
+          <w:sz w:val="24"/>
+          <w:szCs w:val="24"/>
+        </w:rPr>
+        <w:t>Sagales</w:t>
+      </w:r>
+      <w:proofErr w:type="spellEnd"/>
       <w:r>
         <w:rPr>
           <w:sz w:val="24"/>
@@ -1795,21 +1804,21 @@
           <w:sz w:val="24"/>
           <w:szCs w:val="24"/>
         </w:rPr>
-        <w:t xml:space="preserve">In practice, the mechanism of this process is more formally known as the Central Dogma of molecular biology, in which </w:t>
-      </w:r>
-      <w:r>
-        <w:rPr>
-          <w:sz w:val="24"/>
-          <w:szCs w:val="24"/>
-        </w:rPr>
-        <w:t xml:space="preserve">DNA </w:t>
-      </w:r>
-      <w:r>
-        <w:rPr>
-          <w:sz w:val="24"/>
-          <w:szCs w:val="24"/>
-        </w:rPr>
-        <w:t xml:space="preserve">is transcribed </w:t>
+        <w:t xml:space="preserve">In practice, the mechanism of this process is more formally known as the Central Dogma of molecular biology, </w:t>
+      </w:r>
+      <w:r>
+        <w:rPr>
+          <w:sz w:val="24"/>
+          <w:szCs w:val="24"/>
+        </w:rPr>
+        <w:t xml:space="preserve">where </w:t>
+      </w:r>
+      <w:r>
+        <w:rPr>
+          <w:sz w:val="24"/>
+          <w:szCs w:val="24"/>
+        </w:rPr>
+        <w:t xml:space="preserve">DNA is transcribed </w:t>
       </w:r>
       <w:r>
         <w:rPr>
@@ -1823,21 +1832,42 @@
           <w:sz w:val="24"/>
           <w:szCs w:val="24"/>
         </w:rPr>
-        <w:t xml:space="preserve">into RNA, which </w:t>
-      </w:r>
-      <w:r>
-        <w:rPr>
-          <w:sz w:val="24"/>
-          <w:szCs w:val="24"/>
-        </w:rPr>
-        <w:t xml:space="preserve">in turn </w:t>
-      </w:r>
-      <w:r>
-        <w:rPr>
-          <w:sz w:val="24"/>
-          <w:szCs w:val="24"/>
-        </w:rPr>
-        <w:t xml:space="preserve">results in </w:t>
+        <w:t xml:space="preserve">into </w:t>
+      </w:r>
+      <w:r>
+        <w:rPr>
+          <w:sz w:val="24"/>
+          <w:szCs w:val="24"/>
+        </w:rPr>
+        <w:t xml:space="preserve">messenger </w:t>
+      </w:r>
+      <w:r>
+        <w:rPr>
+          <w:sz w:val="24"/>
+          <w:szCs w:val="24"/>
+        </w:rPr>
+        <w:t xml:space="preserve">RNA, which in turn </w:t>
+      </w:r>
+      <w:r>
+        <w:rPr>
+          <w:sz w:val="24"/>
+          <w:szCs w:val="24"/>
+        </w:rPr>
+        <w:t xml:space="preserve">is translated </w:t>
+      </w:r>
+      <w:r>
+        <w:rPr>
+          <w:sz w:val="24"/>
+          <w:szCs w:val="24"/>
+        </w:rPr>
+        <w:t>in</w:t>
+      </w:r>
+      <w:r>
+        <w:rPr>
+          <w:sz w:val="24"/>
+          <w:szCs w:val="24"/>
+        </w:rPr>
+        <w:t xml:space="preserve">to </w:t>
       </w:r>
       <w:r>
         <w:rPr>
@@ -1881,21 +1911,23 @@
     <w:p>
       <w:pPr>
         <w:pStyle w:val="p1"/>
-        <w:rPr>
-          <w:sz w:val="24"/>
-          <w:szCs w:val="24"/>
-        </w:rPr>
-      </w:pPr>
-      <w:r>
-        <w:rPr>
+        <w:jc w:val="center"/>
+        <w:rPr>
+          <w:sz w:val="24"/>
+          <w:szCs w:val="24"/>
+        </w:rPr>
+      </w:pPr>
+      <w:r>
+        <w:rPr>
+          <w:noProof/>
           <w:sz w:val="24"/>
           <w:szCs w:val="24"/>
         </w:rPr>
         <w:drawing>
-          <wp:inline distT="0" distB="0" distL="0" distR="0" wp14:anchorId="2468F5A8" wp14:editId="61E82AF3">
-            <wp:extent cx="4041702" cy="2245179"/>
-            <wp:effectExtent l="0" t="0" r="0" b="3175"/>
-            <wp:docPr id="1099888710" name="Picture 1" descr="A diagram of a dna strand&#10;&#10;AI-generated content may be incorrect."/>
+          <wp:inline distT="0" distB="0" distL="0" distR="0" wp14:anchorId="58701D50" wp14:editId="12E9E35E">
+            <wp:extent cx="2210887" cy="1997702"/>
+            <wp:effectExtent l="0" t="0" r="0" b="0"/>
+            <wp:docPr id="32437203" name="Picture 1" descr="A diagram of a dna sequence&#10;&#10;AI-generated content may be incorrect."/>
             <wp:cNvGraphicFramePr>
               <a:graphicFrameLocks xmlns:a="http://schemas.openxmlformats.org/drawingml/2006/main" noChangeAspect="1"/>
             </wp:cNvGraphicFramePr>
@@ -1903,7 +1935,7 @@
               <a:graphicData uri="http://schemas.openxmlformats.org/drawingml/2006/picture">
                 <pic:pic xmlns:pic="http://schemas.openxmlformats.org/drawingml/2006/picture">
                   <pic:nvPicPr>
-                    <pic:cNvPr id="1099888710" name="Picture 1" descr="A diagram of a dna strand&#10;&#10;AI-generated content may be incorrect."/>
+                    <pic:cNvPr id="32437203" name="Picture 1" descr="A diagram of a dna sequence&#10;&#10;AI-generated content may be incorrect."/>
                     <pic:cNvPicPr/>
                   </pic:nvPicPr>
                   <pic:blipFill>
@@ -1915,7 +1947,7 @@
                   <pic:spPr>
                     <a:xfrm>
                       <a:off x="0" y="0"/>
-                      <a:ext cx="4069659" cy="2260709"/>
+                      <a:ext cx="2225185" cy="2010621"/>
                     </a:xfrm>
                     <a:prstGeom prst="rect">
                       <a:avLst/>
@@ -1927,1235 +1959,1583 @@
           </wp:inline>
         </w:drawing>
       </w:r>
-      <w:r>
-        <w:rPr>
-          <w:sz w:val="24"/>
-          <w:szCs w:val="24"/>
-        </w:rPr>
-        <w:t xml:space="preserve">  image</w:t>
-      </w:r>
-      <w:r>
-        <w:rPr>
-          <w:rStyle w:val="FootnoteReference"/>
-          <w:sz w:val="24"/>
-          <w:szCs w:val="24"/>
-        </w:rPr>
-        <w:footnoteReference w:id="3"/>
-      </w:r>
     </w:p>
     <w:p>
       <w:pPr>
         <w:pStyle w:val="p1"/>
-        <w:rPr>
-          <w:sz w:val="24"/>
-          <w:szCs w:val="24"/>
-        </w:rPr>
-      </w:pPr>
-    </w:p>
-    <w:p>
-      <w:pPr>
-        <w:pStyle w:val="p1"/>
-        <w:rPr>
-          <w:sz w:val="24"/>
-          <w:szCs w:val="24"/>
-        </w:rPr>
-      </w:pPr>
-      <w:r>
-        <w:rPr>
-          <w:sz w:val="24"/>
-          <w:szCs w:val="24"/>
-        </w:rPr>
-        <w:t xml:space="preserve">Therefore, understanding where TFs are active or potentially active in the genome is a crucial component of understanding how gene expression is encoded. </w:t>
-      </w:r>
-      <w:r>
-        <w:rPr>
-          <w:sz w:val="24"/>
-          <w:szCs w:val="24"/>
-        </w:rPr>
-        <w:t>T</w:t>
-      </w:r>
-      <w:r>
-        <w:rPr>
-          <w:sz w:val="24"/>
-          <w:szCs w:val="24"/>
-        </w:rPr>
-        <w:t xml:space="preserve">ranscription factor activity </w:t>
-      </w:r>
-      <w:r>
-        <w:rPr>
-          <w:sz w:val="24"/>
-          <w:szCs w:val="24"/>
-        </w:rPr>
-        <w:t xml:space="preserve">is triggered by </w:t>
-      </w:r>
-      <w:r>
-        <w:rPr>
-          <w:sz w:val="24"/>
-          <w:szCs w:val="24"/>
-        </w:rPr>
-        <w:t xml:space="preserve">a region of DNA </w:t>
-      </w:r>
-      <w:r>
-        <w:rPr>
-          <w:sz w:val="24"/>
-          <w:szCs w:val="24"/>
-        </w:rPr>
-        <w:t xml:space="preserve">physically </w:t>
-      </w:r>
-      <w:r>
-        <w:rPr>
-          <w:sz w:val="24"/>
-          <w:szCs w:val="24"/>
-        </w:rPr>
-        <w:t xml:space="preserve">adjacent </w:t>
-      </w:r>
-      <w:r>
-        <w:rPr>
-          <w:sz w:val="24"/>
-          <w:szCs w:val="24"/>
-        </w:rPr>
-        <w:t xml:space="preserve">to the </w:t>
-      </w:r>
-      <w:r>
-        <w:rPr>
-          <w:sz w:val="24"/>
-          <w:szCs w:val="24"/>
-        </w:rPr>
-        <w:t xml:space="preserve">encoding </w:t>
-      </w:r>
-      <w:r>
-        <w:rPr>
-          <w:sz w:val="24"/>
-          <w:szCs w:val="24"/>
-        </w:rPr>
-        <w:t>gene</w:t>
-      </w:r>
-      <w:r>
-        <w:rPr>
-          <w:sz w:val="24"/>
-          <w:szCs w:val="24"/>
-        </w:rPr>
-        <w:t>;</w:t>
-      </w:r>
-      <w:r>
-        <w:rPr>
-          <w:sz w:val="24"/>
-          <w:szCs w:val="24"/>
-        </w:rPr>
-        <w:t xml:space="preserve"> these regions of </w:t>
-      </w:r>
-      <w:r>
-        <w:rPr>
-          <w:sz w:val="24"/>
-          <w:szCs w:val="24"/>
-        </w:rPr>
-        <w:t>conserved DNA patterns</w:t>
-      </w:r>
-      <w:r>
-        <w:rPr>
-          <w:sz w:val="24"/>
-          <w:szCs w:val="24"/>
-        </w:rPr>
-        <w:t xml:space="preserve"> </w:t>
-      </w:r>
-      <w:r>
-        <w:rPr>
-          <w:sz w:val="24"/>
-          <w:szCs w:val="24"/>
-        </w:rPr>
-        <w:t xml:space="preserve">are </w:t>
-      </w:r>
-      <w:r>
-        <w:rPr>
-          <w:sz w:val="24"/>
-          <w:szCs w:val="24"/>
-        </w:rPr>
-        <w:t xml:space="preserve">known as </w:t>
-      </w:r>
-      <w:r>
+        <w:jc w:val="center"/>
         <w:rPr>
           <w:i/>
           <w:iCs/>
-          <w:sz w:val="24"/>
-          <w:szCs w:val="24"/>
-        </w:rPr>
-        <w:t>motifs</w:t>
-      </w:r>
-      <w:r>
-        <w:rPr>
-          <w:sz w:val="24"/>
-          <w:szCs w:val="24"/>
-        </w:rPr>
-        <w:t>.</w:t>
-      </w:r>
-    </w:p>
-    <w:p>
-      <w:pPr>
-        <w:pStyle w:val="p1"/>
-        <w:rPr>
-          <w:sz w:val="24"/>
-          <w:szCs w:val="24"/>
-        </w:rPr>
-      </w:pPr>
-    </w:p>
-    <w:p>
-      <w:pPr>
-        <w:pStyle w:val="p1"/>
-        <w:rPr>
-          <w:sz w:val="24"/>
-          <w:szCs w:val="24"/>
-        </w:rPr>
-      </w:pPr>
-      <w:r>
-        <w:rPr>
-          <w:sz w:val="24"/>
-          <w:szCs w:val="24"/>
-        </w:rPr>
-        <w:t>Motif d</w:t>
-      </w:r>
-      <w:r>
-        <w:rPr>
-          <w:sz w:val="24"/>
-          <w:szCs w:val="24"/>
-        </w:rPr>
-        <w:t xml:space="preserve">iscovery is highly motivated by numerous </w:t>
-      </w:r>
-      <w:r>
-        <w:rPr>
-          <w:sz w:val="24"/>
-          <w:szCs w:val="24"/>
-        </w:rPr>
-        <w:t xml:space="preserve">practical </w:t>
-      </w:r>
-      <w:r>
-        <w:rPr>
-          <w:sz w:val="24"/>
-          <w:szCs w:val="24"/>
-        </w:rPr>
-        <w:t>applications such as diagnosing and treating chronic genetic disease</w:t>
-      </w:r>
-      <w:r>
-        <w:rPr>
-          <w:sz w:val="24"/>
-          <w:szCs w:val="24"/>
-        </w:rPr>
-        <w:t>s</w:t>
-      </w:r>
-      <w:r>
-        <w:rPr>
-          <w:sz w:val="24"/>
-          <w:szCs w:val="24"/>
-        </w:rPr>
-        <w:t>, targeted drug design, and toxicity prediction of peptides and proteins.</w:t>
-      </w:r>
-      <w:r>
-        <w:rPr>
-          <w:rStyle w:val="FootnoteReference"/>
-          <w:sz w:val="24"/>
-          <w:szCs w:val="24"/>
-        </w:rPr>
-        <w:footnoteReference w:id="4"/>
-      </w:r>
-      <w:r>
-        <w:rPr>
-          <w:sz w:val="24"/>
-          <w:szCs w:val="24"/>
-        </w:rPr>
-        <w:t xml:space="preserve"> </w:t>
-      </w:r>
-      <w:r>
-        <w:rPr>
-          <w:sz w:val="24"/>
-          <w:szCs w:val="24"/>
-        </w:rPr>
-        <w:t>On a grander scale, identifying motifs is a key component for computational modeling of transcriptional regulatory networks (TRNs), where multiple TFs and their target genes interact to modulate phenotypes and cell behaviors systematically within an organism. Bioinformatics aims to detect high-quality motifs to enable better understanding of the physical interaction between a multitude of TFs, discovering new previously unknown targets, which in turn informs better models of cell states as a function of their genetic code.</w:t>
-      </w:r>
-      <w:r>
-        <w:rPr>
-          <w:rStyle w:val="FootnoteReference"/>
-          <w:sz w:val="24"/>
-          <w:szCs w:val="24"/>
-        </w:rPr>
-        <w:footnoteReference w:id="5"/>
-      </w:r>
-    </w:p>
-    <w:p>
-      <w:pPr>
-        <w:pStyle w:val="p1"/>
-        <w:rPr>
-          <w:sz w:val="24"/>
-          <w:szCs w:val="24"/>
-        </w:rPr>
-      </w:pPr>
-    </w:p>
-    <w:p>
-      <w:pPr>
-        <w:pStyle w:val="p1"/>
-        <w:rPr>
-          <w:sz w:val="24"/>
-          <w:szCs w:val="24"/>
-        </w:rPr>
-      </w:pPr>
-    </w:p>
-    <w:p>
-      <w:pPr>
-        <w:pStyle w:val="p1"/>
-        <w:rPr>
-          <w:sz w:val="24"/>
-          <w:szCs w:val="24"/>
-        </w:rPr>
-      </w:pPr>
-      <w:r>
-        <w:rPr>
-          <w:sz w:val="24"/>
-          <w:szCs w:val="24"/>
-        </w:rPr>
-        <w:t>While</w:t>
-      </w:r>
-      <w:r>
-        <w:rPr>
-          <w:sz w:val="24"/>
-          <w:szCs w:val="24"/>
-        </w:rPr>
-        <w:t xml:space="preserve"> </w:t>
-      </w:r>
-      <w:r>
-        <w:rPr>
-          <w:sz w:val="24"/>
-          <w:szCs w:val="24"/>
-        </w:rPr>
-        <w:t>motif</w:t>
-      </w:r>
-      <w:r>
-        <w:rPr>
-          <w:sz w:val="24"/>
-          <w:szCs w:val="24"/>
-        </w:rPr>
-        <w:t xml:space="preserve"> discovery </w:t>
-      </w:r>
-      <w:r>
-        <w:rPr>
-          <w:sz w:val="24"/>
-          <w:szCs w:val="24"/>
-        </w:rPr>
-        <w:t xml:space="preserve">is a </w:t>
-      </w:r>
-      <w:proofErr w:type="gramStart"/>
-      <w:r>
-        <w:rPr>
-          <w:sz w:val="24"/>
-          <w:szCs w:val="24"/>
-        </w:rPr>
-        <w:t>highly-motivated</w:t>
-      </w:r>
-      <w:proofErr w:type="gramEnd"/>
-      <w:r>
-        <w:rPr>
-          <w:sz w:val="24"/>
-          <w:szCs w:val="24"/>
-        </w:rPr>
-        <w:t xml:space="preserve"> </w:t>
-      </w:r>
-      <w:r>
-        <w:rPr>
-          <w:sz w:val="24"/>
-          <w:szCs w:val="24"/>
-        </w:rPr>
-        <w:t xml:space="preserve">investigation in </w:t>
-      </w:r>
-      <w:r>
-        <w:rPr>
-          <w:sz w:val="24"/>
-          <w:szCs w:val="24"/>
-        </w:rPr>
-        <w:t>bioinformatics</w:t>
-      </w:r>
-      <w:r>
-        <w:rPr>
-          <w:sz w:val="24"/>
-          <w:szCs w:val="24"/>
-        </w:rPr>
-        <w:t xml:space="preserve">, </w:t>
-      </w:r>
-      <w:r>
-        <w:rPr>
-          <w:sz w:val="24"/>
-          <w:szCs w:val="24"/>
-        </w:rPr>
-        <w:t xml:space="preserve">the setting is </w:t>
-      </w:r>
-      <w:r>
-        <w:rPr>
-          <w:sz w:val="24"/>
-          <w:szCs w:val="24"/>
-        </w:rPr>
-        <w:t xml:space="preserve">inherently noisy </w:t>
-      </w:r>
-      <w:r>
-        <w:rPr>
-          <w:sz w:val="24"/>
-          <w:szCs w:val="24"/>
-        </w:rPr>
-        <w:t xml:space="preserve">as </w:t>
-      </w:r>
-      <w:r>
-        <w:rPr>
-          <w:sz w:val="24"/>
-          <w:szCs w:val="24"/>
-        </w:rPr>
-        <w:t>regulatory TFs tolerate variability in the sequences comprising the motifs.</w:t>
-      </w:r>
-      <w:r>
-        <w:rPr>
-          <w:rStyle w:val="FootnoteReference"/>
-          <w:sz w:val="24"/>
-          <w:szCs w:val="24"/>
-        </w:rPr>
-        <w:footnoteReference w:id="6"/>
-      </w:r>
-      <w:r>
-        <w:rPr>
-          <w:sz w:val="24"/>
-          <w:szCs w:val="24"/>
-        </w:rPr>
-        <w:t xml:space="preserve"> </w:t>
-      </w:r>
-      <w:r>
-        <w:rPr>
-          <w:sz w:val="24"/>
-          <w:szCs w:val="24"/>
-        </w:rPr>
-        <w:t>In other words, TFs are not strictly discriminative in the specific nucleotide sequence that they bind to</w:t>
-      </w:r>
-      <w:r>
-        <w:rPr>
-          <w:sz w:val="24"/>
-          <w:szCs w:val="24"/>
-        </w:rPr>
-        <w:t xml:space="preserve">. </w:t>
-      </w:r>
-    </w:p>
-    <w:p>
-      <w:pPr>
-        <w:pStyle w:val="p1"/>
-        <w:rPr>
-          <w:sz w:val="24"/>
-          <w:szCs w:val="24"/>
-        </w:rPr>
-      </w:pPr>
-    </w:p>
-    <w:p>
-      <w:pPr>
-        <w:pStyle w:val="p1"/>
-        <w:rPr>
-          <w:sz w:val="24"/>
-          <w:szCs w:val="24"/>
-        </w:rPr>
-      </w:pPr>
-      <w:r>
-        <w:rPr>
-          <w:sz w:val="24"/>
-          <w:szCs w:val="24"/>
-        </w:rPr>
-        <w:t>T</w:t>
-      </w:r>
-      <w:r>
-        <w:rPr>
-          <w:sz w:val="24"/>
-          <w:szCs w:val="24"/>
-        </w:rPr>
-        <w:t>he biological context offers inherent challenges.</w:t>
-      </w:r>
-      <w:r>
-        <w:rPr>
-          <w:rStyle w:val="FootnoteReference"/>
-          <w:sz w:val="24"/>
-          <w:szCs w:val="24"/>
-        </w:rPr>
-        <w:footnoteReference w:id="7"/>
-      </w:r>
-      <w:r>
-        <w:rPr>
-          <w:sz w:val="24"/>
-          <w:szCs w:val="24"/>
-        </w:rPr>
-        <w:t xml:space="preserve"> Firstly, motifs can be </w:t>
-      </w:r>
+          <w:sz w:val="20"/>
+          <w:szCs w:val="20"/>
+        </w:rPr>
+      </w:pPr>
       <w:r>
         <w:rPr>
           <w:i/>
           <w:iCs/>
-          <w:sz w:val="24"/>
-          <w:szCs w:val="24"/>
-        </w:rPr>
-        <w:t>degenerate</w:t>
-      </w:r>
-      <w:r>
-        <w:rPr>
-          <w:sz w:val="24"/>
-          <w:szCs w:val="24"/>
-        </w:rPr>
-        <w:t>, where only a few nucleotides within the motif are relevant to its function.</w:t>
-      </w:r>
-      <w:r>
-        <w:rPr>
-          <w:rStyle w:val="FootnoteReference"/>
-          <w:sz w:val="24"/>
-          <w:szCs w:val="24"/>
-        </w:rPr>
-        <w:footnoteReference w:id="8"/>
-      </w:r>
-      <w:r>
-        <w:rPr>
-          <w:sz w:val="24"/>
-          <w:szCs w:val="24"/>
-        </w:rPr>
-        <w:t xml:space="preserve"> This means </w:t>
-      </w:r>
-      <w:r>
-        <w:rPr>
-          <w:sz w:val="24"/>
-          <w:szCs w:val="24"/>
-        </w:rPr>
-        <w:t>TFs</w:t>
-      </w:r>
-      <w:r>
-        <w:rPr>
-          <w:sz w:val="24"/>
-          <w:szCs w:val="24"/>
-        </w:rPr>
-        <w:t xml:space="preserve"> do not strictly discriminate for a specific, universally consistent and stable sequence of nucleotides: due to natural evolutionary mutations, TFs can still bind to sequences that look “similar enough,” and this allowance for variation introduces an inherent baseline level of noise and uncertainty during the process of discovery. Moreover, </w:t>
+          <w:sz w:val="20"/>
+          <w:szCs w:val="20"/>
+        </w:rPr>
+        <w:t>Figure 1. A simplified diagram of the Central Dogma of molecular biology.</w:t>
       </w:r>
       <w:r>
         <w:rPr>
           <w:i/>
           <w:iCs/>
-          <w:sz w:val="24"/>
-          <w:szCs w:val="24"/>
-        </w:rPr>
-        <w:t>de novo</w:t>
-      </w:r>
-      <w:r>
-        <w:rPr>
-          <w:sz w:val="24"/>
-          <w:szCs w:val="24"/>
-        </w:rPr>
-        <w:t xml:space="preserve"> motif discovery – the process of finding motifs without prior sequence alignment – is further stymied by the fact that a motif’s location relative to its corresponding gene is unfixed. The motif can be either upstream or downstream, and the distance between the motif and the gene varies widely.</w:t>
-      </w:r>
-      <w:r>
-        <w:rPr>
-          <w:rStyle w:val="FootnoteReference"/>
-          <w:sz w:val="24"/>
-          <w:szCs w:val="24"/>
-        </w:rPr>
-        <w:footnoteReference w:id="9"/>
-      </w:r>
-      <w:r>
-        <w:rPr>
-          <w:sz w:val="24"/>
-          <w:szCs w:val="24"/>
-        </w:rPr>
-        <w:t xml:space="preserve"> Therefore, motif discovery can be considered a common approximate substring (CAS) problem, which is defined as NP-hard.</w:t>
-      </w:r>
-      <w:r>
-        <w:rPr>
-          <w:rStyle w:val="FootnoteReference"/>
-          <w:sz w:val="24"/>
-          <w:szCs w:val="24"/>
-        </w:rPr>
-        <w:footnoteReference w:id="10"/>
-      </w:r>
-      <w:r>
-        <w:rPr>
-          <w:sz w:val="24"/>
-          <w:szCs w:val="24"/>
-        </w:rPr>
-        <w:t xml:space="preserve"> </w:t>
-      </w:r>
-    </w:p>
-    <w:p>
-      <w:pPr>
-        <w:pStyle w:val="p1"/>
-        <w:rPr>
-          <w:sz w:val="24"/>
-          <w:szCs w:val="24"/>
-        </w:rPr>
-      </w:pPr>
-    </w:p>
-    <w:p>
-      <w:pPr>
-        <w:pStyle w:val="p1"/>
-        <w:rPr>
-          <w:sz w:val="24"/>
-          <w:szCs w:val="24"/>
-        </w:rPr>
-      </w:pPr>
-      <w:r>
-        <w:rPr>
-          <w:sz w:val="24"/>
-          <w:szCs w:val="24"/>
-        </w:rPr>
-        <w:t xml:space="preserve">Classical approaches to motif discovery include </w:t>
-      </w:r>
-      <w:proofErr w:type="spellStart"/>
-      <w:r>
-        <w:rPr>
-          <w:sz w:val="24"/>
-          <w:szCs w:val="24"/>
-          <w:lang w:val="es-ES"/>
-        </w:rPr>
-        <w:t>ChIP-Seq</w:t>
-      </w:r>
-      <w:proofErr w:type="spellEnd"/>
-      <w:r>
-        <w:rPr>
-          <w:sz w:val="24"/>
-          <w:szCs w:val="24"/>
-          <w:lang w:val="es-ES"/>
-        </w:rPr>
-        <w:t xml:space="preserve"> (</w:t>
-      </w:r>
-      <w:proofErr w:type="spellStart"/>
-      <w:r>
-        <w:rPr>
-          <w:sz w:val="24"/>
-          <w:szCs w:val="24"/>
-          <w:lang w:val="es-ES"/>
-        </w:rPr>
-        <w:t>Chromatin</w:t>
-      </w:r>
-      <w:proofErr w:type="spellEnd"/>
-      <w:r>
-        <w:rPr>
-          <w:sz w:val="24"/>
-          <w:szCs w:val="24"/>
-          <w:lang w:val="es-ES"/>
-        </w:rPr>
-        <w:t xml:space="preserve"> </w:t>
-      </w:r>
-      <w:proofErr w:type="spellStart"/>
-      <w:r>
-        <w:rPr>
-          <w:sz w:val="24"/>
-          <w:szCs w:val="24"/>
-          <w:lang w:val="es-ES"/>
-        </w:rPr>
-        <w:t>Immunoprecipitation</w:t>
-      </w:r>
-      <w:proofErr w:type="spellEnd"/>
-      <w:r>
-        <w:rPr>
-          <w:sz w:val="24"/>
-          <w:szCs w:val="24"/>
-          <w:lang w:val="es-ES"/>
-        </w:rPr>
-        <w:t xml:space="preserve"> </w:t>
-      </w:r>
-      <w:proofErr w:type="spellStart"/>
-      <w:r>
-        <w:rPr>
-          <w:sz w:val="24"/>
-          <w:szCs w:val="24"/>
-          <w:lang w:val="es-ES"/>
-        </w:rPr>
-        <w:t>Sequencing</w:t>
-      </w:r>
-      <w:proofErr w:type="spellEnd"/>
-      <w:r>
-        <w:rPr>
-          <w:sz w:val="24"/>
-          <w:szCs w:val="24"/>
-          <w:lang w:val="es-ES"/>
-        </w:rPr>
-        <w:t>)</w:t>
-      </w:r>
-      <w:r>
-        <w:rPr>
-          <w:sz w:val="24"/>
-          <w:szCs w:val="24"/>
-          <w:lang w:val="es-ES"/>
-        </w:rPr>
-        <w:t xml:space="preserve"> and </w:t>
-      </w:r>
-      <w:r>
-        <w:rPr>
-          <w:sz w:val="24"/>
-          <w:szCs w:val="24"/>
-          <w:lang w:val="es-ES"/>
-        </w:rPr>
-        <w:t>RNA-</w:t>
-      </w:r>
-      <w:proofErr w:type="spellStart"/>
-      <w:r>
-        <w:rPr>
-          <w:sz w:val="24"/>
-          <w:szCs w:val="24"/>
-          <w:lang w:val="es-ES"/>
-        </w:rPr>
-        <w:t>Seq</w:t>
-      </w:r>
-      <w:proofErr w:type="spellEnd"/>
-      <w:r>
-        <w:rPr>
-          <w:sz w:val="24"/>
-          <w:szCs w:val="24"/>
-          <w:lang w:val="es-ES"/>
-        </w:rPr>
-        <w:t>.</w:t>
-      </w:r>
-      <w:r>
-        <w:rPr>
-          <w:rStyle w:val="FootnoteReference"/>
-          <w:sz w:val="24"/>
-          <w:szCs w:val="24"/>
-          <w:lang w:val="es-ES"/>
-        </w:rPr>
-        <w:footnoteReference w:id="11"/>
-      </w:r>
-      <w:r>
-        <w:rPr>
-          <w:sz w:val="24"/>
-          <w:szCs w:val="24"/>
-          <w:lang w:val="es-ES"/>
-        </w:rPr>
-        <w:t xml:space="preserve"> In </w:t>
-      </w:r>
-      <w:proofErr w:type="spellStart"/>
-      <w:r>
-        <w:rPr>
-          <w:sz w:val="24"/>
-          <w:szCs w:val="24"/>
-          <w:lang w:val="es-ES"/>
-        </w:rPr>
-        <w:t>these</w:t>
-      </w:r>
-      <w:proofErr w:type="spellEnd"/>
-      <w:r>
-        <w:rPr>
-          <w:sz w:val="24"/>
-          <w:szCs w:val="24"/>
-          <w:lang w:val="es-ES"/>
-        </w:rPr>
-        <w:t xml:space="preserve"> </w:t>
-      </w:r>
-      <w:proofErr w:type="spellStart"/>
-      <w:r>
-        <w:rPr>
-          <w:sz w:val="24"/>
-          <w:szCs w:val="24"/>
-          <w:lang w:val="es-ES"/>
-        </w:rPr>
-        <w:t>wet-lab</w:t>
-      </w:r>
-      <w:proofErr w:type="spellEnd"/>
-      <w:r>
-        <w:rPr>
-          <w:sz w:val="24"/>
-          <w:szCs w:val="24"/>
-          <w:lang w:val="es-ES"/>
-        </w:rPr>
-        <w:t xml:space="preserve"> </w:t>
-      </w:r>
-      <w:proofErr w:type="spellStart"/>
-      <w:r>
-        <w:rPr>
-          <w:sz w:val="24"/>
-          <w:szCs w:val="24"/>
-          <w:lang w:val="es-ES"/>
-        </w:rPr>
-        <w:t>approaches</w:t>
-      </w:r>
-      <w:proofErr w:type="spellEnd"/>
-      <w:r>
-        <w:rPr>
-          <w:sz w:val="24"/>
-          <w:szCs w:val="24"/>
-          <w:lang w:val="es-ES"/>
-        </w:rPr>
-        <w:t xml:space="preserve">, </w:t>
-      </w:r>
-      <w:proofErr w:type="spellStart"/>
-      <w:r>
-        <w:rPr>
-          <w:sz w:val="24"/>
-          <w:szCs w:val="24"/>
-          <w:lang w:val="es-ES"/>
-        </w:rPr>
-        <w:t>biologists</w:t>
-      </w:r>
-      <w:proofErr w:type="spellEnd"/>
-      <w:r>
-        <w:rPr>
-          <w:sz w:val="24"/>
-          <w:szCs w:val="24"/>
-          <w:lang w:val="es-ES"/>
-        </w:rPr>
-        <w:t xml:space="preserve"> </w:t>
-      </w:r>
-      <w:proofErr w:type="spellStart"/>
-      <w:r>
-        <w:rPr>
-          <w:sz w:val="24"/>
-          <w:szCs w:val="24"/>
-          <w:lang w:val="es-ES"/>
-        </w:rPr>
-        <w:t>grow</w:t>
-      </w:r>
-      <w:proofErr w:type="spellEnd"/>
-      <w:r>
-        <w:rPr>
-          <w:sz w:val="24"/>
-          <w:szCs w:val="24"/>
-          <w:lang w:val="es-ES"/>
-        </w:rPr>
-        <w:t xml:space="preserve"> </w:t>
-      </w:r>
-      <w:proofErr w:type="spellStart"/>
-      <w:r>
-        <w:rPr>
-          <w:sz w:val="24"/>
-          <w:szCs w:val="24"/>
-          <w:lang w:val="es-ES"/>
-        </w:rPr>
-        <w:t>an</w:t>
-      </w:r>
-      <w:proofErr w:type="spellEnd"/>
-      <w:r>
-        <w:rPr>
-          <w:sz w:val="24"/>
-          <w:szCs w:val="24"/>
-          <w:lang w:val="es-ES"/>
-        </w:rPr>
-        <w:t xml:space="preserve"> </w:t>
-      </w:r>
-      <w:r>
-        <w:rPr>
-          <w:sz w:val="24"/>
-          <w:szCs w:val="24"/>
-        </w:rPr>
-        <w:t xml:space="preserve">organism </w:t>
-      </w:r>
-      <w:r>
-        <w:rPr>
-          <w:sz w:val="24"/>
-          <w:szCs w:val="24"/>
-        </w:rPr>
-        <w:t xml:space="preserve">of interest </w:t>
-      </w:r>
-      <w:r>
-        <w:rPr>
-          <w:sz w:val="24"/>
-          <w:szCs w:val="24"/>
-        </w:rPr>
-        <w:t>in a petri dish</w:t>
-      </w:r>
-      <w:r>
-        <w:rPr>
-          <w:sz w:val="24"/>
-          <w:szCs w:val="24"/>
-        </w:rPr>
-        <w:t xml:space="preserve">. In </w:t>
-      </w:r>
-      <w:proofErr w:type="spellStart"/>
-      <w:r>
-        <w:rPr>
-          <w:sz w:val="24"/>
-          <w:szCs w:val="24"/>
-        </w:rPr>
-        <w:t>ChIP</w:t>
-      </w:r>
-      <w:proofErr w:type="spellEnd"/>
-      <w:r>
-        <w:rPr>
-          <w:sz w:val="24"/>
-          <w:szCs w:val="24"/>
-        </w:rPr>
-        <w:t>-Seq, the transcription factor of interest is bound to the DNA, after which the specific portions of DNA that are attached to the TF are analyzed to report on the sequences comprising the motif. However, these approaches are low-throughput and costly as they require a wet lab, and crucially</w:t>
-      </w:r>
-      <w:r>
-        <w:rPr>
-          <w:sz w:val="24"/>
-          <w:szCs w:val="24"/>
-        </w:rPr>
-        <w:t>, are limited as the results for each wet-lab experiment are specific to one genome only</w:t>
-      </w:r>
-      <w:r>
-        <w:rPr>
-          <w:sz w:val="24"/>
-          <w:szCs w:val="24"/>
-        </w:rPr>
-        <w:t xml:space="preserve">, </w:t>
-      </w:r>
-      <w:r>
-        <w:rPr>
-          <w:sz w:val="24"/>
-          <w:szCs w:val="24"/>
-        </w:rPr>
-        <w:t xml:space="preserve">meaning that </w:t>
-      </w:r>
-      <w:r>
-        <w:rPr>
-          <w:sz w:val="24"/>
-          <w:szCs w:val="24"/>
-        </w:rPr>
-        <w:t xml:space="preserve">the task of </w:t>
-      </w:r>
-      <w:r>
-        <w:rPr>
-          <w:sz w:val="24"/>
-          <w:szCs w:val="24"/>
-        </w:rPr>
-        <w:t xml:space="preserve">distinguishing true functional motifs from random </w:t>
-      </w:r>
-      <w:r>
-        <w:rPr>
-          <w:sz w:val="24"/>
-          <w:szCs w:val="24"/>
-        </w:rPr>
-        <w:t xml:space="preserve">variations due to </w:t>
-      </w:r>
-      <w:r>
-        <w:rPr>
-          <w:sz w:val="24"/>
-          <w:szCs w:val="24"/>
-        </w:rPr>
-        <w:t xml:space="preserve">background mutations is stymied by </w:t>
-      </w:r>
-      <w:r>
-        <w:rPr>
-          <w:sz w:val="24"/>
-          <w:szCs w:val="24"/>
-        </w:rPr>
-        <w:t>poor statistical power and high false positive rates.</w:t>
-      </w:r>
-      <w:r>
-        <w:rPr>
-          <w:rStyle w:val="FootnoteReference"/>
-          <w:sz w:val="24"/>
-          <w:szCs w:val="24"/>
-        </w:rPr>
-        <w:footnoteReference w:id="12"/>
-      </w:r>
-    </w:p>
-    <w:p>
-      <w:pPr>
-        <w:pStyle w:val="p1"/>
-        <w:rPr>
-          <w:sz w:val="24"/>
-          <w:szCs w:val="24"/>
-        </w:rPr>
-      </w:pPr>
-    </w:p>
-    <w:p>
-      <w:pPr>
-        <w:pStyle w:val="p1"/>
-        <w:rPr>
-          <w:sz w:val="24"/>
-          <w:szCs w:val="24"/>
-        </w:rPr>
-      </w:pPr>
-      <w:r>
-        <w:rPr>
-          <w:sz w:val="24"/>
-          <w:szCs w:val="24"/>
-        </w:rPr>
-        <w:t xml:space="preserve">The alternative approach </w:t>
-      </w:r>
-      <w:r>
-        <w:rPr>
-          <w:sz w:val="24"/>
-          <w:szCs w:val="24"/>
-        </w:rPr>
-        <w:t xml:space="preserve">leverages </w:t>
-      </w:r>
-      <w:r>
-        <w:rPr>
-          <w:sz w:val="24"/>
-          <w:szCs w:val="24"/>
-        </w:rPr>
-        <w:t>comparative genomics</w:t>
-      </w:r>
-      <w:r>
-        <w:rPr>
-          <w:sz w:val="24"/>
-          <w:szCs w:val="24"/>
-        </w:rPr>
-        <w:t xml:space="preserve"> and phylogenetic </w:t>
-      </w:r>
-      <w:proofErr w:type="spellStart"/>
-      <w:r>
-        <w:rPr>
-          <w:sz w:val="24"/>
-          <w:szCs w:val="24"/>
-        </w:rPr>
-        <w:t>footprinting</w:t>
-      </w:r>
-      <w:proofErr w:type="spellEnd"/>
-      <w:r>
-        <w:rPr>
-          <w:sz w:val="24"/>
-          <w:szCs w:val="24"/>
-        </w:rPr>
-        <w:t xml:space="preserve">, </w:t>
-      </w:r>
-      <w:r>
-        <w:rPr>
-          <w:sz w:val="24"/>
-          <w:szCs w:val="24"/>
-        </w:rPr>
-        <w:t xml:space="preserve">which is </w:t>
-      </w:r>
-      <w:r>
-        <w:rPr>
-          <w:sz w:val="24"/>
-          <w:szCs w:val="24"/>
-        </w:rPr>
-        <w:t xml:space="preserve">predicated on the concept that if </w:t>
-      </w:r>
-      <w:r>
-        <w:rPr>
-          <w:sz w:val="24"/>
-          <w:szCs w:val="24"/>
-        </w:rPr>
-        <w:t xml:space="preserve">a TF regulates a specific gene in one species, it </w:t>
-      </w:r>
-      <w:r>
-        <w:rPr>
-          <w:sz w:val="24"/>
-          <w:szCs w:val="24"/>
-        </w:rPr>
-        <w:t xml:space="preserve">likely </w:t>
-      </w:r>
-      <w:r>
-        <w:rPr>
-          <w:sz w:val="24"/>
-          <w:szCs w:val="24"/>
-        </w:rPr>
-        <w:t>regulates orthologs (equivalent genes) in closely related species.</w:t>
-      </w:r>
-      <w:r>
-        <w:rPr>
-          <w:sz w:val="24"/>
-          <w:szCs w:val="24"/>
-        </w:rPr>
-        <w:t xml:space="preserve"> In other words, if we assume a gene and the critical components of the motif sequence are conserved and largely similar across multiple related species, we can leverage a larger sample size to detect true motifs while weeding out random natural variations. </w:t>
-      </w:r>
-      <w:r>
-        <w:rPr>
-          <w:sz w:val="24"/>
-          <w:szCs w:val="24"/>
-        </w:rPr>
-        <w:t xml:space="preserve">Zhang </w:t>
-      </w:r>
-      <w:r>
-        <w:rPr>
-          <w:sz w:val="24"/>
-          <w:szCs w:val="24"/>
-        </w:rPr>
-        <w:lastRenderedPageBreak/>
-        <w:t xml:space="preserve">and Gerstein’s 2003 work </w:t>
-      </w:r>
-      <w:r>
-        <w:rPr>
-          <w:sz w:val="24"/>
-          <w:szCs w:val="24"/>
-        </w:rPr>
-        <w:t xml:space="preserve">identifies </w:t>
-      </w:r>
-      <w:r>
-        <w:rPr>
-          <w:sz w:val="24"/>
-          <w:szCs w:val="24"/>
-        </w:rPr>
-        <w:t xml:space="preserve">the concept </w:t>
-      </w:r>
-      <w:r>
-        <w:rPr>
-          <w:sz w:val="24"/>
-          <w:szCs w:val="24"/>
-        </w:rPr>
-        <w:t>of looking across species to find standout patterns robust to inter-species variation, thus indicating highly conserved signals for the same TFs.</w:t>
-      </w:r>
-      <w:r>
-        <w:rPr>
-          <w:rStyle w:val="FootnoteReference"/>
-          <w:sz w:val="24"/>
-          <w:szCs w:val="24"/>
-        </w:rPr>
-        <w:footnoteReference w:id="13"/>
-      </w:r>
-    </w:p>
-    <w:p>
-      <w:pPr>
-        <w:pStyle w:val="p1"/>
-        <w:rPr>
-          <w:sz w:val="24"/>
-          <w:szCs w:val="24"/>
-        </w:rPr>
-      </w:pPr>
-    </w:p>
-    <w:p>
-      <w:pPr>
-        <w:pStyle w:val="p1"/>
-        <w:rPr>
-          <w:sz w:val="24"/>
-          <w:szCs w:val="24"/>
-        </w:rPr>
-      </w:pPr>
-      <w:r>
-        <w:rPr>
-          <w:sz w:val="24"/>
-          <w:szCs w:val="24"/>
-        </w:rPr>
-        <w:t>S</w:t>
-      </w:r>
-      <w:r>
-        <w:rPr>
-          <w:sz w:val="24"/>
-          <w:szCs w:val="24"/>
-        </w:rPr>
-        <w:t xml:space="preserve">everal </w:t>
-      </w:r>
-      <w:r>
-        <w:rPr>
-          <w:sz w:val="24"/>
-          <w:szCs w:val="24"/>
-        </w:rPr>
-        <w:t xml:space="preserve">probabilistic </w:t>
-      </w:r>
-      <w:r>
-        <w:rPr>
-          <w:sz w:val="24"/>
-          <w:szCs w:val="24"/>
-        </w:rPr>
-        <w:t xml:space="preserve">algorithms </w:t>
-      </w:r>
-      <w:r>
-        <w:rPr>
-          <w:sz w:val="24"/>
-          <w:szCs w:val="24"/>
-        </w:rPr>
-        <w:t xml:space="preserve">have been </w:t>
-      </w:r>
-      <w:r>
-        <w:rPr>
-          <w:sz w:val="24"/>
-          <w:szCs w:val="24"/>
-        </w:rPr>
-        <w:t xml:space="preserve">developed </w:t>
-      </w:r>
-      <w:r>
-        <w:rPr>
-          <w:sz w:val="24"/>
-          <w:szCs w:val="24"/>
-        </w:rPr>
-        <w:t xml:space="preserve">to </w:t>
-      </w:r>
-      <w:r>
-        <w:rPr>
-          <w:sz w:val="24"/>
-          <w:szCs w:val="24"/>
-        </w:rPr>
-        <w:t xml:space="preserve">perform </w:t>
+          <w:sz w:val="20"/>
+          <w:szCs w:val="20"/>
+        </w:rPr>
+        <w:t xml:space="preserve"> The promoter region</w:t>
       </w:r>
       <w:r>
         <w:rPr>
           <w:i/>
           <w:iCs/>
-          <w:sz w:val="24"/>
-          <w:szCs w:val="24"/>
-        </w:rPr>
-        <w:t>ab initio</w:t>
-      </w:r>
-      <w:r>
-        <w:rPr>
-          <w:sz w:val="24"/>
-          <w:szCs w:val="24"/>
-        </w:rPr>
-        <w:t xml:space="preserve"> motif </w:t>
-      </w:r>
-      <w:r>
-        <w:rPr>
-          <w:sz w:val="24"/>
-          <w:szCs w:val="24"/>
-        </w:rPr>
-        <w:t xml:space="preserve">discovery </w:t>
-      </w:r>
-      <w:r>
-        <w:rPr>
-          <w:sz w:val="24"/>
-          <w:szCs w:val="24"/>
-        </w:rPr>
-        <w:t xml:space="preserve">(i.e., from scratch) </w:t>
-      </w:r>
-      <w:r>
-        <w:rPr>
-          <w:sz w:val="24"/>
-          <w:szCs w:val="24"/>
-        </w:rPr>
-        <w:t xml:space="preserve">across multiple species </w:t>
-      </w:r>
-      <w:r>
-        <w:rPr>
-          <w:sz w:val="24"/>
-          <w:szCs w:val="24"/>
-        </w:rPr>
-        <w:t xml:space="preserve">with </w:t>
-      </w:r>
-      <w:r>
-        <w:rPr>
-          <w:sz w:val="24"/>
-          <w:szCs w:val="24"/>
-        </w:rPr>
-        <w:t xml:space="preserve">sequence </w:t>
-      </w:r>
-      <w:r>
-        <w:rPr>
-          <w:sz w:val="24"/>
-          <w:szCs w:val="24"/>
-        </w:rPr>
-        <w:t>databases</w:t>
-      </w:r>
-      <w:r>
-        <w:rPr>
-          <w:sz w:val="24"/>
-          <w:szCs w:val="24"/>
-        </w:rPr>
-        <w:t>.</w:t>
-      </w:r>
-      <w:r>
-        <w:rPr>
-          <w:rStyle w:val="FootnoteReference"/>
-          <w:sz w:val="24"/>
-          <w:szCs w:val="24"/>
-        </w:rPr>
-        <w:footnoteReference w:id="14"/>
-      </w:r>
-      <w:r>
-        <w:rPr>
-          <w:sz w:val="24"/>
-          <w:szCs w:val="24"/>
-        </w:rPr>
-        <w:t xml:space="preserve"> </w:t>
-      </w:r>
-      <w:r>
-        <w:rPr>
-          <w:sz w:val="24"/>
-          <w:szCs w:val="24"/>
-        </w:rPr>
-        <w:t>M</w:t>
-      </w:r>
-      <w:r>
-        <w:rPr>
-          <w:sz w:val="24"/>
-          <w:szCs w:val="24"/>
-        </w:rPr>
-        <w:t xml:space="preserve">otif discovery </w:t>
+          <w:sz w:val="20"/>
+          <w:szCs w:val="20"/>
+        </w:rPr>
+        <w:t xml:space="preserve">, upstream of the gene in red, initiates transcription. The promoter region </w:t>
       </w:r>
       <w:r>
         <w:rPr>
           <w:i/>
           <w:iCs/>
+          <w:sz w:val="20"/>
+          <w:szCs w:val="20"/>
+        </w:rPr>
+        <w:t>typically contains multiple motifs</w:t>
+      </w:r>
+      <w:r>
+        <w:rPr>
+          <w:i/>
+          <w:iCs/>
+          <w:sz w:val="20"/>
+          <w:szCs w:val="20"/>
+        </w:rPr>
+        <w:t xml:space="preserve"> that are specific to a several regulatory proteins. </w:t>
+      </w:r>
+      <w:r>
+        <w:rPr>
+          <w:rStyle w:val="FootnoteReference"/>
+          <w:i/>
+          <w:iCs/>
+          <w:sz w:val="20"/>
+          <w:szCs w:val="20"/>
+        </w:rPr>
+        <w:footnoteReference w:id="3"/>
+      </w:r>
+    </w:p>
+    <w:p>
+      <w:pPr>
+        <w:pStyle w:val="p1"/>
+        <w:rPr>
+          <w:sz w:val="24"/>
+          <w:szCs w:val="24"/>
+        </w:rPr>
+      </w:pPr>
+    </w:p>
+    <w:p>
+      <w:pPr>
+        <w:pStyle w:val="p1"/>
+        <w:rPr>
+          <w:sz w:val="24"/>
+          <w:szCs w:val="24"/>
+        </w:rPr>
+      </w:pPr>
+      <w:r>
+        <w:rPr>
+          <w:sz w:val="24"/>
+          <w:szCs w:val="24"/>
+        </w:rPr>
+        <w:t xml:space="preserve">Therefore, understanding where TFs are active or potentially active in the genome is a crucial component of understanding how gene expression is encoded. </w:t>
+      </w:r>
+      <w:r>
+        <w:rPr>
+          <w:sz w:val="24"/>
+          <w:szCs w:val="24"/>
+        </w:rPr>
+        <w:t>T</w:t>
+      </w:r>
+      <w:r>
+        <w:rPr>
+          <w:sz w:val="24"/>
+          <w:szCs w:val="24"/>
+        </w:rPr>
+        <w:t xml:space="preserve">ranscription factor activity </w:t>
+      </w:r>
+      <w:r>
+        <w:rPr>
+          <w:sz w:val="24"/>
+          <w:szCs w:val="24"/>
+        </w:rPr>
+        <w:t xml:space="preserve">is triggered by </w:t>
+      </w:r>
+      <w:r>
+        <w:rPr>
+          <w:sz w:val="24"/>
+          <w:szCs w:val="24"/>
+        </w:rPr>
+        <w:t xml:space="preserve">a region of DNA </w:t>
+      </w:r>
+      <w:r>
+        <w:rPr>
+          <w:sz w:val="24"/>
+          <w:szCs w:val="24"/>
+        </w:rPr>
+        <w:t xml:space="preserve">physically </w:t>
+      </w:r>
+      <w:r>
+        <w:rPr>
+          <w:sz w:val="24"/>
+          <w:szCs w:val="24"/>
+        </w:rPr>
+        <w:t xml:space="preserve">adjacent </w:t>
+      </w:r>
+      <w:r>
+        <w:rPr>
+          <w:sz w:val="24"/>
+          <w:szCs w:val="24"/>
+        </w:rPr>
+        <w:t xml:space="preserve">to the </w:t>
+      </w:r>
+      <w:r>
+        <w:rPr>
+          <w:sz w:val="24"/>
+          <w:szCs w:val="24"/>
+        </w:rPr>
+        <w:t xml:space="preserve">encoding </w:t>
+      </w:r>
+      <w:r>
+        <w:rPr>
+          <w:sz w:val="24"/>
+          <w:szCs w:val="24"/>
+        </w:rPr>
+        <w:t>gene</w:t>
+      </w:r>
+      <w:r>
+        <w:rPr>
+          <w:sz w:val="24"/>
+          <w:szCs w:val="24"/>
+        </w:rPr>
+        <w:t>;</w:t>
+      </w:r>
+      <w:r>
+        <w:rPr>
+          <w:sz w:val="24"/>
+          <w:szCs w:val="24"/>
+        </w:rPr>
+        <w:t xml:space="preserve"> these regions of </w:t>
+      </w:r>
+      <w:r>
+        <w:rPr>
+          <w:sz w:val="24"/>
+          <w:szCs w:val="24"/>
+        </w:rPr>
+        <w:t>conserved DNA patterns</w:t>
+      </w:r>
+      <w:r>
+        <w:rPr>
+          <w:sz w:val="24"/>
+          <w:szCs w:val="24"/>
+        </w:rPr>
+        <w:t xml:space="preserve"> </w:t>
+      </w:r>
+      <w:r>
+        <w:rPr>
+          <w:sz w:val="24"/>
+          <w:szCs w:val="24"/>
+        </w:rPr>
+        <w:t xml:space="preserve">are </w:t>
+      </w:r>
+      <w:r>
+        <w:rPr>
+          <w:sz w:val="24"/>
+          <w:szCs w:val="24"/>
+        </w:rPr>
+        <w:t xml:space="preserve">known as </w:t>
+      </w:r>
+      <w:r>
+        <w:rPr>
+          <w:i/>
+          <w:iCs/>
+          <w:sz w:val="24"/>
+          <w:szCs w:val="24"/>
+        </w:rPr>
+        <w:t>motifs</w:t>
+      </w:r>
+      <w:r>
+        <w:rPr>
+          <w:sz w:val="24"/>
+          <w:szCs w:val="24"/>
+        </w:rPr>
+        <w:t>.</w:t>
+      </w:r>
+    </w:p>
+    <w:p>
+      <w:pPr>
+        <w:pStyle w:val="p1"/>
+        <w:rPr>
+          <w:sz w:val="24"/>
+          <w:szCs w:val="24"/>
+        </w:rPr>
+      </w:pPr>
+    </w:p>
+    <w:p>
+      <w:pPr>
+        <w:pStyle w:val="p1"/>
+        <w:rPr>
+          <w:sz w:val="24"/>
+          <w:szCs w:val="24"/>
+        </w:rPr>
+      </w:pPr>
+      <w:r>
+        <w:rPr>
+          <w:sz w:val="24"/>
+          <w:szCs w:val="24"/>
+        </w:rPr>
+        <w:t>Motif d</w:t>
+      </w:r>
+      <w:r>
+        <w:rPr>
+          <w:sz w:val="24"/>
+          <w:szCs w:val="24"/>
+        </w:rPr>
+        <w:t xml:space="preserve">iscovery is highly motivated by numerous </w:t>
+      </w:r>
+      <w:r>
+        <w:rPr>
+          <w:sz w:val="24"/>
+          <w:szCs w:val="24"/>
+        </w:rPr>
+        <w:t xml:space="preserve">practical </w:t>
+      </w:r>
+      <w:r>
+        <w:rPr>
+          <w:sz w:val="24"/>
+          <w:szCs w:val="24"/>
+        </w:rPr>
+        <w:t>applications such as diagnosing and treating chronic genetic disease</w:t>
+      </w:r>
+      <w:r>
+        <w:rPr>
+          <w:sz w:val="24"/>
+          <w:szCs w:val="24"/>
+        </w:rPr>
+        <w:t>s</w:t>
+      </w:r>
+      <w:r>
+        <w:rPr>
+          <w:sz w:val="24"/>
+          <w:szCs w:val="24"/>
+        </w:rPr>
+        <w:t>, targeted drug design, and toxicity prediction of peptides and proteins.</w:t>
+      </w:r>
+      <w:r>
+        <w:rPr>
+          <w:rStyle w:val="FootnoteReference"/>
+          <w:sz w:val="24"/>
+          <w:szCs w:val="24"/>
+        </w:rPr>
+        <w:footnoteReference w:id="4"/>
+      </w:r>
+      <w:r>
+        <w:rPr>
+          <w:sz w:val="24"/>
+          <w:szCs w:val="24"/>
+        </w:rPr>
+        <w:t xml:space="preserve"> </w:t>
+      </w:r>
+      <w:r>
+        <w:rPr>
+          <w:sz w:val="24"/>
+          <w:szCs w:val="24"/>
+        </w:rPr>
+        <w:t xml:space="preserve">On a grander scale, identifying motifs is a key component </w:t>
+      </w:r>
+      <w:r>
+        <w:rPr>
+          <w:sz w:val="24"/>
+          <w:szCs w:val="24"/>
+        </w:rPr>
+        <w:t xml:space="preserve">in </w:t>
+      </w:r>
+      <w:r>
+        <w:rPr>
+          <w:sz w:val="24"/>
+          <w:szCs w:val="24"/>
+        </w:rPr>
+        <w:t xml:space="preserve">computational modeling of transcriptional regulatory networks (TRNs), where multiple TFs and their target genes interact to modulate phenotypes and cell behaviors systematically within an organism. Bioinformatics aims to detect high-quality </w:t>
+      </w:r>
+      <w:r>
+        <w:rPr>
+          <w:sz w:val="24"/>
+          <w:szCs w:val="24"/>
+        </w:rPr>
+        <w:lastRenderedPageBreak/>
+        <w:t xml:space="preserve">motifs to enable better understanding of </w:t>
+      </w:r>
+      <w:r>
+        <w:rPr>
+          <w:sz w:val="24"/>
+          <w:szCs w:val="24"/>
+        </w:rPr>
+        <w:t xml:space="preserve">how </w:t>
+      </w:r>
+      <w:r>
+        <w:rPr>
+          <w:sz w:val="24"/>
+          <w:szCs w:val="24"/>
+        </w:rPr>
+        <w:t>TFs</w:t>
+      </w:r>
+      <w:r>
+        <w:rPr>
+          <w:sz w:val="24"/>
+          <w:szCs w:val="24"/>
+        </w:rPr>
+        <w:t xml:space="preserve"> interact across the genome and discover </w:t>
+      </w:r>
+      <w:r>
+        <w:rPr>
+          <w:sz w:val="24"/>
+          <w:szCs w:val="24"/>
+        </w:rPr>
+        <w:t>previously unknown targets, which in turn informs better models of cell states as a function of their genetic code.</w:t>
+      </w:r>
+      <w:r>
+        <w:rPr>
+          <w:rStyle w:val="FootnoteReference"/>
+          <w:sz w:val="24"/>
+          <w:szCs w:val="24"/>
+        </w:rPr>
+        <w:footnoteReference w:id="5"/>
+      </w:r>
+    </w:p>
+    <w:p>
+      <w:pPr>
+        <w:pStyle w:val="p1"/>
+        <w:rPr>
+          <w:sz w:val="24"/>
+          <w:szCs w:val="24"/>
+        </w:rPr>
+      </w:pPr>
+    </w:p>
+    <w:p>
+      <w:pPr>
+        <w:pStyle w:val="p1"/>
+        <w:rPr>
+          <w:sz w:val="24"/>
+          <w:szCs w:val="24"/>
+        </w:rPr>
+      </w:pPr>
+      <w:r>
+        <w:rPr>
+          <w:sz w:val="24"/>
+          <w:szCs w:val="24"/>
+        </w:rPr>
+        <w:t>While</w:t>
+      </w:r>
+      <w:r>
+        <w:rPr>
+          <w:sz w:val="24"/>
+          <w:szCs w:val="24"/>
+        </w:rPr>
+        <w:t xml:space="preserve"> </w:t>
+      </w:r>
+      <w:r>
+        <w:rPr>
+          <w:sz w:val="24"/>
+          <w:szCs w:val="24"/>
+        </w:rPr>
+        <w:t>motif</w:t>
+      </w:r>
+      <w:r>
+        <w:rPr>
+          <w:sz w:val="24"/>
+          <w:szCs w:val="24"/>
+        </w:rPr>
+        <w:t xml:space="preserve"> discovery </w:t>
+      </w:r>
+      <w:r>
+        <w:rPr>
+          <w:sz w:val="24"/>
+          <w:szCs w:val="24"/>
+        </w:rPr>
+        <w:t xml:space="preserve">is a </w:t>
+      </w:r>
+      <w:r>
+        <w:rPr>
+          <w:sz w:val="24"/>
+          <w:szCs w:val="24"/>
+        </w:rPr>
+        <w:t>highly motivated</w:t>
+      </w:r>
+      <w:r>
+        <w:rPr>
+          <w:sz w:val="24"/>
+          <w:szCs w:val="24"/>
+        </w:rPr>
+        <w:t xml:space="preserve"> </w:t>
+      </w:r>
+      <w:r>
+        <w:rPr>
+          <w:sz w:val="24"/>
+          <w:szCs w:val="24"/>
+        </w:rPr>
+        <w:t xml:space="preserve">investigation in </w:t>
+      </w:r>
+      <w:r>
+        <w:rPr>
+          <w:sz w:val="24"/>
+          <w:szCs w:val="24"/>
+        </w:rPr>
+        <w:t>bioinformatics</w:t>
+      </w:r>
+      <w:r>
+        <w:rPr>
+          <w:sz w:val="24"/>
+          <w:szCs w:val="24"/>
+        </w:rPr>
+        <w:t xml:space="preserve">, </w:t>
+      </w:r>
+      <w:r>
+        <w:rPr>
+          <w:sz w:val="24"/>
+          <w:szCs w:val="24"/>
+        </w:rPr>
+        <w:t xml:space="preserve">the setting is </w:t>
+      </w:r>
+      <w:r>
+        <w:rPr>
+          <w:sz w:val="24"/>
+          <w:szCs w:val="24"/>
+        </w:rPr>
+        <w:t xml:space="preserve">inherently noisy </w:t>
+      </w:r>
+      <w:r>
+        <w:rPr>
+          <w:sz w:val="24"/>
+          <w:szCs w:val="24"/>
+        </w:rPr>
+        <w:t xml:space="preserve">as </w:t>
+      </w:r>
+      <w:r>
+        <w:rPr>
+          <w:sz w:val="24"/>
+          <w:szCs w:val="24"/>
+        </w:rPr>
+        <w:t>regulatory TFs tolerate variability in the sequences comprising the motifs.</w:t>
+      </w:r>
+      <w:r>
+        <w:rPr>
+          <w:rStyle w:val="FootnoteReference"/>
+          <w:sz w:val="24"/>
+          <w:szCs w:val="24"/>
+        </w:rPr>
+        <w:footnoteReference w:id="6"/>
+      </w:r>
+      <w:r>
+        <w:rPr>
+          <w:sz w:val="24"/>
+          <w:szCs w:val="24"/>
+        </w:rPr>
+        <w:t xml:space="preserve"> </w:t>
+      </w:r>
+      <w:r>
+        <w:rPr>
+          <w:sz w:val="24"/>
+          <w:szCs w:val="24"/>
+        </w:rPr>
+        <w:t>In other words, TFs are not strictly discriminative in the specific nucleotide sequence that they bind to</w:t>
+      </w:r>
+      <w:r>
+        <w:rPr>
+          <w:sz w:val="24"/>
+          <w:szCs w:val="24"/>
+        </w:rPr>
+        <w:t xml:space="preserve">. The biological context offers inherent </w:t>
+      </w:r>
+      <w:r>
+        <w:rPr>
+          <w:sz w:val="24"/>
+          <w:szCs w:val="24"/>
+        </w:rPr>
+        <w:t xml:space="preserve">noise </w:t>
+      </w:r>
+      <w:r>
+        <w:rPr>
+          <w:sz w:val="24"/>
+          <w:szCs w:val="24"/>
+        </w:rPr>
+        <w:t>challenges.</w:t>
+      </w:r>
+      <w:r>
+        <w:rPr>
+          <w:rStyle w:val="FootnoteReference"/>
+          <w:sz w:val="24"/>
+          <w:szCs w:val="24"/>
+        </w:rPr>
+        <w:footnoteReference w:id="7"/>
+      </w:r>
+      <w:r>
+        <w:rPr>
+          <w:sz w:val="24"/>
+          <w:szCs w:val="24"/>
+        </w:rPr>
+        <w:t xml:space="preserve"> Firstly, motifs can be </w:t>
+      </w:r>
+      <w:r>
+        <w:rPr>
+          <w:i/>
+          <w:iCs/>
+          <w:sz w:val="24"/>
+          <w:szCs w:val="24"/>
+        </w:rPr>
+        <w:t>degenerate</w:t>
+      </w:r>
+      <w:r>
+        <w:rPr>
+          <w:sz w:val="24"/>
+          <w:szCs w:val="24"/>
+        </w:rPr>
+        <w:t>, where only a few nucleotides within the motif are relevant to its function.</w:t>
+      </w:r>
+      <w:r>
+        <w:rPr>
+          <w:rStyle w:val="FootnoteReference"/>
+          <w:sz w:val="24"/>
+          <w:szCs w:val="24"/>
+        </w:rPr>
+        <w:footnoteReference w:id="8"/>
+      </w:r>
+      <w:r>
+        <w:rPr>
+          <w:sz w:val="24"/>
+          <w:szCs w:val="24"/>
+        </w:rPr>
+        <w:t xml:space="preserve"> This means </w:t>
+      </w:r>
+      <w:r>
+        <w:rPr>
+          <w:sz w:val="24"/>
+          <w:szCs w:val="24"/>
+        </w:rPr>
+        <w:t>TFs</w:t>
+      </w:r>
+      <w:r>
+        <w:rPr>
+          <w:sz w:val="24"/>
+          <w:szCs w:val="24"/>
+        </w:rPr>
+        <w:t xml:space="preserve"> do not strictly discriminate for a specific, universally consistent and stable sequence of nucleotides: due to natural evolutionary mutations, TFs can still bind to sequences that look </w:t>
+      </w:r>
+      <w:r>
+        <w:rPr>
+          <w:sz w:val="24"/>
+          <w:szCs w:val="24"/>
+        </w:rPr>
+        <w:t>“close</w:t>
+      </w:r>
+      <w:r>
+        <w:rPr>
+          <w:sz w:val="24"/>
+          <w:szCs w:val="24"/>
+        </w:rPr>
+        <w:t xml:space="preserve"> enough,</w:t>
+      </w:r>
+      <w:r>
+        <w:rPr>
+          <w:sz w:val="24"/>
+          <w:szCs w:val="24"/>
+        </w:rPr>
+        <w:t>”</w:t>
+      </w:r>
+      <w:r>
+        <w:rPr>
+          <w:sz w:val="24"/>
+          <w:szCs w:val="24"/>
+        </w:rPr>
+        <w:t xml:space="preserve"> and this allowance for variation introduces an inherent baseline level of noise and uncertainty during the process of discovery. Moreover, </w:t>
+      </w:r>
+      <w:r>
+        <w:rPr>
+          <w:i/>
+          <w:iCs/>
+          <w:sz w:val="24"/>
+          <w:szCs w:val="24"/>
+        </w:rPr>
+        <w:t>de novo</w:t>
+      </w:r>
+      <w:r>
+        <w:rPr>
+          <w:sz w:val="24"/>
+          <w:szCs w:val="24"/>
+        </w:rPr>
+        <w:t xml:space="preserve"> motif discovery – the process of finding motifs without prior sequence alignment – is further stymied by the fact that a motif’s location relative to its corresponding gene is unfixed. The motif can be either upstream or downstream</w:t>
+      </w:r>
+      <w:r>
+        <w:rPr>
+          <w:sz w:val="24"/>
+          <w:szCs w:val="24"/>
+        </w:rPr>
+        <w:t xml:space="preserve"> of the gene</w:t>
+      </w:r>
+      <w:r>
+        <w:rPr>
+          <w:sz w:val="24"/>
+          <w:szCs w:val="24"/>
+        </w:rPr>
+        <w:t xml:space="preserve">, and the distance between the motif and the gene varies </w:t>
+      </w:r>
+      <w:r>
+        <w:rPr>
+          <w:sz w:val="24"/>
+          <w:szCs w:val="24"/>
+        </w:rPr>
+        <w:t>substantially</w:t>
+      </w:r>
+      <w:r>
+        <w:rPr>
+          <w:sz w:val="24"/>
+          <w:szCs w:val="24"/>
+        </w:rPr>
+        <w:t>.</w:t>
+      </w:r>
+      <w:r>
+        <w:rPr>
+          <w:rStyle w:val="FootnoteReference"/>
+          <w:sz w:val="24"/>
+          <w:szCs w:val="24"/>
+        </w:rPr>
+        <w:footnoteReference w:id="9"/>
+      </w:r>
+      <w:r>
+        <w:rPr>
+          <w:sz w:val="24"/>
+          <w:szCs w:val="24"/>
+        </w:rPr>
+        <w:t xml:space="preserve"> Therefore, motif discovery can be considered a common approximate substring (CAS) problem, which is </w:t>
+      </w:r>
+      <w:r>
+        <w:rPr>
+          <w:sz w:val="24"/>
+          <w:szCs w:val="24"/>
+        </w:rPr>
+        <w:t xml:space="preserve">characterized </w:t>
+      </w:r>
+      <w:r>
+        <w:rPr>
+          <w:sz w:val="24"/>
+          <w:szCs w:val="24"/>
+        </w:rPr>
+        <w:t>as NP-hard.</w:t>
+      </w:r>
+      <w:r>
+        <w:rPr>
+          <w:rStyle w:val="FootnoteReference"/>
+          <w:sz w:val="24"/>
+          <w:szCs w:val="24"/>
+        </w:rPr>
+        <w:footnoteReference w:id="10"/>
+      </w:r>
+      <w:r>
+        <w:rPr>
+          <w:sz w:val="24"/>
+          <w:szCs w:val="24"/>
+        </w:rPr>
+        <w:t xml:space="preserve"> </w:t>
+      </w:r>
+    </w:p>
+    <w:p>
+      <w:pPr>
+        <w:pStyle w:val="p1"/>
+        <w:rPr>
+          <w:sz w:val="24"/>
+          <w:szCs w:val="24"/>
+        </w:rPr>
+      </w:pPr>
+    </w:p>
+    <w:p>
+      <w:pPr>
+        <w:pStyle w:val="p1"/>
+        <w:rPr>
+          <w:sz w:val="24"/>
+          <w:szCs w:val="24"/>
+        </w:rPr>
+      </w:pPr>
+      <w:r>
+        <w:rPr>
+          <w:sz w:val="24"/>
+          <w:szCs w:val="24"/>
+        </w:rPr>
+        <w:t xml:space="preserve">Classical approaches to motif discovery include </w:t>
+      </w:r>
+      <w:proofErr w:type="spellStart"/>
+      <w:r>
+        <w:rPr>
+          <w:sz w:val="24"/>
+          <w:szCs w:val="24"/>
+        </w:rPr>
+        <w:t>ChIP</w:t>
+      </w:r>
+      <w:proofErr w:type="spellEnd"/>
+      <w:r>
+        <w:rPr>
+          <w:sz w:val="24"/>
+          <w:szCs w:val="24"/>
+        </w:rPr>
+        <w:t>-Seq (Chromatin Immunoprecipitation Sequencing) and RNA-Seq.</w:t>
+      </w:r>
+      <w:r>
+        <w:rPr>
+          <w:rStyle w:val="FootnoteReference"/>
+          <w:sz w:val="24"/>
+          <w:szCs w:val="24"/>
+        </w:rPr>
+        <w:footnoteReference w:id="11"/>
+      </w:r>
+      <w:r>
+        <w:rPr>
+          <w:sz w:val="24"/>
+          <w:szCs w:val="24"/>
+        </w:rPr>
+        <w:t xml:space="preserve"> In these wet-lab approaches, biologists grow </w:t>
+      </w:r>
+      <w:r>
+        <w:rPr>
+          <w:sz w:val="24"/>
+          <w:szCs w:val="24"/>
+        </w:rPr>
+        <w:t xml:space="preserve">the </w:t>
+      </w:r>
+      <w:r>
+        <w:rPr>
+          <w:sz w:val="24"/>
+          <w:szCs w:val="24"/>
+        </w:rPr>
+        <w:t xml:space="preserve">organism of interest in a petri dish. In </w:t>
+      </w:r>
+      <w:proofErr w:type="spellStart"/>
+      <w:r>
+        <w:rPr>
+          <w:sz w:val="24"/>
+          <w:szCs w:val="24"/>
+        </w:rPr>
+        <w:t>ChIP</w:t>
+      </w:r>
+      <w:proofErr w:type="spellEnd"/>
+      <w:r>
+        <w:rPr>
+          <w:sz w:val="24"/>
+          <w:szCs w:val="24"/>
+        </w:rPr>
+        <w:t xml:space="preserve">-Seq, the transcription factor </w:t>
+      </w:r>
+      <w:r>
+        <w:rPr>
+          <w:sz w:val="24"/>
+          <w:szCs w:val="24"/>
+        </w:rPr>
+        <w:t xml:space="preserve">under investigation </w:t>
+      </w:r>
+      <w:r>
+        <w:rPr>
+          <w:sz w:val="24"/>
+          <w:szCs w:val="24"/>
+        </w:rPr>
+        <w:t>is bound to the DNA, after which the specific portions of</w:t>
+      </w:r>
+      <w:r>
+        <w:rPr>
+          <w:sz w:val="24"/>
+          <w:szCs w:val="24"/>
+        </w:rPr>
+        <w:t xml:space="preserve"> DNA that attached to the TF are analyzed to report on </w:t>
+      </w:r>
+      <w:r>
+        <w:rPr>
+          <w:sz w:val="24"/>
+          <w:szCs w:val="24"/>
+        </w:rPr>
+        <w:t xml:space="preserve">which DNA patterns make up </w:t>
+      </w:r>
+      <w:r>
+        <w:rPr>
+          <w:sz w:val="24"/>
+          <w:szCs w:val="24"/>
+        </w:rPr>
+        <w:t xml:space="preserve">the motif. </w:t>
+      </w:r>
+      <w:r>
+        <w:rPr>
+          <w:sz w:val="24"/>
+          <w:szCs w:val="24"/>
+        </w:rPr>
+        <w:t xml:space="preserve">On the other hand, RNA-Seq approaches the task </w:t>
+      </w:r>
+      <w:r>
+        <w:rPr>
+          <w:sz w:val="24"/>
+          <w:szCs w:val="24"/>
+        </w:rPr>
+        <w:t xml:space="preserve">by exploiting the </w:t>
+      </w:r>
+      <w:r>
+        <w:rPr>
+          <w:sz w:val="24"/>
+          <w:szCs w:val="24"/>
+        </w:rPr>
+        <w:t>transcription stage</w:t>
+      </w:r>
+      <w:r>
+        <w:rPr>
+          <w:sz w:val="24"/>
+          <w:szCs w:val="24"/>
+        </w:rPr>
+        <w:t xml:space="preserve"> of the Central Dogma</w:t>
+      </w:r>
+      <w:r>
+        <w:rPr>
+          <w:sz w:val="24"/>
+          <w:szCs w:val="24"/>
+        </w:rPr>
+        <w:t>, comparing an experimental cell sample where the TF of interest has been deleted or overproduced.</w:t>
+      </w:r>
+      <w:r>
+        <w:rPr>
+          <w:rStyle w:val="FootnoteReference"/>
+          <w:sz w:val="24"/>
+          <w:szCs w:val="24"/>
+        </w:rPr>
+        <w:footnoteReference w:id="12"/>
+      </w:r>
+      <w:r>
+        <w:rPr>
+          <w:sz w:val="24"/>
+          <w:szCs w:val="24"/>
+        </w:rPr>
+        <w:t xml:space="preserve"> Compar</w:t>
+      </w:r>
+      <w:r>
+        <w:rPr>
+          <w:sz w:val="24"/>
+          <w:szCs w:val="24"/>
+        </w:rPr>
+        <w:t xml:space="preserve">ing </w:t>
+      </w:r>
+      <w:r>
+        <w:rPr>
+          <w:sz w:val="24"/>
+          <w:szCs w:val="24"/>
+        </w:rPr>
+        <w:t xml:space="preserve">the mRNA </w:t>
+      </w:r>
+      <w:r>
+        <w:rPr>
+          <w:sz w:val="24"/>
+          <w:szCs w:val="24"/>
+        </w:rPr>
+        <w:t xml:space="preserve">produced in </w:t>
+      </w:r>
+      <w:r>
+        <w:rPr>
+          <w:sz w:val="24"/>
+          <w:szCs w:val="24"/>
+        </w:rPr>
+        <w:t xml:space="preserve">the experimental sample to the control sample provides a snapshot of </w:t>
+      </w:r>
+      <w:r>
+        <w:rPr>
+          <w:sz w:val="24"/>
+          <w:szCs w:val="24"/>
+        </w:rPr>
+        <w:t xml:space="preserve">which genes </w:t>
+      </w:r>
+      <w:r>
+        <w:rPr>
+          <w:sz w:val="24"/>
+          <w:szCs w:val="24"/>
+        </w:rPr>
+        <w:t xml:space="preserve">were </w:t>
+      </w:r>
+      <w:r>
+        <w:rPr>
+          <w:sz w:val="24"/>
+          <w:szCs w:val="24"/>
+        </w:rPr>
+        <w:t>activated (or repressed) in response to the presence of the TF.</w:t>
+      </w:r>
+      <w:r>
+        <w:rPr>
+          <w:sz w:val="24"/>
+          <w:szCs w:val="24"/>
+        </w:rPr>
+        <w:t xml:space="preserve"> In turn, the mRNA is sequenced and mapped back to the original genome, which elucidates the specific sequence of the genome that </w:t>
+      </w:r>
+      <w:r>
+        <w:rPr>
+          <w:sz w:val="24"/>
+          <w:szCs w:val="24"/>
+        </w:rPr>
+        <w:t xml:space="preserve">was transcribed by </w:t>
+      </w:r>
+      <w:r>
+        <w:rPr>
+          <w:sz w:val="24"/>
+          <w:szCs w:val="24"/>
+        </w:rPr>
+        <w:t>the TF.</w:t>
+      </w:r>
+      <w:r>
+        <w:rPr>
+          <w:sz w:val="24"/>
+          <w:szCs w:val="24"/>
+        </w:rPr>
+        <w:t xml:space="preserve"> In other words, RNA-Seq offers a way to quantify </w:t>
+      </w:r>
+      <w:r>
+        <w:rPr>
+          <w:sz w:val="24"/>
+          <w:szCs w:val="24"/>
+        </w:rPr>
+        <w:t xml:space="preserve">the </w:t>
+      </w:r>
+      <w:r>
+        <w:rPr>
+          <w:sz w:val="24"/>
+          <w:szCs w:val="24"/>
+        </w:rPr>
+        <w:t xml:space="preserve">gene expression </w:t>
+      </w:r>
+      <w:r>
+        <w:rPr>
+          <w:sz w:val="24"/>
+          <w:szCs w:val="24"/>
+        </w:rPr>
+        <w:t xml:space="preserve">modulated by </w:t>
+      </w:r>
+      <w:r>
+        <w:rPr>
+          <w:sz w:val="24"/>
+          <w:szCs w:val="24"/>
+        </w:rPr>
+        <w:t xml:space="preserve">the TF. </w:t>
+      </w:r>
+    </w:p>
+    <w:p>
+      <w:pPr>
+        <w:pStyle w:val="p1"/>
+        <w:rPr>
+          <w:sz w:val="24"/>
+          <w:szCs w:val="24"/>
+        </w:rPr>
+      </w:pPr>
+    </w:p>
+    <w:p>
+      <w:pPr>
+        <w:pStyle w:val="p1"/>
+        <w:rPr>
+          <w:sz w:val="24"/>
+          <w:szCs w:val="24"/>
+        </w:rPr>
+      </w:pPr>
+      <w:r>
+        <w:rPr>
+          <w:sz w:val="24"/>
+          <w:szCs w:val="24"/>
+        </w:rPr>
+        <w:t xml:space="preserve">However, </w:t>
+      </w:r>
+      <w:r>
+        <w:rPr>
+          <w:sz w:val="24"/>
+          <w:szCs w:val="24"/>
+        </w:rPr>
+        <w:t xml:space="preserve">both classical </w:t>
+      </w:r>
+      <w:r>
+        <w:rPr>
+          <w:sz w:val="24"/>
+          <w:szCs w:val="24"/>
+        </w:rPr>
+        <w:t>approaches are low-throughput and costly</w:t>
+      </w:r>
+      <w:r>
+        <w:rPr>
+          <w:sz w:val="24"/>
+          <w:szCs w:val="24"/>
+        </w:rPr>
+        <w:t>. C</w:t>
+      </w:r>
+      <w:r>
+        <w:rPr>
+          <w:sz w:val="24"/>
+          <w:szCs w:val="24"/>
+        </w:rPr>
+        <w:t>rucially</w:t>
+      </w:r>
+      <w:r>
+        <w:rPr>
+          <w:sz w:val="24"/>
+          <w:szCs w:val="24"/>
+        </w:rPr>
+        <w:t>,</w:t>
+      </w:r>
+      <w:r>
+        <w:rPr>
+          <w:sz w:val="24"/>
+          <w:szCs w:val="24"/>
+        </w:rPr>
+        <w:t xml:space="preserve"> they</w:t>
+      </w:r>
+      <w:r>
+        <w:rPr>
+          <w:sz w:val="24"/>
+          <w:szCs w:val="24"/>
+        </w:rPr>
+        <w:t xml:space="preserve"> are limited as the results for each wet-lab experiment are specific to one genome only</w:t>
+      </w:r>
+      <w:r>
+        <w:rPr>
+          <w:sz w:val="24"/>
+          <w:szCs w:val="24"/>
+        </w:rPr>
+        <w:t xml:space="preserve">, </w:t>
+      </w:r>
+      <w:r>
+        <w:rPr>
+          <w:sz w:val="24"/>
+          <w:szCs w:val="24"/>
+        </w:rPr>
+        <w:lastRenderedPageBreak/>
+        <w:t xml:space="preserve">meaning that </w:t>
+      </w:r>
+      <w:r>
+        <w:rPr>
+          <w:sz w:val="24"/>
+          <w:szCs w:val="24"/>
+        </w:rPr>
+        <w:t xml:space="preserve">the task of </w:t>
+      </w:r>
+      <w:r>
+        <w:rPr>
+          <w:sz w:val="24"/>
+          <w:szCs w:val="24"/>
+        </w:rPr>
+        <w:t xml:space="preserve">distinguishing true functional motifs from random </w:t>
+      </w:r>
+      <w:r>
+        <w:rPr>
+          <w:sz w:val="24"/>
+          <w:szCs w:val="24"/>
+        </w:rPr>
+        <w:t xml:space="preserve">variations due to </w:t>
+      </w:r>
+      <w:r>
+        <w:rPr>
+          <w:sz w:val="24"/>
+          <w:szCs w:val="24"/>
+        </w:rPr>
+        <w:t xml:space="preserve">background mutations is stymied by </w:t>
+      </w:r>
+      <w:r>
+        <w:rPr>
+          <w:sz w:val="24"/>
+          <w:szCs w:val="24"/>
+        </w:rPr>
+        <w:t>poor statistical power and high false positive rates.</w:t>
+      </w:r>
+      <w:r>
+        <w:rPr>
+          <w:rStyle w:val="FootnoteReference"/>
+          <w:sz w:val="24"/>
+          <w:szCs w:val="24"/>
+        </w:rPr>
+        <w:footnoteReference w:id="13"/>
+      </w:r>
+    </w:p>
+    <w:p>
+      <w:pPr>
+        <w:pStyle w:val="p1"/>
+        <w:rPr>
+          <w:sz w:val="24"/>
+          <w:szCs w:val="24"/>
+        </w:rPr>
+      </w:pPr>
+    </w:p>
+    <w:p>
+      <w:pPr>
+        <w:pStyle w:val="p1"/>
+        <w:rPr>
+          <w:sz w:val="24"/>
+          <w:szCs w:val="24"/>
+        </w:rPr>
+      </w:pPr>
+      <w:r>
+        <w:rPr>
+          <w:sz w:val="24"/>
+          <w:szCs w:val="24"/>
+        </w:rPr>
+        <w:t xml:space="preserve">The alternative approach </w:t>
+      </w:r>
+      <w:r>
+        <w:rPr>
+          <w:sz w:val="24"/>
+          <w:szCs w:val="24"/>
+        </w:rPr>
+        <w:t xml:space="preserve">leverages </w:t>
+      </w:r>
+      <w:r>
+        <w:rPr>
+          <w:sz w:val="24"/>
+          <w:szCs w:val="24"/>
+        </w:rPr>
+        <w:t>comparative genomics</w:t>
+      </w:r>
+      <w:r>
+        <w:rPr>
+          <w:sz w:val="24"/>
+          <w:szCs w:val="24"/>
+        </w:rPr>
+        <w:t xml:space="preserve"> and phylogenetic </w:t>
+      </w:r>
+      <w:proofErr w:type="spellStart"/>
+      <w:r>
+        <w:rPr>
+          <w:sz w:val="24"/>
+          <w:szCs w:val="24"/>
+        </w:rPr>
+        <w:t>footprinting</w:t>
+      </w:r>
+      <w:proofErr w:type="spellEnd"/>
+      <w:r>
+        <w:rPr>
+          <w:sz w:val="24"/>
+          <w:szCs w:val="24"/>
+        </w:rPr>
+        <w:t xml:space="preserve">, </w:t>
+      </w:r>
+      <w:r>
+        <w:rPr>
+          <w:sz w:val="24"/>
+          <w:szCs w:val="24"/>
+        </w:rPr>
+        <w:t xml:space="preserve">which is </w:t>
+      </w:r>
+      <w:r>
+        <w:rPr>
+          <w:sz w:val="24"/>
+          <w:szCs w:val="24"/>
+        </w:rPr>
+        <w:t>predicated on the concept that if a TF regulates a specific gene in one species, it likely regulates orthologs (equivalent genes) in related species.</w:t>
+      </w:r>
+      <w:r>
+        <w:rPr>
+          <w:rStyle w:val="FootnoteReference"/>
+          <w:sz w:val="24"/>
+          <w:szCs w:val="24"/>
+        </w:rPr>
+        <w:footnoteReference w:id="14"/>
+      </w:r>
+      <w:r>
+        <w:rPr>
+          <w:sz w:val="24"/>
+          <w:szCs w:val="24"/>
+        </w:rPr>
+        <w:t xml:space="preserve"> In other words, if we assume a gene and the critical components of </w:t>
+      </w:r>
+      <w:r>
+        <w:rPr>
+          <w:sz w:val="24"/>
+          <w:szCs w:val="24"/>
+        </w:rPr>
+        <w:t>its</w:t>
+      </w:r>
+      <w:r>
+        <w:rPr>
+          <w:sz w:val="24"/>
+          <w:szCs w:val="24"/>
+        </w:rPr>
+        <w:t xml:space="preserve"> motif sequence are conserved and</w:t>
+      </w:r>
+      <w:r>
+        <w:rPr>
+          <w:sz w:val="24"/>
+          <w:szCs w:val="24"/>
+        </w:rPr>
+        <w:t xml:space="preserve"> thus</w:t>
+      </w:r>
+      <w:r>
+        <w:rPr>
+          <w:sz w:val="24"/>
+          <w:szCs w:val="24"/>
+        </w:rPr>
+        <w:t xml:space="preserve"> largely similar across </w:t>
+      </w:r>
+      <w:r>
+        <w:rPr>
+          <w:sz w:val="24"/>
+          <w:szCs w:val="24"/>
+        </w:rPr>
+        <w:t>several</w:t>
+      </w:r>
+      <w:r>
+        <w:rPr>
+          <w:sz w:val="24"/>
+          <w:szCs w:val="24"/>
+        </w:rPr>
+        <w:t xml:space="preserve"> </w:t>
+      </w:r>
+      <w:r>
+        <w:rPr>
+          <w:sz w:val="24"/>
+          <w:szCs w:val="24"/>
+        </w:rPr>
+        <w:t xml:space="preserve">evolutionarily </w:t>
+      </w:r>
+      <w:r>
+        <w:rPr>
+          <w:sz w:val="24"/>
+          <w:szCs w:val="24"/>
+        </w:rPr>
+        <w:t xml:space="preserve">related </w:t>
+      </w:r>
+      <w:r>
+        <w:rPr>
+          <w:sz w:val="24"/>
+          <w:szCs w:val="24"/>
+        </w:rPr>
+        <w:t xml:space="preserve">species, we can leverage </w:t>
+      </w:r>
+      <w:r>
+        <w:rPr>
+          <w:sz w:val="24"/>
+          <w:szCs w:val="24"/>
+        </w:rPr>
+        <w:t xml:space="preserve">the resulting </w:t>
+      </w:r>
+      <w:r>
+        <w:rPr>
+          <w:sz w:val="24"/>
+          <w:szCs w:val="24"/>
+        </w:rPr>
+        <w:t xml:space="preserve">larger sample size to detect true </w:t>
+      </w:r>
+      <w:r>
+        <w:rPr>
+          <w:sz w:val="24"/>
+          <w:szCs w:val="24"/>
+        </w:rPr>
+        <w:t xml:space="preserve">motifs </w:t>
+      </w:r>
+      <w:r>
+        <w:rPr>
+          <w:sz w:val="24"/>
+          <w:szCs w:val="24"/>
+        </w:rPr>
+        <w:t xml:space="preserve">across these species </w:t>
+      </w:r>
+      <w:r>
+        <w:rPr>
+          <w:sz w:val="24"/>
+          <w:szCs w:val="24"/>
+        </w:rPr>
+        <w:t xml:space="preserve">while </w:t>
+      </w:r>
+      <w:r>
+        <w:rPr>
+          <w:sz w:val="24"/>
+          <w:szCs w:val="24"/>
+        </w:rPr>
+        <w:t xml:space="preserve">filtering </w:t>
+      </w:r>
+      <w:r>
+        <w:rPr>
+          <w:sz w:val="24"/>
+          <w:szCs w:val="24"/>
+        </w:rPr>
+        <w:t xml:space="preserve">out </w:t>
+      </w:r>
+      <w:r>
+        <w:rPr>
+          <w:sz w:val="24"/>
+          <w:szCs w:val="24"/>
+        </w:rPr>
+        <w:t xml:space="preserve">noise from </w:t>
+      </w:r>
+      <w:r>
+        <w:rPr>
+          <w:sz w:val="24"/>
+          <w:szCs w:val="24"/>
+        </w:rPr>
+        <w:t>random natural variations</w:t>
+      </w:r>
+      <w:r>
+        <w:rPr>
+          <w:sz w:val="24"/>
+          <w:szCs w:val="24"/>
+        </w:rPr>
+        <w:t xml:space="preserve"> and mutations</w:t>
+      </w:r>
+      <w:r>
+        <w:rPr>
+          <w:sz w:val="24"/>
+          <w:szCs w:val="24"/>
+        </w:rPr>
+        <w:t xml:space="preserve">. </w:t>
+      </w:r>
+      <w:r>
+        <w:rPr>
+          <w:sz w:val="24"/>
+          <w:szCs w:val="24"/>
+        </w:rPr>
+        <w:t xml:space="preserve">Zhang and Gerstein’s 2003 </w:t>
+      </w:r>
+      <w:r>
+        <w:rPr>
+          <w:sz w:val="24"/>
+          <w:szCs w:val="24"/>
+        </w:rPr>
+        <w:t xml:space="preserve">work “Of mice and men” </w:t>
+      </w:r>
+      <w:r>
+        <w:rPr>
+          <w:sz w:val="24"/>
+          <w:szCs w:val="24"/>
+        </w:rPr>
+        <w:t xml:space="preserve">explains that because </w:t>
+      </w:r>
+      <w:r>
+        <w:rPr>
+          <w:sz w:val="24"/>
+          <w:szCs w:val="24"/>
+        </w:rPr>
+        <w:t xml:space="preserve">regulatory elements </w:t>
+      </w:r>
+      <w:r>
+        <w:rPr>
+          <w:sz w:val="24"/>
+          <w:szCs w:val="24"/>
+        </w:rPr>
+        <w:t xml:space="preserve">like motifs </w:t>
+      </w:r>
+      <w:r>
+        <w:rPr>
+          <w:sz w:val="24"/>
+          <w:szCs w:val="24"/>
+        </w:rPr>
+        <w:t>are functionally important and are under evolutionary selection, they should have evolved much more slowly than other non-coding sequences</w:t>
+      </w:r>
+      <w:r>
+        <w:rPr>
+          <w:sz w:val="24"/>
+          <w:szCs w:val="24"/>
+        </w:rPr>
+        <w:t xml:space="preserve">, meaning they are more likely to be </w:t>
+      </w:r>
+      <w:r>
+        <w:rPr>
+          <w:sz w:val="24"/>
+          <w:szCs w:val="24"/>
+        </w:rPr>
+        <w:t>highly conserved</w:t>
+      </w:r>
+      <w:r>
+        <w:rPr>
+          <w:sz w:val="24"/>
+          <w:szCs w:val="24"/>
+        </w:rPr>
+        <w:t xml:space="preserve"> over evolutionary timelines</w:t>
+      </w:r>
+      <w:r>
+        <w:rPr>
+          <w:sz w:val="24"/>
+          <w:szCs w:val="24"/>
+        </w:rPr>
+        <w:t>.</w:t>
+      </w:r>
+      <w:r>
+        <w:rPr>
+          <w:rStyle w:val="FootnoteReference"/>
+          <w:sz w:val="24"/>
+          <w:szCs w:val="24"/>
+        </w:rPr>
+        <w:footnoteReference w:id="15"/>
+      </w:r>
+    </w:p>
+    <w:p>
+      <w:pPr>
+        <w:pStyle w:val="p1"/>
+        <w:rPr>
+          <w:sz w:val="24"/>
+          <w:szCs w:val="24"/>
+        </w:rPr>
+      </w:pPr>
+    </w:p>
+    <w:p>
+      <w:pPr>
+        <w:pStyle w:val="p1"/>
+        <w:rPr>
+          <w:sz w:val="24"/>
+          <w:szCs w:val="24"/>
+        </w:rPr>
+      </w:pPr>
+      <w:r>
+        <w:rPr>
+          <w:sz w:val="24"/>
+          <w:szCs w:val="24"/>
+        </w:rPr>
+        <w:t>S</w:t>
+      </w:r>
+      <w:r>
+        <w:rPr>
+          <w:sz w:val="24"/>
+          <w:szCs w:val="24"/>
+        </w:rPr>
+        <w:t xml:space="preserve">everal </w:t>
+      </w:r>
+      <w:r>
+        <w:rPr>
+          <w:sz w:val="24"/>
+          <w:szCs w:val="24"/>
+        </w:rPr>
+        <w:t xml:space="preserve">probabilistic </w:t>
+      </w:r>
+      <w:r>
+        <w:rPr>
+          <w:sz w:val="24"/>
+          <w:szCs w:val="24"/>
+        </w:rPr>
+        <w:t xml:space="preserve">algorithms </w:t>
+      </w:r>
+      <w:r>
+        <w:rPr>
+          <w:sz w:val="24"/>
+          <w:szCs w:val="24"/>
+        </w:rPr>
+        <w:t xml:space="preserve">have been </w:t>
+      </w:r>
+      <w:r>
+        <w:rPr>
+          <w:sz w:val="24"/>
+          <w:szCs w:val="24"/>
+        </w:rPr>
+        <w:t xml:space="preserve">developed </w:t>
+      </w:r>
+      <w:r>
+        <w:rPr>
+          <w:sz w:val="24"/>
+          <w:szCs w:val="24"/>
+        </w:rPr>
+        <w:t xml:space="preserve">to </w:t>
+      </w:r>
+      <w:r>
+        <w:rPr>
+          <w:sz w:val="24"/>
+          <w:szCs w:val="24"/>
+        </w:rPr>
+        <w:t xml:space="preserve">perform </w:t>
+      </w:r>
+      <w:r>
+        <w:rPr>
+          <w:i/>
+          <w:iCs/>
+          <w:sz w:val="24"/>
+          <w:szCs w:val="24"/>
+        </w:rPr>
+        <w:t>ab initio</w:t>
+      </w:r>
+      <w:r>
+        <w:rPr>
+          <w:sz w:val="24"/>
+          <w:szCs w:val="24"/>
+        </w:rPr>
+        <w:t xml:space="preserve"> motif </w:t>
+      </w:r>
+      <w:r>
+        <w:rPr>
+          <w:sz w:val="24"/>
+          <w:szCs w:val="24"/>
+        </w:rPr>
+        <w:t xml:space="preserve">discovery </w:t>
+      </w:r>
+      <w:r>
+        <w:rPr>
+          <w:sz w:val="24"/>
+          <w:szCs w:val="24"/>
+        </w:rPr>
+        <w:t>(i.e., from scratch)</w:t>
+      </w:r>
+      <w:r>
+        <w:rPr>
+          <w:sz w:val="24"/>
+          <w:szCs w:val="24"/>
+        </w:rPr>
+        <w:t xml:space="preserve"> by applying </w:t>
+      </w:r>
+      <w:r>
+        <w:rPr>
+          <w:sz w:val="24"/>
+          <w:szCs w:val="24"/>
+        </w:rPr>
+        <w:t xml:space="preserve">comparative genomics to existing </w:t>
+      </w:r>
+      <w:r>
+        <w:rPr>
+          <w:sz w:val="24"/>
+          <w:szCs w:val="24"/>
+        </w:rPr>
+        <w:t xml:space="preserve">sequence </w:t>
+      </w:r>
+      <w:r>
+        <w:rPr>
+          <w:sz w:val="24"/>
+          <w:szCs w:val="24"/>
+        </w:rPr>
+        <w:t>databases</w:t>
+      </w:r>
+      <w:r>
+        <w:rPr>
+          <w:sz w:val="24"/>
+          <w:szCs w:val="24"/>
+        </w:rPr>
+        <w:t>.</w:t>
+      </w:r>
+      <w:r>
+        <w:rPr>
+          <w:rStyle w:val="FootnoteReference"/>
+          <w:sz w:val="24"/>
+          <w:szCs w:val="24"/>
+        </w:rPr>
+        <w:footnoteReference w:id="16"/>
+      </w:r>
+      <w:r>
+        <w:rPr>
+          <w:sz w:val="24"/>
+          <w:szCs w:val="24"/>
+        </w:rPr>
+        <w:t xml:space="preserve"> </w:t>
+      </w:r>
+      <w:r>
+        <w:rPr>
+          <w:sz w:val="24"/>
+          <w:szCs w:val="24"/>
+        </w:rPr>
+        <w:t>M</w:t>
+      </w:r>
+      <w:r>
+        <w:rPr>
+          <w:sz w:val="24"/>
+          <w:szCs w:val="24"/>
+        </w:rPr>
+        <w:t xml:space="preserve">otif discovery </w:t>
+      </w:r>
+      <w:r>
+        <w:rPr>
+          <w:i/>
+          <w:iCs/>
           <w:sz w:val="24"/>
           <w:szCs w:val="24"/>
         </w:rPr>
@@ -3201,7 +3581,7 @@
           <w:sz w:val="24"/>
           <w:szCs w:val="24"/>
         </w:rPr>
-        <w:t xml:space="preserve">true </w:t>
+        <w:t xml:space="preserve">more likely </w:t>
       </w:r>
       <w:r>
         <w:rPr>
@@ -3321,7 +3701,7 @@
           <w:sz w:val="24"/>
           <w:szCs w:val="24"/>
         </w:rPr>
-        <w:footnoteReference w:id="15"/>
+        <w:footnoteReference w:id="17"/>
       </w:r>
     </w:p>
     <w:p>
@@ -3346,14 +3726,42 @@
           <w:sz w:val="24"/>
           <w:szCs w:val="24"/>
         </w:rPr>
-        <w:t>To perform discovery, m</w:t>
-      </w:r>
-      <w:r>
-        <w:rPr>
-          <w:sz w:val="24"/>
-          <w:szCs w:val="24"/>
-        </w:rPr>
-        <w:t xml:space="preserve">otifs </w:t>
+        <w:t xml:space="preserve">To perform </w:t>
+      </w:r>
+      <w:r>
+        <w:rPr>
+          <w:sz w:val="24"/>
+          <w:szCs w:val="24"/>
+        </w:rPr>
+        <w:t xml:space="preserve">motif </w:t>
+      </w:r>
+      <w:r>
+        <w:rPr>
+          <w:sz w:val="24"/>
+          <w:szCs w:val="24"/>
+        </w:rPr>
+        <w:t xml:space="preserve">discovery, </w:t>
+      </w:r>
+      <w:r>
+        <w:rPr>
+          <w:sz w:val="24"/>
+          <w:szCs w:val="24"/>
+        </w:rPr>
+        <w:t>DNA sequence</w:t>
+      </w:r>
+      <w:r>
+        <w:rPr>
+          <w:sz w:val="24"/>
+          <w:szCs w:val="24"/>
+        </w:rPr>
+        <w:t xml:space="preserve"> segments</w:t>
+      </w:r>
+      <w:r>
+        <w:rPr>
+          <w:sz w:val="24"/>
+          <w:szCs w:val="24"/>
+        </w:rPr>
+        <w:t xml:space="preserve"> </w:t>
       </w:r>
       <w:r>
         <w:rPr>
@@ -3367,21 +3775,7 @@
           <w:sz w:val="24"/>
           <w:szCs w:val="24"/>
         </w:rPr>
-        <w:t xml:space="preserve">matrix representations of sets of </w:t>
-      </w:r>
-      <w:r>
-        <w:rPr>
-          <w:sz w:val="24"/>
-          <w:szCs w:val="24"/>
-        </w:rPr>
-        <w:t>DNA sequence</w:t>
-      </w:r>
-      <w:r>
-        <w:rPr>
-          <w:sz w:val="24"/>
-          <w:szCs w:val="24"/>
-        </w:rPr>
-        <w:t xml:space="preserve"> segments</w:t>
+        <w:t>matrix representations</w:t>
       </w:r>
       <w:r>
         <w:rPr>
@@ -3501,7 +3895,7 @@
           <w:sz w:val="24"/>
           <w:szCs w:val="24"/>
         </w:rPr>
-        <w:footnoteReference w:id="16"/>
+        <w:footnoteReference w:id="18"/>
       </w:r>
       <w:r>
         <w:rPr>
@@ -3558,7 +3952,7 @@
           <w:sz w:val="24"/>
           <w:szCs w:val="24"/>
         </w:rPr>
-        <w:footnoteReference w:id="17"/>
+        <w:footnoteReference w:id="19"/>
       </w:r>
       <w:r>
         <w:rPr>
@@ -3572,7 +3966,35 @@
           <w:sz w:val="24"/>
           <w:szCs w:val="24"/>
         </w:rPr>
-        <w:t xml:space="preserve">In essence, DNA can be considered an </w:t>
+        <w:t xml:space="preserve">In essence, </w:t>
+      </w:r>
+      <w:r>
+        <w:rPr>
+          <w:sz w:val="24"/>
+          <w:szCs w:val="24"/>
+        </w:rPr>
+        <w:t xml:space="preserve">all of these works are founded on the notion that </w:t>
+      </w:r>
+      <w:r>
+        <w:rPr>
+          <w:sz w:val="24"/>
+          <w:szCs w:val="24"/>
+        </w:rPr>
+        <w:t xml:space="preserve">DNA </w:t>
+      </w:r>
+      <w:r>
+        <w:rPr>
+          <w:sz w:val="24"/>
+          <w:szCs w:val="24"/>
+        </w:rPr>
+        <w:t xml:space="preserve">is </w:t>
+      </w:r>
+      <w:r>
+        <w:rPr>
+          <w:sz w:val="24"/>
+          <w:szCs w:val="24"/>
+        </w:rPr>
+        <w:t xml:space="preserve">considered an </w:t>
       </w:r>
       <w:r>
         <w:rPr>
@@ -3708,49 +4130,516 @@
         <w:rPr>
           <w:sz w:val="24"/>
           <w:szCs w:val="24"/>
+        </w:rPr>
+        <w:t xml:space="preserve">Several </w:t>
+      </w:r>
+      <w:r>
+        <w:rPr>
+          <w:sz w:val="24"/>
+          <w:szCs w:val="24"/>
+        </w:rPr>
+        <w:t xml:space="preserve">approaches </w:t>
+      </w:r>
+      <w:r>
+        <w:rPr>
+          <w:sz w:val="24"/>
+          <w:szCs w:val="24"/>
+        </w:rPr>
+        <w:t>exploit the information-transmission nature of DNA sequences</w:t>
+      </w:r>
+      <w:r>
+        <w:rPr>
+          <w:sz w:val="24"/>
+          <w:szCs w:val="24"/>
+        </w:rPr>
+        <w:t xml:space="preserve"> for motif discovery</w:t>
+      </w:r>
+      <w:r>
+        <w:rPr>
+          <w:sz w:val="24"/>
+          <w:szCs w:val="24"/>
+        </w:rPr>
+        <w:t>.</w:t>
+      </w:r>
+      <w:r>
+        <w:rPr>
+          <w:sz w:val="24"/>
+          <w:szCs w:val="24"/>
+        </w:rPr>
+        <w:t xml:space="preserve"> Word-based</w:t>
+      </w:r>
+      <w:r>
+        <w:rPr>
+          <w:sz w:val="24"/>
+          <w:szCs w:val="24"/>
+        </w:rPr>
+        <w:t xml:space="preserve"> </w:t>
+      </w:r>
+      <w:r>
+        <w:rPr>
+          <w:sz w:val="24"/>
+          <w:szCs w:val="24"/>
+        </w:rPr>
+        <w:t>combinatorial methods</w:t>
+      </w:r>
+      <w:r>
+        <w:rPr>
+          <w:sz w:val="24"/>
+          <w:szCs w:val="24"/>
+        </w:rPr>
+        <w:t xml:space="preserve"> (also known as “enumerative”)</w:t>
+      </w:r>
+      <w:r>
+        <w:rPr>
+          <w:sz w:val="24"/>
+          <w:szCs w:val="24"/>
+        </w:rPr>
+        <w:t xml:space="preserve">, as described in </w:t>
+      </w:r>
+      <w:r>
+        <w:rPr>
+          <w:sz w:val="24"/>
+          <w:szCs w:val="24"/>
+        </w:rPr>
+        <w:t xml:space="preserve">Pevzner and Sze’s “winnowing” algorithm, </w:t>
+      </w:r>
+      <w:r>
+        <w:rPr>
+          <w:sz w:val="24"/>
+          <w:szCs w:val="24"/>
+        </w:rPr>
+        <w:t>establish a dictionary of words</w:t>
+      </w:r>
+      <w:r>
+        <w:rPr>
+          <w:sz w:val="24"/>
+          <w:szCs w:val="24"/>
+        </w:rPr>
+        <w:t xml:space="preserve"> comprised of </w:t>
+      </w:r>
+      <w:r>
+        <w:rPr>
+          <w:sz w:val="24"/>
+          <w:szCs w:val="24"/>
+        </w:rPr>
+        <w:t xml:space="preserve">all possible DNA sequence combinations </w:t>
+      </w:r>
+      <w:r>
+        <w:rPr>
+          <w:sz w:val="24"/>
+          <w:szCs w:val="24"/>
+        </w:rPr>
+        <w:t xml:space="preserve">of length </w:t>
+      </w:r>
+      <w:r>
+        <w:rPr>
+          <w:i/>
+          <w:iCs/>
+          <w:sz w:val="24"/>
+          <w:szCs w:val="24"/>
+        </w:rPr>
+        <w:t>l</w:t>
+      </w:r>
+      <w:r>
+        <w:rPr>
+          <w:i/>
+          <w:iCs/>
+          <w:sz w:val="24"/>
+          <w:szCs w:val="24"/>
+        </w:rPr>
+        <w:t xml:space="preserve">, </w:t>
+      </w:r>
+      <w:r>
+        <w:rPr>
+          <w:sz w:val="24"/>
+          <w:szCs w:val="24"/>
+        </w:rPr>
+        <w:t xml:space="preserve">with an assumed </w:t>
+      </w:r>
+      <w:r>
+        <w:rPr>
+          <w:sz w:val="24"/>
+          <w:szCs w:val="24"/>
+        </w:rPr>
+        <w:t xml:space="preserve">allowance </w:t>
+      </w:r>
+      <w:r>
+        <w:rPr>
+          <w:sz w:val="24"/>
+          <w:szCs w:val="24"/>
+        </w:rPr>
+        <w:t xml:space="preserve">of </w:t>
+      </w:r>
+      <w:r>
+        <w:rPr>
+          <w:i/>
+          <w:iCs/>
+          <w:sz w:val="24"/>
+          <w:szCs w:val="24"/>
+        </w:rPr>
+        <w:t xml:space="preserve">d </w:t>
+      </w:r>
+      <w:r>
+        <w:rPr>
+          <w:sz w:val="24"/>
+          <w:szCs w:val="24"/>
+        </w:rPr>
+        <w:t>mismatches</w:t>
+      </w:r>
+      <w:r>
+        <w:rPr>
+          <w:sz w:val="24"/>
+          <w:szCs w:val="24"/>
+        </w:rPr>
+        <w:t xml:space="preserve"> within each word</w:t>
+      </w:r>
+      <w:r>
+        <w:rPr>
+          <w:sz w:val="24"/>
+          <w:szCs w:val="24"/>
+        </w:rPr>
+        <w:t xml:space="preserve"> (</w:t>
+      </w:r>
+      <w:proofErr w:type="spellStart"/>
+      <w:r>
+        <w:rPr>
+          <w:sz w:val="24"/>
+          <w:szCs w:val="24"/>
+        </w:rPr>
+        <w:t>e.g</w:t>
+      </w:r>
+      <w:proofErr w:type="spellEnd"/>
+      <w:r>
+        <w:rPr>
+          <w:sz w:val="24"/>
+          <w:szCs w:val="24"/>
+        </w:rPr>
+        <w:t xml:space="preserve">, </w:t>
+      </w:r>
+      <w:r>
+        <w:rPr>
+          <w:sz w:val="24"/>
+          <w:szCs w:val="24"/>
+        </w:rPr>
+        <w:t>ATGCG</w:t>
+      </w:r>
+      <w:r>
+        <w:rPr>
+          <w:b/>
+          <w:bCs/>
+          <w:sz w:val="24"/>
+          <w:szCs w:val="24"/>
+        </w:rPr>
+        <w:t>T</w:t>
+      </w:r>
+      <w:r>
+        <w:rPr>
+          <w:sz w:val="24"/>
+          <w:szCs w:val="24"/>
+        </w:rPr>
+        <w:t> and ATGCG</w:t>
+      </w:r>
+      <w:r>
+        <w:rPr>
+          <w:b/>
+          <w:bCs/>
+          <w:sz w:val="24"/>
+          <w:szCs w:val="24"/>
+        </w:rPr>
+        <w:t>A</w:t>
+      </w:r>
+      <w:r>
+        <w:rPr>
+          <w:sz w:val="24"/>
+          <w:szCs w:val="24"/>
+        </w:rPr>
+        <w:t> </w:t>
+      </w:r>
+      <w:r>
+        <w:rPr>
+          <w:sz w:val="24"/>
+          <w:szCs w:val="24"/>
+        </w:rPr>
+        <w:t xml:space="preserve">are </w:t>
+      </w:r>
+      <w:r>
+        <w:rPr>
+          <w:sz w:val="24"/>
+          <w:szCs w:val="24"/>
+        </w:rPr>
+        <w:t>the same "word" with a 1-letter mismatch</w:t>
+      </w:r>
+      <w:r>
+        <w:rPr>
+          <w:sz w:val="24"/>
+          <w:szCs w:val="24"/>
+          <w:lang w:val="es-ES"/>
+        </w:rPr>
+        <w:t>)</w:t>
+      </w:r>
+      <w:r>
+        <w:rPr>
+          <w:sz w:val="24"/>
+          <w:szCs w:val="24"/>
+        </w:rPr>
+        <w:t xml:space="preserve">. This method employs graph theory to connect </w:t>
+      </w:r>
+      <w:r>
+        <w:rPr>
+          <w:sz w:val="24"/>
+          <w:szCs w:val="24"/>
+        </w:rPr>
+        <w:lastRenderedPageBreak/>
+        <w:t>each word as nodes</w:t>
+      </w:r>
+      <w:r>
+        <w:rPr>
+          <w:sz w:val="24"/>
+          <w:szCs w:val="24"/>
+        </w:rPr>
+        <w:t xml:space="preserve">, with </w:t>
+      </w:r>
+      <w:r>
+        <w:rPr>
+          <w:sz w:val="24"/>
+          <w:szCs w:val="24"/>
+        </w:rPr>
+        <w:t xml:space="preserve">edges defined by similarity </w:t>
+      </w:r>
+      <w:r>
+        <w:rPr>
+          <w:sz w:val="24"/>
+          <w:szCs w:val="24"/>
+        </w:rPr>
+        <w:t xml:space="preserve">under </w:t>
+      </w:r>
+      <w:r>
+        <w:rPr>
+          <w:sz w:val="24"/>
+          <w:szCs w:val="24"/>
+        </w:rPr>
+        <w:t xml:space="preserve">variation </w:t>
+      </w:r>
+      <w:r>
+        <w:rPr>
+          <w:i/>
+          <w:iCs/>
+          <w:sz w:val="24"/>
+          <w:szCs w:val="24"/>
+        </w:rPr>
+        <w:t>d</w:t>
+      </w:r>
+      <w:r>
+        <w:rPr>
+          <w:sz w:val="24"/>
+          <w:szCs w:val="24"/>
+        </w:rPr>
+        <w:t>.</w:t>
+      </w:r>
+      <w:r>
+        <w:rPr>
+          <w:rStyle w:val="FootnoteReference"/>
+          <w:sz w:val="24"/>
+          <w:szCs w:val="24"/>
+        </w:rPr>
+        <w:footnoteReference w:id="20"/>
+      </w:r>
+      <w:r>
+        <w:rPr>
+          <w:sz w:val="24"/>
+          <w:szCs w:val="24"/>
+        </w:rPr>
+        <w:t xml:space="preserve"> </w:t>
+      </w:r>
+      <w:r>
+        <w:rPr>
+          <w:sz w:val="24"/>
+          <w:szCs w:val="24"/>
+        </w:rPr>
+        <w:t xml:space="preserve">Words with more edges are likelier positive signals. </w:t>
+      </w:r>
+      <w:r>
+        <w:rPr>
+          <w:sz w:val="24"/>
+          <w:szCs w:val="24"/>
+        </w:rPr>
+        <w:t xml:space="preserve">While combinatorial word-based methods are </w:t>
+      </w:r>
+      <w:r>
+        <w:rPr>
+          <w:i/>
+          <w:iCs/>
+          <w:sz w:val="24"/>
+          <w:szCs w:val="24"/>
+        </w:rPr>
+        <w:t>exact</w:t>
+      </w:r>
+      <w:r>
+        <w:rPr>
+          <w:i/>
+          <w:iCs/>
+          <w:sz w:val="24"/>
+          <w:szCs w:val="24"/>
+        </w:rPr>
+        <w:t xml:space="preserve"> </w:t>
+      </w:r>
+      <w:r>
+        <w:rPr>
+          <w:sz w:val="24"/>
+          <w:szCs w:val="24"/>
+        </w:rPr>
+        <w:t>in that they</w:t>
+      </w:r>
+      <w:r>
+        <w:rPr>
+          <w:sz w:val="24"/>
+          <w:szCs w:val="24"/>
+          <w:u w:val="single"/>
+        </w:rPr>
+        <w:t xml:space="preserve"> </w:t>
+      </w:r>
+      <w:r>
+        <w:rPr>
+          <w:sz w:val="24"/>
+          <w:szCs w:val="24"/>
+        </w:rPr>
+        <w:t xml:space="preserve">are guaranteed to find the globally optimum solution, their combinatorial nature makes them computationally expensive for longer motifs, as the quantity of </w:t>
+      </w:r>
+      <w:r>
+        <w:rPr>
+          <w:sz w:val="24"/>
+          <w:szCs w:val="24"/>
+        </w:rPr>
+        <w:t xml:space="preserve">all </w:t>
+      </w:r>
+      <w:r>
+        <w:rPr>
+          <w:sz w:val="24"/>
+          <w:szCs w:val="24"/>
+        </w:rPr>
+        <w:t>possible words in the dictionary scales exponentially.</w:t>
+      </w:r>
+      <w:r>
+        <w:rPr>
+          <w:rStyle w:val="FootnoteReference"/>
+          <w:sz w:val="24"/>
+          <w:szCs w:val="24"/>
+        </w:rPr>
+        <w:footnoteReference w:id="21"/>
+      </w:r>
+    </w:p>
+    <w:p>
+      <w:pPr>
+        <w:pStyle w:val="p1"/>
+        <w:rPr>
+          <w:sz w:val="24"/>
+          <w:szCs w:val="24"/>
+        </w:rPr>
+      </w:pPr>
+    </w:p>
+    <w:p>
+      <w:pPr>
+        <w:pStyle w:val="p1"/>
+        <w:rPr>
+          <w:sz w:val="24"/>
+          <w:szCs w:val="24"/>
+        </w:rPr>
+      </w:pPr>
+      <w:r>
+        <w:rPr>
+          <w:sz w:val="24"/>
+          <w:szCs w:val="24"/>
+        </w:rPr>
+        <w:t xml:space="preserve">Greedy algorithms seek to address the computation problem of combinatorial methods, as they are not guaranteed to find the global optimum, operating on an iterative guess </w:t>
+      </w:r>
+      <w:r>
+        <w:rPr>
+          <w:sz w:val="24"/>
+          <w:szCs w:val="24"/>
+        </w:rPr>
+        <w:t>-</w:t>
+      </w:r>
+      <w:r>
+        <w:rPr>
+          <w:sz w:val="24"/>
+          <w:szCs w:val="24"/>
+        </w:rPr>
+        <w:t>and</w:t>
+      </w:r>
+      <w:r>
+        <w:rPr>
+          <w:sz w:val="24"/>
+          <w:szCs w:val="24"/>
+        </w:rPr>
+        <w:t>-</w:t>
+      </w:r>
+      <w:r>
+        <w:rPr>
+          <w:sz w:val="24"/>
+          <w:szCs w:val="24"/>
+        </w:rPr>
+        <w:t xml:space="preserve">improve cycle that selects locally optimum solutions at each iteration. </w:t>
+      </w:r>
+      <w:r>
+        <w:rPr>
+          <w:sz w:val="24"/>
+          <w:szCs w:val="24"/>
+        </w:rPr>
+        <w:t xml:space="preserve">In </w:t>
+      </w:r>
+      <w:r>
+        <w:rPr>
+          <w:sz w:val="24"/>
+          <w:szCs w:val="24"/>
+        </w:rPr>
+        <w:t>these methods</w:t>
+      </w:r>
+      <w:r>
+        <w:rPr>
+          <w:sz w:val="24"/>
+          <w:szCs w:val="24"/>
+        </w:rPr>
+        <w:t xml:space="preserve">, given a set of aligned observed DNA sequences, the probability weight matrix (PWM) is used, which describes the frequency of each of the four nucleotides at each index. </w:t>
+      </w:r>
+      <w:r>
+        <w:rPr>
+          <w:sz w:val="24"/>
+          <w:szCs w:val="24"/>
+        </w:rPr>
+        <w:t xml:space="preserve">Hertz </w:t>
+      </w:r>
+      <w:r>
+        <w:rPr>
+          <w:sz w:val="24"/>
+          <w:szCs w:val="24"/>
           <w:highlight w:val="yellow"/>
         </w:rPr>
-        <w:t xml:space="preserve">[word-based, statistical methods, Gibbs sampling, EM, </w:t>
-      </w:r>
-      <w:hyperlink r:id="rId12" w:history="1">
-        <w:r>
-          <w:rPr>
-            <w:rStyle w:val="Hyperlink"/>
-            <w:sz w:val="24"/>
-            <w:szCs w:val="24"/>
-            <w:highlight w:val="yellow"/>
-            <w:lang w:val="es-ES"/>
-          </w:rPr>
-          <w:t>CONSENSUS</w:t>
-        </w:r>
-      </w:hyperlink>
-      <w:r>
-        <w:rPr>
+        <w:t>and Stormo’s 1999 CONSENSUS algorithm is an example of this class of greedy algorithm.</w:t>
+      </w:r>
+      <w:r>
+        <w:rPr>
+          <w:rStyle w:val="FootnoteReference"/>
           <w:sz w:val="24"/>
           <w:szCs w:val="24"/>
           <w:highlight w:val="yellow"/>
-          <w:lang w:val="es-ES"/>
-        </w:rPr>
-        <w:t xml:space="preserve"> – </w:t>
-      </w:r>
-      <w:proofErr w:type="spellStart"/>
+        </w:rPr>
+        <w:footnoteReference w:id="22"/>
+      </w:r>
       <w:r>
         <w:rPr>
           <w:sz w:val="24"/>
           <w:szCs w:val="24"/>
           <w:highlight w:val="yellow"/>
-          <w:lang w:val="es-ES"/>
-        </w:rPr>
-        <w:t>Stormo</w:t>
-      </w:r>
-      <w:proofErr w:type="spellEnd"/>
+        </w:rPr>
+        <w:t xml:space="preserve"> This algorithm </w:t>
+      </w:r>
       <w:r>
         <w:rPr>
           <w:sz w:val="24"/>
           <w:szCs w:val="24"/>
           <w:highlight w:val="yellow"/>
         </w:rPr>
-        <w:t>]</w:t>
+        <w:t>works</w:t>
       </w:r>
       <w:r>
         <w:rPr>
@@ -3782,21 +4671,334 @@
           <w:sz w:val="24"/>
           <w:szCs w:val="24"/>
         </w:rPr>
-        <w:t xml:space="preserve">Several algorithms are available to exploit the information-transmission nature of DNA sequences to discover motifs. </w:t>
-      </w:r>
-      <w:r>
-        <w:rPr>
-          <w:sz w:val="24"/>
-          <w:szCs w:val="24"/>
-        </w:rPr>
-        <w:t xml:space="preserve">Stochastic algorithms </w:t>
-      </w:r>
-      <w:r>
-        <w:rPr>
-          <w:sz w:val="24"/>
-          <w:szCs w:val="24"/>
-        </w:rPr>
-        <w:t>like MEME (</w:t>
+        <w:t xml:space="preserve">Probabilistic </w:t>
+      </w:r>
+      <w:r>
+        <w:rPr>
+          <w:sz w:val="24"/>
+          <w:szCs w:val="24"/>
+        </w:rPr>
+        <w:t xml:space="preserve">algorithms </w:t>
+      </w:r>
+      <w:r>
+        <w:rPr>
+          <w:sz w:val="24"/>
+          <w:szCs w:val="24"/>
+        </w:rPr>
+        <w:t xml:space="preserve">also </w:t>
+      </w:r>
+      <w:r>
+        <w:rPr>
+          <w:sz w:val="24"/>
+          <w:szCs w:val="24"/>
+        </w:rPr>
+        <w:t xml:space="preserve">address </w:t>
+      </w:r>
+      <w:r>
+        <w:rPr>
+          <w:sz w:val="24"/>
+          <w:szCs w:val="24"/>
+        </w:rPr>
+        <w:t xml:space="preserve">the </w:t>
+      </w:r>
+      <w:r>
+        <w:rPr>
+          <w:sz w:val="24"/>
+          <w:szCs w:val="24"/>
+        </w:rPr>
+        <w:t xml:space="preserve">combinatorial </w:t>
+      </w:r>
+      <w:r>
+        <w:rPr>
+          <w:sz w:val="24"/>
+          <w:szCs w:val="24"/>
+        </w:rPr>
+        <w:t>computation problem at the expense of being</w:t>
+      </w:r>
+      <w:r>
+        <w:rPr>
+          <w:sz w:val="24"/>
+          <w:szCs w:val="24"/>
+        </w:rPr>
+        <w:t xml:space="preserve"> greedy</w:t>
+      </w:r>
+      <w:r>
+        <w:rPr>
+          <w:sz w:val="24"/>
+          <w:szCs w:val="24"/>
+        </w:rPr>
+        <w:t xml:space="preserve">. Gibbs sampling and expectation maximization </w:t>
+      </w:r>
+      <w:r>
+        <w:rPr>
+          <w:sz w:val="24"/>
+          <w:szCs w:val="24"/>
+        </w:rPr>
+        <w:t xml:space="preserve">(EM) </w:t>
+      </w:r>
+      <w:r>
+        <w:rPr>
+          <w:sz w:val="24"/>
+          <w:szCs w:val="24"/>
+        </w:rPr>
+        <w:t xml:space="preserve">are key concepts employed by these algorithms. </w:t>
+      </w:r>
+      <w:r>
+        <w:rPr>
+          <w:sz w:val="24"/>
+          <w:szCs w:val="24"/>
+        </w:rPr>
+        <w:t xml:space="preserve">EM </w:t>
+      </w:r>
+      <w:r>
+        <w:rPr>
+          <w:sz w:val="24"/>
+          <w:szCs w:val="24"/>
+        </w:rPr>
+        <w:t xml:space="preserve">uses </w:t>
+      </w:r>
+      <w:r>
+        <w:rPr>
+          <w:sz w:val="24"/>
+          <w:szCs w:val="24"/>
+        </w:rPr>
+        <w:t>a semi-random</w:t>
+      </w:r>
+      <w:r>
+        <w:rPr>
+          <w:sz w:val="24"/>
+          <w:szCs w:val="24"/>
+        </w:rPr>
+        <w:t xml:space="preserve"> candidate</w:t>
+      </w:r>
+      <w:r>
+        <w:rPr>
+          <w:sz w:val="24"/>
+          <w:szCs w:val="24"/>
+        </w:rPr>
+        <w:t xml:space="preserve"> </w:t>
+      </w:r>
+      <w:r>
+        <w:rPr>
+          <w:sz w:val="24"/>
+          <w:szCs w:val="24"/>
+        </w:rPr>
+        <w:t xml:space="preserve">subsequence of length </w:t>
+      </w:r>
+      <w:r>
+        <w:rPr>
+          <w:i/>
+          <w:iCs/>
+          <w:sz w:val="24"/>
+          <w:szCs w:val="24"/>
+        </w:rPr>
+        <w:t xml:space="preserve">n </w:t>
+      </w:r>
+      <w:r>
+        <w:rPr>
+          <w:sz w:val="24"/>
+          <w:szCs w:val="24"/>
+        </w:rPr>
+        <w:t xml:space="preserve">and </w:t>
+      </w:r>
+      <w:r>
+        <w:rPr>
+          <w:sz w:val="24"/>
+          <w:szCs w:val="24"/>
+        </w:rPr>
+        <w:t>compute</w:t>
+      </w:r>
+      <w:r>
+        <w:rPr>
+          <w:sz w:val="24"/>
+          <w:szCs w:val="24"/>
+        </w:rPr>
+        <w:t>s</w:t>
+      </w:r>
+      <w:r>
+        <w:rPr>
+          <w:sz w:val="24"/>
+          <w:szCs w:val="24"/>
+        </w:rPr>
+        <w:t xml:space="preserve"> the probability </w:t>
+      </w:r>
+      <w:r>
+        <w:rPr>
+          <w:sz w:val="24"/>
+          <w:szCs w:val="24"/>
+        </w:rPr>
+        <w:t xml:space="preserve">that this subsequence was generated by the </w:t>
+      </w:r>
+      <w:r>
+        <w:rPr>
+          <w:sz w:val="24"/>
+          <w:szCs w:val="24"/>
+        </w:rPr>
+        <w:t>PWM, iteratively improving the seed to maximize the candidate</w:t>
+      </w:r>
+      <w:r>
+        <w:rPr>
+          <w:sz w:val="24"/>
+          <w:szCs w:val="24"/>
+        </w:rPr>
+        <w:t xml:space="preserve">’s </w:t>
+      </w:r>
+      <w:r>
+        <w:rPr>
+          <w:sz w:val="24"/>
+          <w:szCs w:val="24"/>
+        </w:rPr>
+        <w:t xml:space="preserve">conditional </w:t>
+      </w:r>
+      <w:r>
+        <w:rPr>
+          <w:sz w:val="24"/>
+          <w:szCs w:val="24"/>
+        </w:rPr>
+        <w:t>probability</w:t>
+      </w:r>
+      <w:r>
+        <w:rPr>
+          <w:sz w:val="24"/>
+          <w:szCs w:val="24"/>
+        </w:rPr>
+        <w:t xml:space="preserve"> given the observed data</w:t>
+      </w:r>
+      <w:r>
+        <w:rPr>
+          <w:sz w:val="24"/>
+          <w:szCs w:val="24"/>
+        </w:rPr>
+        <w:t>.</w:t>
+      </w:r>
+      <w:r>
+        <w:rPr>
+          <w:rStyle w:val="FootnoteReference"/>
+          <w:sz w:val="24"/>
+          <w:szCs w:val="24"/>
+        </w:rPr>
+        <w:footnoteReference w:id="23"/>
+      </w:r>
+      <w:r>
+        <w:rPr>
+          <w:sz w:val="24"/>
+          <w:szCs w:val="24"/>
+        </w:rPr>
+        <w:t xml:space="preserve"> </w:t>
+      </w:r>
+      <w:r>
+        <w:rPr>
+          <w:sz w:val="24"/>
+          <w:szCs w:val="24"/>
+        </w:rPr>
+        <w:t>Gibbs sampling is conceptually similar, though it takes a stochastic approach</w:t>
+      </w:r>
+      <w:r>
+        <w:rPr>
+          <w:sz w:val="24"/>
+          <w:szCs w:val="24"/>
+        </w:rPr>
+        <w:t xml:space="preserve">. While EM operates on a weighted </w:t>
+      </w:r>
+      <w:r>
+        <w:rPr>
+          <w:i/>
+          <w:iCs/>
+          <w:sz w:val="24"/>
+          <w:szCs w:val="24"/>
+        </w:rPr>
+        <w:t>average</w:t>
+      </w:r>
+      <w:r>
+        <w:rPr>
+          <w:sz w:val="24"/>
+          <w:szCs w:val="24"/>
+        </w:rPr>
+        <w:t xml:space="preserve"> across </w:t>
+      </w:r>
+      <w:r>
+        <w:rPr>
+          <w:i/>
+          <w:iCs/>
+          <w:sz w:val="24"/>
+          <w:szCs w:val="24"/>
+        </w:rPr>
+        <w:t>all</w:t>
+      </w:r>
+      <w:r>
+        <w:rPr>
+          <w:sz w:val="24"/>
+          <w:szCs w:val="24"/>
+        </w:rPr>
+        <w:t xml:space="preserve"> subsequences, Gibbs sampling </w:t>
+      </w:r>
+      <w:r>
+        <w:rPr>
+          <w:sz w:val="24"/>
+          <w:szCs w:val="24"/>
+        </w:rPr>
+        <w:t xml:space="preserve">allows for </w:t>
+      </w:r>
+      <w:r>
+        <w:rPr>
+          <w:sz w:val="24"/>
+          <w:szCs w:val="24"/>
+        </w:rPr>
+        <w:t>weighted</w:t>
+      </w:r>
+      <w:r>
+        <w:rPr>
+          <w:sz w:val="24"/>
+          <w:szCs w:val="24"/>
+        </w:rPr>
+        <w:t xml:space="preserve"> sampling where poor candidates can still be selected in the iterative process, thereby reducing the problem of getting stuck in a</w:t>
+      </w:r>
+      <w:r>
+        <w:rPr>
+          <w:sz w:val="24"/>
+          <w:szCs w:val="24"/>
+        </w:rPr>
+        <w:t xml:space="preserve"> </w:t>
+      </w:r>
+      <w:r>
+        <w:rPr>
+          <w:sz w:val="24"/>
+          <w:szCs w:val="24"/>
+        </w:rPr>
+        <w:t>local rather than global optimum.</w:t>
+      </w:r>
+      <w:r>
+        <w:rPr>
+          <w:rStyle w:val="FootnoteReference"/>
+          <w:sz w:val="24"/>
+          <w:szCs w:val="24"/>
+        </w:rPr>
+        <w:footnoteReference w:id="24"/>
+      </w:r>
+    </w:p>
+    <w:p>
+      <w:pPr>
+        <w:pStyle w:val="p1"/>
+        <w:rPr>
+          <w:sz w:val="24"/>
+          <w:szCs w:val="24"/>
+        </w:rPr>
+      </w:pPr>
+    </w:p>
+    <w:p>
+      <w:pPr>
+        <w:pStyle w:val="p1"/>
+        <w:rPr>
+          <w:sz w:val="24"/>
+          <w:szCs w:val="24"/>
+        </w:rPr>
+      </w:pPr>
+      <w:r>
+        <w:rPr>
+          <w:sz w:val="24"/>
+          <w:szCs w:val="24"/>
+        </w:rPr>
+        <w:t>MEME (</w:t>
       </w:r>
       <w:r>
         <w:rPr>
@@ -3817,7 +5019,21 @@
           <w:sz w:val="24"/>
           <w:szCs w:val="24"/>
         </w:rPr>
-        <w:t xml:space="preserve"> can locate</w:t>
+        <w:t xml:space="preserve"> </w:t>
+      </w:r>
+      <w:r>
+        <w:rPr>
+          <w:sz w:val="24"/>
+          <w:szCs w:val="24"/>
+        </w:rPr>
+        <w:t xml:space="preserve">is one such example of an EM algorithm, </w:t>
+      </w:r>
+      <w:r>
+        <w:rPr>
+          <w:sz w:val="24"/>
+          <w:szCs w:val="24"/>
+        </w:rPr>
+        <w:t>can locate</w:t>
       </w:r>
       <w:r>
         <w:rPr>
@@ -3881,7 +5097,7 @@
           <w:sz w:val="24"/>
           <w:szCs w:val="24"/>
         </w:rPr>
-        <w:footnoteReference w:id="18"/>
+        <w:footnoteReference w:id="25"/>
       </w:r>
       <w:r>
         <w:rPr>
@@ -3916,7 +5132,14 @@
           <w:sz w:val="24"/>
           <w:szCs w:val="24"/>
         </w:rPr>
-        <w:t xml:space="preserve">Expectation Maximization, using the </w:t>
+        <w:t>expectation mechanism</w:t>
+      </w:r>
+      <w:r>
+        <w:rPr>
+          <w:sz w:val="24"/>
+          <w:szCs w:val="24"/>
+        </w:rPr>
+        <w:t xml:space="preserve">, using the </w:t>
       </w:r>
       <w:r>
         <w:rPr>
@@ -3959,7 +5182,7 @@
           <w:sz w:val="24"/>
           <w:szCs w:val="24"/>
         </w:rPr>
-        <w:footnoteReference w:id="19"/>
+        <w:footnoteReference w:id="26"/>
       </w:r>
       <w:r>
         <w:rPr>
@@ -3994,14 +5217,7 @@
           <w:sz w:val="24"/>
           <w:szCs w:val="24"/>
         </w:rPr>
-        <w:t>specified length. Once a motif model converges, MEME evaluates its statistical significance by calculating an E-value, which represents the expected number of motifs with an equal or higher information content that one would find by pure chance in a random dataset of the same size</w:t>
-      </w:r>
-      <w:r>
-        <w:rPr>
-          <w:sz w:val="24"/>
-          <w:szCs w:val="24"/>
-        </w:rPr>
-        <w:t>.</w:t>
+        <w:t>specified length. Once a motif model converges, MEME evaluates its statistical significance by calculating an E-value, which represents the expected number of motifs with an equal or higher information content that one would find by pure chance in a random dataset of the same size.</w:t>
       </w:r>
       <w:r>
         <w:rPr>
@@ -4009,7 +5225,7 @@
           <w:sz w:val="24"/>
           <w:szCs w:val="24"/>
         </w:rPr>
-        <w:footnoteReference w:id="20"/>
+        <w:footnoteReference w:id="27"/>
       </w:r>
     </w:p>
     <w:p>
@@ -4086,21 +5302,7 @@
           <w:sz w:val="24"/>
           <w:szCs w:val="24"/>
         </w:rPr>
-        <w:t>(</w:t>
-      </w:r>
-      <w:r>
-        <w:rPr>
-          <w:sz w:val="24"/>
-          <w:szCs w:val="24"/>
-        </w:rPr>
-        <w:t>Simple, Thorough, Rapid, Enriched Motif Elicitation</w:t>
-      </w:r>
-      <w:r>
-        <w:rPr>
-          <w:sz w:val="24"/>
-          <w:szCs w:val="24"/>
-        </w:rPr>
-        <w:t xml:space="preserve">, </w:t>
+        <w:t xml:space="preserve">(Simple, Thorough, Rapid, Enriched Motif Elicitation, </w:t>
       </w:r>
       <w:r>
         <w:rPr>
@@ -4152,7 +5354,7 @@
           <w:sz w:val="24"/>
           <w:szCs w:val="24"/>
         </w:rPr>
-        <w:footnoteReference w:id="21"/>
+        <w:footnoteReference w:id="28"/>
       </w:r>
       <w:r>
         <w:rPr>
@@ -4227,7 +5429,7 @@
           <w:sz w:val="24"/>
           <w:szCs w:val="24"/>
         </w:rPr>
-        <w:footnoteReference w:id="22"/>
+        <w:footnoteReference w:id="29"/>
       </w:r>
       <w:r>
         <w:rPr>
@@ -4387,23 +5589,7 @@
           <w:sz w:val="24"/>
           <w:szCs w:val="24"/>
         </w:rPr>
-        <w:t xml:space="preserve"> </w:t>
-      </w:r>
-      <w:proofErr w:type="spellStart"/>
-      <w:r>
-        <w:rPr>
-          <w:sz w:val="24"/>
-          <w:szCs w:val="24"/>
-        </w:rPr>
-        <w:t>output’s resulti</w:t>
-      </w:r>
-      <w:proofErr w:type="spellEnd"/>
-      <w:r>
-        <w:rPr>
-          <w:sz w:val="24"/>
-          <w:szCs w:val="24"/>
-        </w:rPr>
-        <w:t xml:space="preserve">ng </w:t>
+        <w:t xml:space="preserve"> output’s resulting </w:t>
       </w:r>
       <w:r>
         <w:rPr>
@@ -4473,14 +5659,7 @@
           <w:sz w:val="24"/>
           <w:szCs w:val="24"/>
         </w:rPr>
-        <w:t xml:space="preserve"> structural genomic repeats</w:t>
-      </w:r>
-      <w:r>
-        <w:rPr>
-          <w:sz w:val="24"/>
-          <w:szCs w:val="24"/>
-        </w:rPr>
-        <w:t xml:space="preserve">. </w:t>
+        <w:t xml:space="preserve"> structural genomic repeats. </w:t>
       </w:r>
     </w:p>
     <w:p>
@@ -5022,14 +6201,7 @@
           <w:sz w:val="24"/>
           <w:szCs w:val="24"/>
         </w:rPr>
-        <w:t>as a noise filter</w:t>
-      </w:r>
-      <w:r>
-        <w:rPr>
-          <w:sz w:val="24"/>
-          <w:szCs w:val="24"/>
-        </w:rPr>
-        <w:t xml:space="preserve"> </w:t>
+        <w:t xml:space="preserve">as a noise filter </w:t>
       </w:r>
       <w:r>
         <w:rPr>
@@ -5051,7 +6223,7 @@
           <w:sz w:val="24"/>
           <w:szCs w:val="24"/>
         </w:rPr>
-        <w:footnoteReference w:id="23"/>
+        <w:footnoteReference w:id="30"/>
       </w:r>
       <w:r>
         <w:rPr>
@@ -5652,22 +6824,66 @@
     <w:p>
       <w:pPr>
         <w:pStyle w:val="FootnoteText"/>
+      </w:pPr>
+      <w:r>
+        <w:rPr>
+          <w:rStyle w:val="FootnoteReference"/>
+        </w:rPr>
+        <w:footnoteRef/>
+      </w:r>
+      <w:r>
+        <w:t xml:space="preserve"> </w:t>
+      </w:r>
+      <w:hyperlink r:id="rId2" w:history="1">
+        <w:r>
+          <w:rPr>
+            <w:rStyle w:val="Hyperlink"/>
+          </w:rPr>
+          <w:t>https://www.researchgate.net/figure/Transcription-and-translation-process-The-picture-shows-the-transcription-factors-TF_fig7_249656139</w:t>
+        </w:r>
+      </w:hyperlink>
+    </w:p>
+    <w:p>
+      <w:pPr>
+        <w:pStyle w:val="FootnoteText"/>
         <w:rPr>
           <w:lang w:val="es-ES_tradnl"/>
         </w:rPr>
       </w:pPr>
-      <w:r>
-        <w:rPr>
-          <w:rStyle w:val="FootnoteReference"/>
-        </w:rPr>
-        <w:footnoteRef/>
-      </w:r>
-      <w:r>
-        <w:t xml:space="preserve"> </w:t>
-      </w:r>
-      <w:r>
-        <w:t>https://nigms.nih.gov/image-gallery/2548</w:t>
-      </w:r>
+      <w:hyperlink r:id="rId3" w:history="1">
+        <w:r>
+          <w:rPr>
+            <w:rStyle w:val="Hyperlink"/>
+            <w:lang w:val="es-ES_tradnl"/>
+          </w:rPr>
+          <w:t>https://pmc.ncbi.nlm.nih.gov/articles/PMC8523640/</w:t>
+        </w:r>
+      </w:hyperlink>
+    </w:p>
+    <w:p>
+      <w:pPr>
+        <w:pStyle w:val="FootnoteText"/>
+        <w:rPr>
+          <w:lang w:val="es-ES_tradnl"/>
+        </w:rPr>
+      </w:pPr>
+      <w:hyperlink r:id="rId4" w:history="1">
+        <w:r>
+          <w:rPr>
+            <w:rStyle w:val="Hyperlink"/>
+            <w:lang w:val="es-ES_tradnl"/>
+          </w:rPr>
+          <w:t>https://pubmed.ncbi.nlm.nih.gov/15857245/</w:t>
+        </w:r>
+      </w:hyperlink>
+    </w:p>
+    <w:p>
+      <w:pPr>
+        <w:pStyle w:val="FootnoteText"/>
+        <w:rPr>
+          <w:lang w:val="es-ES_tradnl"/>
+        </w:rPr>
+      </w:pPr>
     </w:p>
   </w:footnote>
   <w:footnote w:id="4">
@@ -5684,7 +6900,7 @@
       <w:r>
         <w:t xml:space="preserve"> </w:t>
       </w:r>
-      <w:hyperlink r:id="rId2" w:history="1">
+      <w:hyperlink r:id="rId5" w:history="1">
         <w:r>
           <w:rPr>
             <w:rStyle w:val="Hyperlink"/>
@@ -5697,7 +6913,7 @@
       <w:pPr>
         <w:pStyle w:val="FootnoteText"/>
       </w:pPr>
-      <w:hyperlink r:id="rId3" w:history="1">
+      <w:hyperlink r:id="rId6" w:history="1">
         <w:r>
           <w:rPr>
             <w:rStyle w:val="Hyperlink"/>
@@ -5721,7 +6937,7 @@
       <w:r>
         <w:t xml:space="preserve"> </w:t>
       </w:r>
-      <w:hyperlink r:id="rId4" w:history="1">
+      <w:hyperlink r:id="rId7" w:history="1">
         <w:r>
           <w:rPr>
             <w:rStyle w:val="Hyperlink"/>
@@ -5737,7 +6953,7 @@
           <w:lang w:val="es-ES_tradnl"/>
         </w:rPr>
       </w:pPr>
-      <w:hyperlink r:id="rId5" w:history="1">
+      <w:hyperlink r:id="rId8" w:history="1">
         <w:r>
           <w:rPr>
             <w:rStyle w:val="Hyperlink"/>
@@ -5875,7 +7091,7 @@
       <w:r>
         <w:t xml:space="preserve"> </w:t>
       </w:r>
-      <w:hyperlink r:id="rId6" w:tgtFrame="_blank" w:tooltip="Persistent link using digital object identifier" w:history="1">
+      <w:hyperlink r:id="rId9" w:tgtFrame="_blank" w:tooltip="Persistent link using digital object identifier" w:history="1">
         <w:r>
           <w:rPr>
             <w:rStyle w:val="anchor-text"/>
@@ -5884,27 +7100,7 @@
             <w:sz w:val="21"/>
             <w:szCs w:val="21"/>
           </w:rPr>
-          <w:t>https://doi.org/10.1016/S03</w:t>
-        </w:r>
-        <w:r>
-          <w:rPr>
-            <w:rStyle w:val="anchor-text"/>
-            <w:rFonts w:ascii="Arial" w:hAnsi="Arial" w:cs="Arial"/>
-            <w:color w:val="0000FF"/>
-            <w:sz w:val="21"/>
-            <w:szCs w:val="21"/>
-          </w:rPr>
-          <w:t>0</w:t>
-        </w:r>
-        <w:r>
-          <w:rPr>
-            <w:rStyle w:val="anchor-text"/>
-            <w:rFonts w:ascii="Arial" w:hAnsi="Arial" w:cs="Arial"/>
-            <w:color w:val="0000FF"/>
-            <w:sz w:val="21"/>
-            <w:szCs w:val="21"/>
-          </w:rPr>
-          <w:t>4-3975(03)00320-7</w:t>
+          <w:t>https://doi.org/10.1016/S0304-3975(03)00320-7</w:t>
         </w:r>
       </w:hyperlink>
     </w:p>
@@ -5935,6 +7131,9 @@
     <w:p>
       <w:pPr>
         <w:pStyle w:val="FootnoteText"/>
+        <w:rPr>
+          <w:lang w:val="es-ES_tradnl"/>
+        </w:rPr>
       </w:pPr>
       <w:r>
         <w:rPr>
@@ -5945,7 +7144,26 @@
       <w:r>
         <w:t xml:space="preserve"> </w:t>
       </w:r>
-      <w:hyperlink r:id="rId7" w:history="1">
+      <w:r>
+        <w:t>https://pmc.ncbi.nlm.nih.gov/articles/PMC4863231/</w:t>
+      </w:r>
+    </w:p>
+  </w:footnote>
+  <w:footnote w:id="13">
+    <w:p>
+      <w:pPr>
+        <w:pStyle w:val="FootnoteText"/>
+      </w:pPr>
+      <w:r>
+        <w:rPr>
+          <w:rStyle w:val="FootnoteReference"/>
+        </w:rPr>
+        <w:footnoteRef/>
+      </w:r>
+      <w:r>
+        <w:t xml:space="preserve"> </w:t>
+      </w:r>
+      <w:hyperlink r:id="rId10" w:history="1">
         <w:r>
           <w:rPr>
             <w:rStyle w:val="Hyperlink"/>
@@ -5969,7 +7187,7 @@
       </w:r>
     </w:p>
   </w:footnote>
-  <w:footnote w:id="13">
+  <w:footnote w:id="14">
     <w:p>
       <w:pPr>
         <w:pStyle w:val="FootnoteText"/>
@@ -5987,29 +7205,7 @@
         <w:t xml:space="preserve"> </w:t>
       </w:r>
       <w:r>
-        <w:rPr>
-          <w:lang w:val="es-ES_tradnl"/>
-        </w:rPr>
-        <w:t>https://pmc.ncbi.nlm.nih.gov/articles/PMC193683</w:t>
-      </w:r>
-    </w:p>
-  </w:footnote>
-  <w:footnote w:id="14">
-    <w:p>
-      <w:pPr>
-        <w:pStyle w:val="FootnoteText"/>
-      </w:pPr>
-      <w:r>
-        <w:rPr>
-          <w:rStyle w:val="FootnoteReference"/>
-        </w:rPr>
-        <w:footnoteRef/>
-      </w:r>
-      <w:r>
-        <w:t xml:space="preserve"> </w:t>
-      </w:r>
-      <w:r>
-        <w:t>https://academic.oup.com/bioinformatics/article/37/18/2834/6184861?login=false</w:t>
+        <w:t>https://pmc.ncbi.nlm.nih.gov/articles/PMC193683/</w:t>
       </w:r>
     </w:p>
   </w:footnote>
@@ -6031,7 +7227,10 @@
         <w:t xml:space="preserve"> </w:t>
       </w:r>
       <w:r>
-        <w:t>https://journals.plos.org/plosone/article?id=10.1371/journal.pone.0073957</w:t>
+        <w:rPr>
+          <w:lang w:val="es-ES_tradnl"/>
+        </w:rPr>
+        <w:t>https://pmc.ncbi.nlm.nih.gov/articles/PMC193683</w:t>
       </w:r>
     </w:p>
   </w:footnote>
@@ -6049,7 +7248,48 @@
       <w:r>
         <w:t xml:space="preserve"> </w:t>
       </w:r>
-      <w:hyperlink r:id="rId8" w:history="1">
+      <w:r>
+        <w:t>https://academic.oup.com/bioinformatics/article/37/18/2834/6184861?login=false</w:t>
+      </w:r>
+    </w:p>
+  </w:footnote>
+  <w:footnote w:id="17">
+    <w:p>
+      <w:pPr>
+        <w:pStyle w:val="FootnoteText"/>
+        <w:rPr>
+          <w:lang w:val="es-ES_tradnl"/>
+        </w:rPr>
+      </w:pPr>
+      <w:r>
+        <w:rPr>
+          <w:rStyle w:val="FootnoteReference"/>
+        </w:rPr>
+        <w:footnoteRef/>
+      </w:r>
+      <w:r>
+        <w:t xml:space="preserve"> </w:t>
+      </w:r>
+      <w:r>
+        <w:t>https://journals.plos.org/plosone/article?id=10.1371/journal.pone.0073957</w:t>
+      </w:r>
+    </w:p>
+  </w:footnote>
+  <w:footnote w:id="18">
+    <w:p>
+      <w:pPr>
+        <w:pStyle w:val="FootnoteText"/>
+      </w:pPr>
+      <w:r>
+        <w:rPr>
+          <w:rStyle w:val="FootnoteReference"/>
+        </w:rPr>
+        <w:footnoteRef/>
+      </w:r>
+      <w:r>
+        <w:t xml:space="preserve"> </w:t>
+      </w:r>
+      <w:hyperlink r:id="rId11" w:history="1">
         <w:r>
           <w:rPr>
             <w:rStyle w:val="Hyperlink"/>
@@ -6073,7 +7313,7 @@
       </w:r>
     </w:p>
   </w:footnote>
-  <w:footnote w:id="17">
+  <w:footnote w:id="19">
     <w:p>
       <w:pPr>
         <w:pStyle w:val="FootnoteText"/>
@@ -6092,50 +7332,6 @@
       </w:r>
       <w:r>
         <w:t>https://pubmed.ncbi.nlm.nih.gov/3525846/</w:t>
-      </w:r>
-    </w:p>
-  </w:footnote>
-  <w:footnote w:id="18">
-    <w:p>
-      <w:pPr>
-        <w:pStyle w:val="FootnoteText"/>
-        <w:rPr>
-          <w:lang w:val="es-ES_tradnl"/>
-        </w:rPr>
-      </w:pPr>
-      <w:r>
-        <w:rPr>
-          <w:rStyle w:val="FootnoteReference"/>
-        </w:rPr>
-        <w:footnoteRef/>
-      </w:r>
-      <w:r>
-        <w:t xml:space="preserve"> </w:t>
-      </w:r>
-      <w:r>
-        <w:t>https://academic.oup.com/nar/article/34/suppl_2/W369/2505578</w:t>
-      </w:r>
-    </w:p>
-  </w:footnote>
-  <w:footnote w:id="19">
-    <w:p>
-      <w:pPr>
-        <w:pStyle w:val="FootnoteText"/>
-        <w:rPr>
-          <w:lang w:val="es-ES_tradnl"/>
-        </w:rPr>
-      </w:pPr>
-      <w:r>
-        <w:rPr>
-          <w:rStyle w:val="FootnoteReference"/>
-        </w:rPr>
-        <w:footnoteRef/>
-      </w:r>
-      <w:r>
-        <w:t xml:space="preserve"> </w:t>
-      </w:r>
-      <w:r>
-        <w:t>https://pubmed.ncbi.nlm.nih.gov/7584402/</w:t>
       </w:r>
     </w:p>
   </w:footnote>
@@ -6157,12 +7353,182 @@
         <w:t xml:space="preserve"> </w:t>
       </w:r>
       <w:r>
+        <w:t>https://pubmed.ncbi.nlm.nih.gov/10977088/</w:t>
+      </w:r>
+    </w:p>
+  </w:footnote>
+  <w:footnote w:id="21">
+    <w:p>
+      <w:pPr>
+        <w:pStyle w:val="FootnoteText"/>
         <w:rPr>
           <w:lang w:val="es-ES_tradnl"/>
         </w:rPr>
+      </w:pPr>
+      <w:r>
+        <w:rPr>
+          <w:rStyle w:val="FootnoteReference"/>
+        </w:rPr>
+        <w:footnoteRef/>
+      </w:r>
+      <w:r>
         <w:t xml:space="preserve"> </w:t>
       </w:r>
-      <w:hyperlink r:id="rId9" w:history="1">
+      <w:r>
+        <w:t>https://pubmed.ncbi.nlm.nih.gov/10786309/</w:t>
+      </w:r>
+    </w:p>
+  </w:footnote>
+  <w:footnote w:id="22">
+    <w:p>
+      <w:pPr>
+        <w:pStyle w:val="FootnoteText"/>
+        <w:rPr>
+          <w:lang w:val="es-ES_tradnl"/>
+        </w:rPr>
+      </w:pPr>
+      <w:r>
+        <w:rPr>
+          <w:rStyle w:val="FootnoteReference"/>
+        </w:rPr>
+        <w:footnoteRef/>
+      </w:r>
+      <w:r>
+        <w:t xml:space="preserve"> </w:t>
+      </w:r>
+      <w:r>
+        <w:t>https://pubmed.ncbi.nlm.nih.gov/10487864/</w:t>
+      </w:r>
+    </w:p>
+  </w:footnote>
+  <w:footnote w:id="23">
+    <w:p>
+      <w:pPr>
+        <w:pStyle w:val="FootnoteText"/>
+      </w:pPr>
+      <w:r>
+        <w:rPr>
+          <w:rStyle w:val="FootnoteReference"/>
+        </w:rPr>
+        <w:footnoteRef/>
+      </w:r>
+      <w:r>
+        <w:t xml:space="preserve"> </w:t>
+      </w:r>
+      <w:hyperlink r:id="rId12" w:history="1">
+        <w:r>
+          <w:rPr>
+            <w:rStyle w:val="Hyperlink"/>
+          </w:rPr>
+          <w:t>https://bio.libretexts.org/Bookshelves/Computational_Biology/Book%3A_Computational_Biology_-_Genomes_Networks_and_Evolution_(Kellis_et_al.)/17%3A_Regulatory_Motifs_Gibbs_Sampling_and_EM/17.03%3A_Expectation_maximization</w:t>
+        </w:r>
+      </w:hyperlink>
+    </w:p>
+    <w:p>
+      <w:pPr>
+        <w:pStyle w:val="FootnoteText"/>
+        <w:rPr>
+          <w:lang w:val="es-ES_tradnl"/>
+        </w:rPr>
+      </w:pPr>
+      <w:r>
+        <w:rPr>
+          <w:lang w:val="es-ES_tradnl"/>
+        </w:rPr>
+        <w:t>https://pubmed.ncbi.nlm.nih.gov/16900144/</w:t>
+      </w:r>
+    </w:p>
+  </w:footnote>
+  <w:footnote w:id="24">
+    <w:p>
+      <w:pPr>
+        <w:pStyle w:val="FootnoteText"/>
+        <w:rPr>
+          <w:lang w:val="es-ES_tradnl"/>
+        </w:rPr>
+      </w:pPr>
+      <w:r>
+        <w:rPr>
+          <w:rStyle w:val="FootnoteReference"/>
+        </w:rPr>
+        <w:footnoteRef/>
+      </w:r>
+      <w:r>
+        <w:t xml:space="preserve"> </w:t>
+      </w:r>
+      <w:r>
+        <w:t>https://pubmed.ncbi.nlm.nih.gov/16900144/</w:t>
+      </w:r>
+    </w:p>
+  </w:footnote>
+  <w:footnote w:id="25">
+    <w:p>
+      <w:pPr>
+        <w:pStyle w:val="FootnoteText"/>
+        <w:rPr>
+          <w:lang w:val="es-ES_tradnl"/>
+        </w:rPr>
+      </w:pPr>
+      <w:r>
+        <w:rPr>
+          <w:rStyle w:val="FootnoteReference"/>
+        </w:rPr>
+        <w:footnoteRef/>
+      </w:r>
+      <w:r>
+        <w:t xml:space="preserve"> </w:t>
+      </w:r>
+      <w:r>
+        <w:t>https://academic.oup.com/nar/article/34/suppl_2/W369/2505578</w:t>
+      </w:r>
+    </w:p>
+  </w:footnote>
+  <w:footnote w:id="26">
+    <w:p>
+      <w:pPr>
+        <w:pStyle w:val="FootnoteText"/>
+        <w:rPr>
+          <w:lang w:val="es-ES_tradnl"/>
+        </w:rPr>
+      </w:pPr>
+      <w:r>
+        <w:rPr>
+          <w:rStyle w:val="FootnoteReference"/>
+        </w:rPr>
+        <w:footnoteRef/>
+      </w:r>
+      <w:r>
+        <w:t xml:space="preserve"> </w:t>
+      </w:r>
+      <w:r>
+        <w:t>https://pubmed.ncbi.nlm.nih.gov/7584402/</w:t>
+      </w:r>
+    </w:p>
+  </w:footnote>
+  <w:footnote w:id="27">
+    <w:p>
+      <w:pPr>
+        <w:pStyle w:val="FootnoteText"/>
+        <w:rPr>
+          <w:lang w:val="es-ES_tradnl"/>
+        </w:rPr>
+      </w:pPr>
+      <w:r>
+        <w:rPr>
+          <w:rStyle w:val="FootnoteReference"/>
+        </w:rPr>
+        <w:footnoteRef/>
+      </w:r>
+      <w:r>
+        <w:t xml:space="preserve"> </w:t>
+      </w:r>
+      <w:r>
+        <w:rPr>
+          <w:lang w:val="es-ES_tradnl"/>
+        </w:rPr>
+        <w:t xml:space="preserve"> </w:t>
+      </w:r>
+      <w:hyperlink r:id="rId13" w:history="1">
         <w:r>
           <w:rPr>
             <w:rStyle w:val="Hyperlink"/>
@@ -6195,7 +7561,7 @@
       </w:pPr>
     </w:p>
   </w:footnote>
-  <w:footnote w:id="21">
+  <w:footnote w:id="28">
     <w:p>
       <w:pPr>
         <w:pStyle w:val="FootnoteText"/>
@@ -6209,7 +7575,7 @@
       <w:r>
         <w:t xml:space="preserve"> </w:t>
       </w:r>
-      <w:hyperlink r:id="rId10" w:history="1">
+      <w:hyperlink r:id="rId14" w:history="1">
         <w:r>
           <w:rPr>
             <w:rStyle w:val="Hyperlink"/>
@@ -6225,7 +7591,7 @@
           <w:lang w:val="es-ES_tradnl"/>
         </w:rPr>
       </w:pPr>
-      <w:hyperlink r:id="rId11" w:history="1">
+      <w:hyperlink r:id="rId15" w:history="1">
         <w:r>
           <w:rPr>
             <w:rStyle w:val="Hyperlink"/>
@@ -6236,7 +7602,7 @@
       </w:hyperlink>
     </w:p>
   </w:footnote>
-  <w:footnote w:id="22">
+  <w:footnote w:id="29">
     <w:p>
       <w:pPr>
         <w:pStyle w:val="FootnoteText"/>
@@ -6269,7 +7635,7 @@
       </w:r>
     </w:p>
   </w:footnote>
-  <w:footnote w:id="23">
+  <w:footnote w:id="30">
     <w:p>
       <w:pPr>
         <w:pStyle w:val="FootnoteText"/>

</xml_diff>